<commit_message>
thêm tính năng nhập link
</commit_message>
<xml_diff>
--- a/BaoCaoDATN_TranDoanAnh.docx
+++ b/BaoCaoDATN_TranDoanAnh.docx
@@ -1628,7 +1628,7 @@
     </w:p>
     <w:tbl>
       <w:tblPr>
-        <w:tblStyle w:val="TableGrid"/>
+        <w:tblStyle w:val="LiBang"/>
         <w:tblW w:w="9064" w:type="dxa"/>
         <w:tblLayout w:type="fixed"/>
         <w:tblLook w:val="04A0" w:firstRow="1" w:lastRow="0" w:firstColumn="1" w:lastColumn="0" w:noHBand="0" w:noVBand="1"/>
@@ -2693,7 +2693,7 @@
     </w:p>
     <w:tbl>
       <w:tblPr>
-        <w:tblStyle w:val="TableGrid"/>
+        <w:tblStyle w:val="LiBang"/>
         <w:tblW w:w="0" w:type="auto"/>
         <w:tblBorders>
           <w:top w:val="none" w:sz="0" w:space="0" w:color="auto"/>
@@ -2805,7 +2805,7 @@
     </w:p>
     <w:tbl>
       <w:tblPr>
-        <w:tblStyle w:val="TableGrid"/>
+        <w:tblStyle w:val="LiBang"/>
         <w:tblW w:w="0" w:type="auto"/>
         <w:tblBorders>
           <w:top w:val="none" w:sz="0" w:space="0" w:color="auto"/>
@@ -3608,7 +3608,7 @@
     </w:p>
     <w:tbl>
       <w:tblPr>
-        <w:tblStyle w:val="TableGrid"/>
+        <w:tblStyle w:val="LiBang"/>
         <w:tblW w:w="5000" w:type="pct"/>
         <w:tblLook w:val="04A0" w:firstRow="1" w:lastRow="0" w:firstColumn="1" w:lastColumn="0" w:noHBand="0" w:noVBand="1"/>
       </w:tblPr>
@@ -4826,7 +4826,7 @@
     </w:p>
     <w:tbl>
       <w:tblPr>
-        <w:tblStyle w:val="TableGrid"/>
+        <w:tblStyle w:val="LiBang"/>
         <w:tblW w:w="0" w:type="auto"/>
         <w:tblBorders>
           <w:top w:val="none" w:sz="0" w:space="0" w:color="auto"/>
@@ -5578,7 +5578,7 @@
     </w:p>
     <w:tbl>
       <w:tblPr>
-        <w:tblStyle w:val="TableGrid"/>
+        <w:tblStyle w:val="LiBang"/>
         <w:tblW w:w="0" w:type="auto"/>
         <w:tblLook w:val="04A0" w:firstRow="1" w:lastRow="0" w:firstColumn="1" w:lastColumn="0" w:noHBand="0" w:noVBand="1"/>
       </w:tblPr>
@@ -6833,7 +6833,7 @@
     </w:p>
     <w:tbl>
       <w:tblPr>
-        <w:tblStyle w:val="TableGrid"/>
+        <w:tblStyle w:val="LiBang"/>
         <w:tblW w:w="0" w:type="auto"/>
         <w:tblBorders>
           <w:top w:val="none" w:sz="0" w:space="0" w:color="auto"/>
@@ -7007,7 +7007,14 @@
                 <w:i/>
                 <w:szCs w:val="26"/>
               </w:rPr>
-              <w:t>Khánh Hòa, ngày 05 tháng 06 năm 2025</w:t>
+              <w:t>Khánh Hòa, ngày 05 tháng 06 năm 202</w:t>
+            </w:r>
+            <w:r>
+              <w:rPr>
+                <w:i/>
+                <w:szCs w:val="26"/>
+              </w:rPr>
+              <w:t>6</w:t>
             </w:r>
           </w:p>
         </w:tc>
@@ -7521,7 +7528,7 @@
     </w:p>
     <w:p>
       <w:pPr>
-        <w:pStyle w:val="ListParagraph"/>
+        <w:pStyle w:val="oancuaDanhsach"/>
         <w:numPr>
           <w:ilvl w:val="0"/>
           <w:numId w:val="2"/>
@@ -7546,7 +7553,7 @@
     </w:p>
     <w:tbl>
       <w:tblPr>
-        <w:tblStyle w:val="TableGrid"/>
+        <w:tblStyle w:val="LiBang"/>
         <w:tblW w:w="9152" w:type="dxa"/>
         <w:tblLook w:val="04A0" w:firstRow="1" w:lastRow="0" w:firstColumn="1" w:lastColumn="0" w:noHBand="0" w:noVBand="1"/>
       </w:tblPr>
@@ -8755,7 +8762,7 @@
     </w:p>
     <w:tbl>
       <w:tblPr>
-        <w:tblStyle w:val="TableGrid"/>
+        <w:tblStyle w:val="LiBang"/>
         <w:tblW w:w="0" w:type="auto"/>
         <w:tblBorders>
           <w:top w:val="none" w:sz="0" w:space="0" w:color="auto"/>
@@ -8926,7 +8933,14 @@
                 <w:i/>
                 <w:szCs w:val="26"/>
               </w:rPr>
-              <w:t>Khánh Hòa, ngày 05 tháng 06 năm 2025</w:t>
+              <w:t>Khánh Hòa, ngày 05 tháng 06 năm 202</w:t>
+            </w:r>
+            <w:r>
+              <w:rPr>
+                <w:i/>
+                <w:szCs w:val="26"/>
+              </w:rPr>
+              <w:t>6</w:t>
             </w:r>
           </w:p>
         </w:tc>
@@ -10083,7 +10097,250 @@
     </w:p>
     <w:p>
       <w:pPr>
-        <w:pStyle w:val="Heading1"/>
+        <w:pStyle w:val="u1"/>
+        <w:jc w:val="center"/>
+        <w:rPr>
+          <w:rFonts w:ascii="Times New Roman" w:hAnsi="Times New Roman" w:cs="Times New Roman"/>
+          <w:b/>
+          <w:bCs/>
+          <w:color w:val="auto"/>
+        </w:rPr>
+      </w:pPr>
+      <w:bookmarkStart w:id="1" w:name="_Toc168301049"/>
+      <w:bookmarkStart w:id="2" w:name="_Toc200035989"/>
+      <w:r>
+        <w:rPr>
+          <w:rFonts w:ascii="Times New Roman" w:hAnsi="Times New Roman" w:cs="Times New Roman"/>
+          <w:b/>
+          <w:bCs/>
+          <w:color w:val="auto"/>
+          <w:lang w:val="vi-VN"/>
+        </w:rPr>
+        <w:lastRenderedPageBreak/>
+        <w:t>LỜI CẢM ƠN</w:t>
+      </w:r>
+      <w:bookmarkEnd w:id="1"/>
+      <w:bookmarkEnd w:id="2"/>
+    </w:p>
+    <w:p>
+      <w:pPr>
+        <w:rPr>
+          <w:lang w:val="pt-BR"/>
+        </w:rPr>
+      </w:pPr>
+      <w:r>
+        <w:rPr>
+          <w:lang w:val="pt-BR"/>
+        </w:rPr>
+        <w:t>Với lòng biết ơn sâu sắc, tôi xin gửi lời tri ân đến tất cả những người đã đồng hành, hỗ trợ và tạo điều kiện cho tôi trong suốt quá trình thực hiện đề tài "</w:t>
+      </w:r>
+      <w:r>
+        <w:rPr>
+          <w:lang w:val="pt-BR"/>
+        </w:rPr>
+        <w:t>XÂY DỰNG ỨNG DỤNG WEB NHẬN DIỆN TIN GIẢ TIẾNG VIỆT SỬ DỤNG NỀN TẢNG FLASK VÀ MÔ HÌNH NGÔN NGỮ LỚN</w:t>
+      </w:r>
+      <w:r>
+        <w:rPr>
+          <w:lang w:val="pt-BR"/>
+        </w:rPr>
+        <w:t>".</w:t>
+      </w:r>
+    </w:p>
+    <w:p>
+      <w:pPr>
+        <w:rPr>
+          <w:lang w:val="pt-BR"/>
+        </w:rPr>
+      </w:pPr>
+      <w:r>
+        <w:rPr>
+          <w:lang w:val="pt-BR"/>
+        </w:rPr>
+        <w:t xml:space="preserve">Đầu tiên, tôi xin bày tỏ lòng biết ơn chân thành và sự kính trọng sâu sắc đến TS. </w:t>
+      </w:r>
+      <w:r>
+        <w:rPr>
+          <w:lang w:val="pt-BR"/>
+        </w:rPr>
+        <w:t>Nguyễn Đình Hưng</w:t>
+      </w:r>
+      <w:r>
+        <w:rPr>
+          <w:lang w:val="pt-BR"/>
+        </w:rPr>
+        <w:t xml:space="preserve">, người đã tận tâm hướng dẫn và định hướng cho nghiên cứu này. Những chỉ dẫn quý báu, tầm nhìn chiến lược và sự khích lệ của </w:t>
+      </w:r>
+      <w:r>
+        <w:rPr>
+          <w:lang w:val="pt-BR"/>
+        </w:rPr>
+        <w:t>thầy</w:t>
+      </w:r>
+      <w:r>
+        <w:rPr>
+          <w:lang w:val="pt-BR"/>
+        </w:rPr>
+        <w:t xml:space="preserve"> thông qua các buổi </w:t>
+      </w:r>
+      <w:r>
+        <w:rPr>
+          <w:lang w:val="pt-BR"/>
+        </w:rPr>
+        <w:t>gặp mặt</w:t>
+      </w:r>
+      <w:r>
+        <w:rPr>
+          <w:lang w:val="pt-BR"/>
+        </w:rPr>
+        <w:t xml:space="preserve"> trực t</w:t>
+      </w:r>
+      <w:r>
+        <w:rPr>
+          <w:lang w:val="pt-BR"/>
+        </w:rPr>
+        <w:t>iếp</w:t>
+      </w:r>
+      <w:r>
+        <w:rPr>
+          <w:lang w:val="pt-BR"/>
+        </w:rPr>
+        <w:t xml:space="preserve"> đã là nguồn cảm hứng và động lực to lớn giúp tôi vượt qua những thách thức trong lĩnh vực xử lý ngôn ngữ tự nhiên. Mỗi lời góp ý và mỗi câu hỏi sâu sắc của </w:t>
+      </w:r>
+      <w:r>
+        <w:rPr>
+          <w:lang w:val="pt-BR"/>
+        </w:rPr>
+        <w:t xml:space="preserve">thầy </w:t>
+      </w:r>
+      <w:r>
+        <w:rPr>
+          <w:lang w:val="pt-BR"/>
+        </w:rPr>
+        <w:t>đều giúp tôi nhìn nhận vấn đề đa chiều hơn, từng bước hoàn thiện phương pháp nghiên cứu.</w:t>
+      </w:r>
+    </w:p>
+    <w:p>
+      <w:pPr>
+        <w:rPr>
+          <w:lang w:val="pt-BR"/>
+        </w:rPr>
+      </w:pPr>
+      <w:r>
+        <w:rPr>
+          <w:lang w:val="pt-BR"/>
+        </w:rPr>
+        <w:t>Tôi xin gửi lời cảm ơn chân thành đến Trường Đại học Nha Trang và Khoa Công nghệ Thông tin đã tạo môi trường học thuật chuyên nghiệp, cung cấp nguồn tài nguyên quý giá và nền tảng kiến thức vững chắc. Những kiến thức và kỹ năng được trang bị trong suốt quá trình học tập tại trường đã trở thành hành trang vô giá, là tiền đề quan trọng giúp tôi thực hiện nghiên cứu này.</w:t>
+      </w:r>
+    </w:p>
+    <w:p>
+      <w:pPr>
+        <w:rPr>
+          <w:lang w:val="pt-BR"/>
+        </w:rPr>
+      </w:pPr>
+      <w:r>
+        <w:rPr>
+          <w:lang w:val="pt-BR"/>
+        </w:rPr>
+        <w:t xml:space="preserve">Tôi cũng xin bày tỏ lòng biết ơn đối với cộng đồng nghiên cứu xử lý ngôn ngữ tự nhiên tiếng Việt, đặc biệt là nhóm phát triển </w:t>
+      </w:r>
+      <w:r>
+        <w:rPr>
+          <w:lang w:val="pt-BR"/>
+        </w:rPr>
+        <w:t>VinAI Research</w:t>
+      </w:r>
+      <w:r>
+        <w:rPr>
+          <w:lang w:val="pt-BR"/>
+        </w:rPr>
+        <w:t>, đã xây dựng và chia sẻ mô hình ngôn ngữ tiền huấn luyện chất lượng cao</w:t>
+      </w:r>
+      <w:r>
+        <w:rPr>
+          <w:lang w:val="pt-BR"/>
+        </w:rPr>
+        <w:t xml:space="preserve"> PhoBERT</w:t>
+      </w:r>
+      <w:r>
+        <w:rPr>
+          <w:lang w:val="pt-BR"/>
+        </w:rPr>
+        <w:t>. Không có những công cụ và nguồn tài nguyên quý giá này, việc thực hiện đề tài sẽ gặp nhiều khó khăn hơn.</w:t>
+      </w:r>
+    </w:p>
+    <w:p>
+      <w:pPr>
+        <w:rPr>
+          <w:lang w:val="pt-BR"/>
+        </w:rPr>
+      </w:pPr>
+      <w:r>
+        <w:rPr>
+          <w:lang w:val="pt-BR"/>
+        </w:rPr>
+        <w:t>Thông qua đề tài này, tôi đã học được rằng mọi thành quả đều là kết quả của sự kết nối và hỗ trợ từ nhiều nguồn. Những tài liệu khoa học có giá trị, những công cụ kỹ thuật được chia sẻ rộng rãi, và cộng đồng học thuật mở đã góp phần quan trọng vào việc hoàn thiện phương pháp tiếp cận và giải quyết các vấn đề kỹ thuật phức tạp.</w:t>
+      </w:r>
+    </w:p>
+    <w:p>
+      <w:pPr>
+        <w:ind w:firstLine="284"/>
+        <w:jc w:val="center"/>
+        <w:rPr>
+          <w:b/>
+          <w:bCs/>
+          <w:szCs w:val="26"/>
+        </w:rPr>
+      </w:pPr>
+    </w:p>
+    <w:p>
+      <w:pPr>
+        <w:ind w:firstLine="284"/>
+        <w:jc w:val="center"/>
+        <w:rPr>
+          <w:b/>
+          <w:bCs/>
+          <w:szCs w:val="26"/>
+        </w:rPr>
+      </w:pPr>
+    </w:p>
+    <w:p>
+      <w:pPr>
+        <w:ind w:firstLine="284"/>
+        <w:jc w:val="center"/>
+        <w:rPr>
+          <w:b/>
+          <w:bCs/>
+          <w:szCs w:val="26"/>
+        </w:rPr>
+      </w:pPr>
+    </w:p>
+    <w:p>
+      <w:pPr>
+        <w:ind w:firstLine="284"/>
+        <w:jc w:val="center"/>
+        <w:rPr>
+          <w:b/>
+          <w:bCs/>
+          <w:szCs w:val="26"/>
+        </w:rPr>
+      </w:pPr>
+    </w:p>
+    <w:p>
+      <w:pPr>
+        <w:ind w:firstLine="284"/>
+        <w:jc w:val="center"/>
+        <w:rPr>
+          <w:b/>
+          <w:bCs/>
+          <w:szCs w:val="26"/>
+        </w:rPr>
+      </w:pPr>
+    </w:p>
+    <w:p>
+      <w:pPr>
+        <w:pStyle w:val="u1"/>
         <w:jc w:val="center"/>
         <w:rPr>
           <w:rFonts w:ascii="Times New Roman" w:hAnsi="Times New Roman" w:cs="Times New Roman"/>
@@ -10093,8 +10350,8 @@
           <w:lang w:val="pt-BR"/>
         </w:rPr>
       </w:pPr>
-      <w:bookmarkStart w:id="1" w:name="_Toc168301049"/>
-      <w:bookmarkStart w:id="2" w:name="_Toc200035989"/>
+      <w:bookmarkStart w:id="3" w:name="_Toc168301050"/>
+      <w:bookmarkStart w:id="4" w:name="_Toc200035990"/>
       <w:r>
         <w:rPr>
           <w:rFonts w:ascii="Times New Roman" w:hAnsi="Times New Roman" w:cs="Times New Roman"/>
@@ -10104,250 +10361,6 @@
           <w:lang w:val="vi-VN"/>
         </w:rPr>
         <w:lastRenderedPageBreak/>
-        <w:t>LỜI CẢM ƠN</w:t>
-      </w:r>
-      <w:bookmarkEnd w:id="1"/>
-      <w:bookmarkEnd w:id="2"/>
-    </w:p>
-    <w:p>
-      <w:pPr>
-        <w:rPr>
-          <w:lang w:val="pt-BR"/>
-        </w:rPr>
-      </w:pPr>
-      <w:r>
-        <w:rPr>
-          <w:lang w:val="pt-BR"/>
-        </w:rPr>
-        <w:t>Với lòng biết ơn sâu sắc, tôi xin gửi lời tri ân đến tất cả những người đã đồng hành, hỗ trợ và tạo điều kiện cho tôi trong suốt quá trình thực hiện đề tài "</w:t>
-      </w:r>
-      <w:r>
-        <w:rPr>
-          <w:lang w:val="pt-BR"/>
-        </w:rPr>
-        <w:t>XÂY DỰNG ỨNG DỤNG WEB NHẬN DIỆN TIN GIẢ TIẾNG VIỆT SỬ DỤNG NỀN TẢNG FLASK VÀ MÔ HÌNH NGÔN NGỮ LỚN</w:t>
-      </w:r>
-      <w:r>
-        <w:rPr>
-          <w:lang w:val="pt-BR"/>
-        </w:rPr>
-        <w:t>".</w:t>
-      </w:r>
-    </w:p>
-    <w:p>
-      <w:pPr>
-        <w:rPr>
-          <w:lang w:val="pt-BR"/>
-        </w:rPr>
-      </w:pPr>
-      <w:r>
-        <w:rPr>
-          <w:lang w:val="pt-BR"/>
-        </w:rPr>
-        <w:t xml:space="preserve">Đầu tiên, tôi xin bày tỏ lòng biết ơn chân thành và sự kính trọng sâu sắc đến TS. </w:t>
-      </w:r>
-      <w:r>
-        <w:rPr>
-          <w:lang w:val="pt-BR"/>
-        </w:rPr>
-        <w:t>Nguyễn Đình Hưng</w:t>
-      </w:r>
-      <w:r>
-        <w:rPr>
-          <w:lang w:val="pt-BR"/>
-        </w:rPr>
-        <w:t xml:space="preserve">, người đã tận tâm hướng dẫn và định hướng cho nghiên cứu này. Những chỉ dẫn quý báu, tầm nhìn chiến lược và sự khích lệ của </w:t>
-      </w:r>
-      <w:r>
-        <w:rPr>
-          <w:lang w:val="pt-BR"/>
-        </w:rPr>
-        <w:t>thầy</w:t>
-      </w:r>
-      <w:r>
-        <w:rPr>
-          <w:lang w:val="pt-BR"/>
-        </w:rPr>
-        <w:t xml:space="preserve"> thông qua các buổi </w:t>
-      </w:r>
-      <w:r>
-        <w:rPr>
-          <w:lang w:val="pt-BR"/>
-        </w:rPr>
-        <w:t>gặp mặt</w:t>
-      </w:r>
-      <w:r>
-        <w:rPr>
-          <w:lang w:val="pt-BR"/>
-        </w:rPr>
-        <w:t xml:space="preserve"> trực t</w:t>
-      </w:r>
-      <w:r>
-        <w:rPr>
-          <w:lang w:val="pt-BR"/>
-        </w:rPr>
-        <w:t>iếp</w:t>
-      </w:r>
-      <w:r>
-        <w:rPr>
-          <w:lang w:val="pt-BR"/>
-        </w:rPr>
-        <w:t xml:space="preserve"> đã là nguồn cảm hứng và động lực to lớn giúp tôi vượt qua những thách thức trong lĩnh vực xử lý ngôn ngữ tự nhiên. Mỗi lời góp ý và mỗi câu hỏi sâu sắc của </w:t>
-      </w:r>
-      <w:r>
-        <w:rPr>
-          <w:lang w:val="pt-BR"/>
-        </w:rPr>
-        <w:t xml:space="preserve">thầy </w:t>
-      </w:r>
-      <w:r>
-        <w:rPr>
-          <w:lang w:val="pt-BR"/>
-        </w:rPr>
-        <w:t>đều giúp tôi nhìn nhận vấn đề đa chiều hơn, từng bước hoàn thiện phương pháp nghiên cứu.</w:t>
-      </w:r>
-    </w:p>
-    <w:p>
-      <w:pPr>
-        <w:rPr>
-          <w:lang w:val="pt-BR"/>
-        </w:rPr>
-      </w:pPr>
-      <w:r>
-        <w:rPr>
-          <w:lang w:val="pt-BR"/>
-        </w:rPr>
-        <w:t>Tôi xin gửi lời cảm ơn chân thành đến Trường Đại học Nha Trang và Khoa Công nghệ Thông tin đã tạo môi trường học thuật chuyên nghiệp, cung cấp nguồn tài nguyên quý giá và nền tảng kiến thức vững chắc. Những kiến thức và kỹ năng được trang bị trong suốt quá trình học tập tại trường đã trở thành hành trang vô giá, là tiền đề quan trọng giúp tôi thực hiện nghiên cứu này.</w:t>
-      </w:r>
-    </w:p>
-    <w:p>
-      <w:pPr>
-        <w:rPr>
-          <w:lang w:val="pt-BR"/>
-        </w:rPr>
-      </w:pPr>
-      <w:r>
-        <w:rPr>
-          <w:lang w:val="pt-BR"/>
-        </w:rPr>
-        <w:t xml:space="preserve">Tôi cũng xin bày tỏ lòng biết ơn đối với cộng đồng nghiên cứu xử lý ngôn ngữ tự nhiên tiếng Việt, đặc biệt là nhóm phát triển </w:t>
-      </w:r>
-      <w:r>
-        <w:rPr>
-          <w:lang w:val="pt-BR"/>
-        </w:rPr>
-        <w:t>VinAI Research</w:t>
-      </w:r>
-      <w:r>
-        <w:rPr>
-          <w:lang w:val="pt-BR"/>
-        </w:rPr>
-        <w:t>, đã xây dựng và chia sẻ mô hình ngôn ngữ tiền huấn luyện chất lượng cao</w:t>
-      </w:r>
-      <w:r>
-        <w:rPr>
-          <w:lang w:val="pt-BR"/>
-        </w:rPr>
-        <w:t xml:space="preserve"> PhoBERT</w:t>
-      </w:r>
-      <w:r>
-        <w:rPr>
-          <w:lang w:val="pt-BR"/>
-        </w:rPr>
-        <w:t>. Không có những công cụ và nguồn tài nguyên quý giá này, việc thực hiện đề tài sẽ gặp nhiều khó khăn hơn.</w:t>
-      </w:r>
-    </w:p>
-    <w:p>
-      <w:pPr>
-        <w:rPr>
-          <w:lang w:val="pt-BR"/>
-        </w:rPr>
-      </w:pPr>
-      <w:r>
-        <w:rPr>
-          <w:lang w:val="pt-BR"/>
-        </w:rPr>
-        <w:t>Thông qua đề tài này, tôi đã học được rằng mọi thành quả đều là kết quả của sự kết nối và hỗ trợ từ nhiều nguồn. Những tài liệu khoa học có giá trị, những công cụ kỹ thuật được chia sẻ rộng rãi, và cộng đồng học thuật mở đã góp phần quan trọng vào việc hoàn thiện phương pháp tiếp cận và giải quyết các vấn đề kỹ thuật phức tạp.</w:t>
-      </w:r>
-    </w:p>
-    <w:p>
-      <w:pPr>
-        <w:ind w:firstLine="284"/>
-        <w:jc w:val="center"/>
-        <w:rPr>
-          <w:b/>
-          <w:bCs/>
-          <w:szCs w:val="26"/>
-        </w:rPr>
-      </w:pPr>
-    </w:p>
-    <w:p>
-      <w:pPr>
-        <w:ind w:firstLine="284"/>
-        <w:jc w:val="center"/>
-        <w:rPr>
-          <w:b/>
-          <w:bCs/>
-          <w:szCs w:val="26"/>
-        </w:rPr>
-      </w:pPr>
-    </w:p>
-    <w:p>
-      <w:pPr>
-        <w:ind w:firstLine="284"/>
-        <w:jc w:val="center"/>
-        <w:rPr>
-          <w:b/>
-          <w:bCs/>
-          <w:szCs w:val="26"/>
-        </w:rPr>
-      </w:pPr>
-    </w:p>
-    <w:p>
-      <w:pPr>
-        <w:ind w:firstLine="284"/>
-        <w:jc w:val="center"/>
-        <w:rPr>
-          <w:b/>
-          <w:bCs/>
-          <w:szCs w:val="26"/>
-        </w:rPr>
-      </w:pPr>
-    </w:p>
-    <w:p>
-      <w:pPr>
-        <w:ind w:firstLine="284"/>
-        <w:jc w:val="center"/>
-        <w:rPr>
-          <w:b/>
-          <w:bCs/>
-          <w:szCs w:val="26"/>
-        </w:rPr>
-      </w:pPr>
-    </w:p>
-    <w:p>
-      <w:pPr>
-        <w:pStyle w:val="Heading1"/>
-        <w:jc w:val="center"/>
-        <w:rPr>
-          <w:rFonts w:ascii="Times New Roman" w:hAnsi="Times New Roman" w:cs="Times New Roman"/>
-          <w:b/>
-          <w:bCs/>
-          <w:color w:val="auto"/>
-          <w:lang w:val="pt-BR"/>
-        </w:rPr>
-      </w:pPr>
-      <w:bookmarkStart w:id="3" w:name="_Toc168301050"/>
-      <w:bookmarkStart w:id="4" w:name="_Toc200035990"/>
-      <w:r>
-        <w:rPr>
-          <w:rFonts w:ascii="Times New Roman" w:hAnsi="Times New Roman" w:cs="Times New Roman"/>
-          <w:b/>
-          <w:bCs/>
-          <w:color w:val="auto"/>
-          <w:lang w:val="vi-VN"/>
-        </w:rPr>
-        <w:lastRenderedPageBreak/>
         <w:t>LỜI CAM ĐOAN</w:t>
       </w:r>
       <w:bookmarkEnd w:id="3"/>
@@ -10444,7 +10457,7 @@
     </w:p>
     <w:tbl>
       <w:tblPr>
-        <w:tblStyle w:val="TableGrid"/>
+        <w:tblStyle w:val="LiBang"/>
         <w:tblW w:w="4773" w:type="dxa"/>
         <w:tblInd w:w="4248" w:type="dxa"/>
         <w:tblBorders>
@@ -10644,7 +10657,7 @@
     </w:p>
     <w:p>
       <w:pPr>
-        <w:pStyle w:val="TOCHeading"/>
+        <w:pStyle w:val="uMucluc"/>
         <w:jc w:val="center"/>
         <w:rPr>
           <w:rFonts w:ascii="Times New Roman" w:hAnsi="Times New Roman" w:cs="Times New Roman"/>
@@ -10665,282 +10678,1612 @@
     </w:p>
     <w:p>
       <w:pPr>
-        <w:spacing w:after="0"/>
-        <w:ind w:firstLine="284"/>
+        <w:tabs>
+          <w:tab w:val="right" w:leader="dot" w:pos="9061"/>
+        </w:tabs>
+        <w:spacing w:after="100"/>
+        <w:ind w:firstLine="0"/>
         <w:jc w:val="left"/>
         <w:rPr>
-          <w:szCs w:val="26"/>
-        </w:rPr>
-      </w:pPr>
-      <w:r>
-        <w:rPr>
-          <w:szCs w:val="26"/>
-        </w:rPr>
-        <w:t>LỜI CẢM ƠN</w:t>
-      </w:r>
-    </w:p>
-    <w:p>
-      <w:pPr>
-        <w:spacing w:after="0"/>
-        <w:ind w:firstLine="284"/>
+          <w:rFonts w:ascii="Calibri" w:eastAsia="DengXian" w:hAnsi="Calibri" w:cs="Times New Roman"/>
+          <w:noProof/>
+          <w:color w:val="000000" w:themeColor="text1"/>
+          <w:kern w:val="2"/>
+          <w:sz w:val="24"/>
+          <w:szCs w:val="24"/>
+          <w:lang w:eastAsia="ko-KR"/>
+          <w14:ligatures w14:val="standardContextual"/>
+        </w:rPr>
+      </w:pPr>
+      <w:hyperlink w:anchor="_Toc200035989" w:history="1">
+        <w:r>
+          <w:rPr>
+            <w:rFonts w:eastAsia="Calibri" w:cs="Times New Roman"/>
+            <w:noProof/>
+            <w:color w:val="000000" w:themeColor="text1"/>
+            <w:u w:val="single"/>
+            <w:lang w:val="vi-VN"/>
+          </w:rPr>
+          <w:t>LỜI CẢM ƠN</w:t>
+        </w:r>
+        <w:r>
+          <w:rPr>
+            <w:rFonts w:eastAsia="Calibri" w:cs="Times New Roman"/>
+            <w:noProof/>
+            <w:webHidden/>
+            <w:color w:val="000000" w:themeColor="text1"/>
+          </w:rPr>
+          <w:tab/>
+        </w:r>
+        <w:r>
+          <w:rPr>
+            <w:rFonts w:eastAsia="Calibri" w:cs="Times New Roman"/>
+            <w:noProof/>
+            <w:webHidden/>
+            <w:color w:val="000000" w:themeColor="text1"/>
+          </w:rPr>
+          <w:fldChar w:fldCharType="begin"/>
+        </w:r>
+        <w:r>
+          <w:rPr>
+            <w:rFonts w:eastAsia="Calibri" w:cs="Times New Roman"/>
+            <w:noProof/>
+            <w:webHidden/>
+            <w:color w:val="000000" w:themeColor="text1"/>
+          </w:rPr>
+          <w:instrText xml:space="preserve"> PAGEREF _Toc200035989 \h </w:instrText>
+        </w:r>
+        <w:r>
+          <w:rPr>
+            <w:rFonts w:eastAsia="Calibri" w:cs="Times New Roman"/>
+            <w:noProof/>
+            <w:webHidden/>
+            <w:color w:val="000000" w:themeColor="text1"/>
+          </w:rPr>
+        </w:r>
+        <w:r>
+          <w:rPr>
+            <w:rFonts w:eastAsia="Calibri" w:cs="Times New Roman"/>
+            <w:noProof/>
+            <w:webHidden/>
+            <w:color w:val="000000" w:themeColor="text1"/>
+          </w:rPr>
+          <w:fldChar w:fldCharType="separate"/>
+        </w:r>
+        <w:r>
+          <w:rPr>
+            <w:rFonts w:eastAsia="Calibri" w:cs="Times New Roman"/>
+            <w:noProof/>
+            <w:webHidden/>
+            <w:color w:val="000000" w:themeColor="text1"/>
+          </w:rPr>
+          <w:t>xi</w:t>
+        </w:r>
+        <w:r>
+          <w:rPr>
+            <w:rFonts w:eastAsia="Calibri" w:cs="Times New Roman"/>
+            <w:noProof/>
+            <w:webHidden/>
+            <w:color w:val="000000" w:themeColor="text1"/>
+          </w:rPr>
+          <w:fldChar w:fldCharType="end"/>
+        </w:r>
+      </w:hyperlink>
+    </w:p>
+    <w:p>
+      <w:pPr>
+        <w:tabs>
+          <w:tab w:val="right" w:leader="dot" w:pos="9061"/>
+        </w:tabs>
+        <w:spacing w:after="100"/>
+        <w:ind w:firstLine="0"/>
         <w:jc w:val="left"/>
         <w:rPr>
-          <w:szCs w:val="26"/>
-        </w:rPr>
-      </w:pPr>
-      <w:r>
-        <w:rPr>
-          <w:szCs w:val="26"/>
-        </w:rPr>
-        <w:t>LỜI CAM ĐOAN</w:t>
-      </w:r>
-    </w:p>
-    <w:p>
-      <w:pPr>
-        <w:spacing w:after="0"/>
-        <w:ind w:firstLine="284"/>
+          <w:rFonts w:ascii="Calibri" w:eastAsia="DengXian" w:hAnsi="Calibri" w:cs="Times New Roman"/>
+          <w:noProof/>
+          <w:color w:val="000000" w:themeColor="text1"/>
+          <w:kern w:val="2"/>
+          <w:sz w:val="24"/>
+          <w:szCs w:val="24"/>
+          <w:lang w:eastAsia="ko-KR"/>
+          <w14:ligatures w14:val="standardContextual"/>
+        </w:rPr>
+      </w:pPr>
+      <w:hyperlink w:anchor="_Toc200035990" w:history="1">
+        <w:r>
+          <w:rPr>
+            <w:rFonts w:eastAsia="Calibri" w:cs="Times New Roman"/>
+            <w:noProof/>
+            <w:color w:val="000000" w:themeColor="text1"/>
+            <w:u w:val="single"/>
+            <w:lang w:val="vi-VN"/>
+          </w:rPr>
+          <w:t>LỜI CAM ĐOAN</w:t>
+        </w:r>
+        <w:r>
+          <w:rPr>
+            <w:rFonts w:eastAsia="Calibri" w:cs="Times New Roman"/>
+            <w:noProof/>
+            <w:webHidden/>
+            <w:color w:val="000000" w:themeColor="text1"/>
+          </w:rPr>
+          <w:tab/>
+        </w:r>
+        <w:r>
+          <w:rPr>
+            <w:rFonts w:eastAsia="Calibri" w:cs="Times New Roman"/>
+            <w:noProof/>
+            <w:webHidden/>
+            <w:color w:val="000000" w:themeColor="text1"/>
+          </w:rPr>
+          <w:fldChar w:fldCharType="begin"/>
+        </w:r>
+        <w:r>
+          <w:rPr>
+            <w:rFonts w:eastAsia="Calibri" w:cs="Times New Roman"/>
+            <w:noProof/>
+            <w:webHidden/>
+            <w:color w:val="000000" w:themeColor="text1"/>
+          </w:rPr>
+          <w:instrText xml:space="preserve"> PAGEREF _Toc200035990 \h </w:instrText>
+        </w:r>
+        <w:r>
+          <w:rPr>
+            <w:rFonts w:eastAsia="Calibri" w:cs="Times New Roman"/>
+            <w:noProof/>
+            <w:webHidden/>
+            <w:color w:val="000000" w:themeColor="text1"/>
+          </w:rPr>
+        </w:r>
+        <w:r>
+          <w:rPr>
+            <w:rFonts w:eastAsia="Calibri" w:cs="Times New Roman"/>
+            <w:noProof/>
+            <w:webHidden/>
+            <w:color w:val="000000" w:themeColor="text1"/>
+          </w:rPr>
+          <w:fldChar w:fldCharType="separate"/>
+        </w:r>
+        <w:r>
+          <w:rPr>
+            <w:rFonts w:eastAsia="Calibri" w:cs="Times New Roman"/>
+            <w:noProof/>
+            <w:webHidden/>
+            <w:color w:val="000000" w:themeColor="text1"/>
+          </w:rPr>
+          <w:t>xii</w:t>
+        </w:r>
+        <w:r>
+          <w:rPr>
+            <w:rFonts w:eastAsia="Calibri" w:cs="Times New Roman"/>
+            <w:noProof/>
+            <w:webHidden/>
+            <w:color w:val="000000" w:themeColor="text1"/>
+          </w:rPr>
+          <w:fldChar w:fldCharType="end"/>
+        </w:r>
+      </w:hyperlink>
+    </w:p>
+    <w:p>
+      <w:pPr>
+        <w:tabs>
+          <w:tab w:val="right" w:leader="dot" w:pos="9061"/>
+        </w:tabs>
+        <w:spacing w:after="100"/>
+        <w:ind w:firstLine="0"/>
         <w:jc w:val="left"/>
         <w:rPr>
-          <w:szCs w:val="26"/>
-        </w:rPr>
-      </w:pPr>
-      <w:r>
-        <w:rPr>
-          <w:szCs w:val="26"/>
-        </w:rPr>
-        <w:t>DANH MỤC BẢNG</w:t>
-      </w:r>
-    </w:p>
-    <w:p>
-      <w:pPr>
-        <w:spacing w:after="0"/>
-        <w:ind w:firstLine="284"/>
+          <w:rFonts w:ascii="Calibri" w:eastAsia="DengXian" w:hAnsi="Calibri" w:cs="Times New Roman"/>
+          <w:noProof/>
+          <w:color w:val="000000" w:themeColor="text1"/>
+          <w:kern w:val="2"/>
+          <w:sz w:val="24"/>
+          <w:szCs w:val="24"/>
+          <w:lang w:eastAsia="ko-KR"/>
+          <w14:ligatures w14:val="standardContextual"/>
+        </w:rPr>
+      </w:pPr>
+      <w:hyperlink w:anchor="_Toc200035991" w:history="1">
+        <w:r>
+          <w:rPr>
+            <w:rFonts w:eastAsia="Calibri" w:cs="Times New Roman"/>
+            <w:noProof/>
+            <w:color w:val="000000" w:themeColor="text1"/>
+            <w:u w:val="single"/>
+          </w:rPr>
+          <w:t>DANH MỤC BẢNG</w:t>
+        </w:r>
+        <w:r>
+          <w:rPr>
+            <w:rFonts w:eastAsia="Calibri" w:cs="Times New Roman"/>
+            <w:noProof/>
+            <w:webHidden/>
+            <w:color w:val="000000" w:themeColor="text1"/>
+          </w:rPr>
+          <w:tab/>
+        </w:r>
+        <w:r>
+          <w:rPr>
+            <w:rFonts w:eastAsia="Calibri" w:cs="Times New Roman"/>
+            <w:noProof/>
+            <w:webHidden/>
+            <w:color w:val="000000" w:themeColor="text1"/>
+          </w:rPr>
+          <w:fldChar w:fldCharType="begin"/>
+        </w:r>
+        <w:r>
+          <w:rPr>
+            <w:rFonts w:eastAsia="Calibri" w:cs="Times New Roman"/>
+            <w:noProof/>
+            <w:webHidden/>
+            <w:color w:val="000000" w:themeColor="text1"/>
+          </w:rPr>
+          <w:instrText xml:space="preserve"> PAGEREF _Toc200035991 \h </w:instrText>
+        </w:r>
+        <w:r>
+          <w:rPr>
+            <w:rFonts w:eastAsia="Calibri" w:cs="Times New Roman"/>
+            <w:noProof/>
+            <w:webHidden/>
+            <w:color w:val="000000" w:themeColor="text1"/>
+          </w:rPr>
+        </w:r>
+        <w:r>
+          <w:rPr>
+            <w:rFonts w:eastAsia="Calibri" w:cs="Times New Roman"/>
+            <w:noProof/>
+            <w:webHidden/>
+            <w:color w:val="000000" w:themeColor="text1"/>
+          </w:rPr>
+          <w:fldChar w:fldCharType="separate"/>
+        </w:r>
+        <w:r>
+          <w:rPr>
+            <w:rFonts w:eastAsia="Calibri" w:cs="Times New Roman"/>
+            <w:noProof/>
+            <w:webHidden/>
+            <w:color w:val="000000" w:themeColor="text1"/>
+          </w:rPr>
+          <w:t>5</w:t>
+        </w:r>
+        <w:r>
+          <w:rPr>
+            <w:rFonts w:eastAsia="Calibri" w:cs="Times New Roman"/>
+            <w:noProof/>
+            <w:webHidden/>
+            <w:color w:val="000000" w:themeColor="text1"/>
+          </w:rPr>
+          <w:fldChar w:fldCharType="end"/>
+        </w:r>
+      </w:hyperlink>
+    </w:p>
+    <w:p>
+      <w:pPr>
+        <w:tabs>
+          <w:tab w:val="right" w:leader="dot" w:pos="9061"/>
+        </w:tabs>
+        <w:spacing w:after="100"/>
+        <w:ind w:firstLine="0"/>
         <w:jc w:val="left"/>
         <w:rPr>
-          <w:szCs w:val="26"/>
-        </w:rPr>
-      </w:pPr>
-      <w:r>
-        <w:rPr>
-          <w:szCs w:val="26"/>
-        </w:rPr>
-        <w:t>DANH MỤC HÌNH</w:t>
-      </w:r>
-    </w:p>
-    <w:p>
-      <w:pPr>
-        <w:spacing w:after="0"/>
-        <w:ind w:firstLine="284"/>
+          <w:rFonts w:ascii="Calibri" w:eastAsia="DengXian" w:hAnsi="Calibri" w:cs="Times New Roman"/>
+          <w:noProof/>
+          <w:color w:val="000000" w:themeColor="text1"/>
+          <w:kern w:val="2"/>
+          <w:sz w:val="24"/>
+          <w:szCs w:val="24"/>
+          <w:lang w:eastAsia="ko-KR"/>
+          <w14:ligatures w14:val="standardContextual"/>
+        </w:rPr>
+      </w:pPr>
+      <w:hyperlink w:anchor="_Toc200035992" w:history="1">
+        <w:r>
+          <w:rPr>
+            <w:rFonts w:eastAsia="Calibri" w:cs="Times New Roman"/>
+            <w:noProof/>
+            <w:color w:val="000000" w:themeColor="text1"/>
+            <w:u w:val="single"/>
+          </w:rPr>
+          <w:t>DANH MỤC HÌNH</w:t>
+        </w:r>
+        <w:r>
+          <w:rPr>
+            <w:rFonts w:eastAsia="Calibri" w:cs="Times New Roman"/>
+            <w:noProof/>
+            <w:webHidden/>
+            <w:color w:val="000000" w:themeColor="text1"/>
+          </w:rPr>
+          <w:tab/>
+        </w:r>
+        <w:r>
+          <w:rPr>
+            <w:rFonts w:eastAsia="Calibri" w:cs="Times New Roman"/>
+            <w:noProof/>
+            <w:webHidden/>
+            <w:color w:val="000000" w:themeColor="text1"/>
+          </w:rPr>
+          <w:fldChar w:fldCharType="begin"/>
+        </w:r>
+        <w:r>
+          <w:rPr>
+            <w:rFonts w:eastAsia="Calibri" w:cs="Times New Roman"/>
+            <w:noProof/>
+            <w:webHidden/>
+            <w:color w:val="000000" w:themeColor="text1"/>
+          </w:rPr>
+          <w:instrText xml:space="preserve"> PAGEREF _Toc200035992 \h </w:instrText>
+        </w:r>
+        <w:r>
+          <w:rPr>
+            <w:rFonts w:eastAsia="Calibri" w:cs="Times New Roman"/>
+            <w:noProof/>
+            <w:webHidden/>
+            <w:color w:val="000000" w:themeColor="text1"/>
+          </w:rPr>
+        </w:r>
+        <w:r>
+          <w:rPr>
+            <w:rFonts w:eastAsia="Calibri" w:cs="Times New Roman"/>
+            <w:noProof/>
+            <w:webHidden/>
+            <w:color w:val="000000" w:themeColor="text1"/>
+          </w:rPr>
+          <w:fldChar w:fldCharType="separate"/>
+        </w:r>
+        <w:r>
+          <w:rPr>
+            <w:rFonts w:eastAsia="Calibri" w:cs="Times New Roman"/>
+            <w:noProof/>
+            <w:webHidden/>
+            <w:color w:val="000000" w:themeColor="text1"/>
+          </w:rPr>
+          <w:t>5</w:t>
+        </w:r>
+        <w:r>
+          <w:rPr>
+            <w:rFonts w:eastAsia="Calibri" w:cs="Times New Roman"/>
+            <w:noProof/>
+            <w:webHidden/>
+            <w:color w:val="000000" w:themeColor="text1"/>
+          </w:rPr>
+          <w:fldChar w:fldCharType="end"/>
+        </w:r>
+      </w:hyperlink>
+    </w:p>
+    <w:p>
+      <w:pPr>
+        <w:tabs>
+          <w:tab w:val="right" w:leader="dot" w:pos="9061"/>
+        </w:tabs>
+        <w:spacing w:after="100"/>
+        <w:ind w:firstLine="0"/>
         <w:jc w:val="left"/>
         <w:rPr>
-          <w:szCs w:val="26"/>
-        </w:rPr>
-      </w:pPr>
-      <w:r>
-        <w:rPr>
-          <w:szCs w:val="26"/>
-        </w:rPr>
-        <w:t>DANH MỤC TỪ VIẾT TẮT</w:t>
-      </w:r>
-    </w:p>
-    <w:p>
-      <w:pPr>
-        <w:spacing w:after="0"/>
-        <w:ind w:firstLine="284"/>
+          <w:rFonts w:ascii="Calibri" w:eastAsia="DengXian" w:hAnsi="Calibri" w:cs="Times New Roman"/>
+          <w:noProof/>
+          <w:color w:val="000000" w:themeColor="text1"/>
+          <w:kern w:val="2"/>
+          <w:sz w:val="24"/>
+          <w:szCs w:val="24"/>
+          <w:lang w:eastAsia="ko-KR"/>
+          <w14:ligatures w14:val="standardContextual"/>
+        </w:rPr>
+      </w:pPr>
+      <w:hyperlink w:anchor="_Toc200035993" w:history="1">
+        <w:r>
+          <w:rPr>
+            <w:rFonts w:eastAsia="Calibri" w:cs="Times New Roman"/>
+            <w:noProof/>
+            <w:color w:val="000000" w:themeColor="text1"/>
+            <w:u w:val="single"/>
+          </w:rPr>
+          <w:t>DANH MỤC TỪ VIẾT TẮT</w:t>
+        </w:r>
+        <w:r>
+          <w:rPr>
+            <w:rFonts w:eastAsia="Calibri" w:cs="Times New Roman"/>
+            <w:noProof/>
+            <w:webHidden/>
+            <w:color w:val="000000" w:themeColor="text1"/>
+          </w:rPr>
+          <w:tab/>
+        </w:r>
+        <w:r>
+          <w:rPr>
+            <w:rFonts w:eastAsia="Calibri" w:cs="Times New Roman"/>
+            <w:noProof/>
+            <w:webHidden/>
+            <w:color w:val="000000" w:themeColor="text1"/>
+          </w:rPr>
+          <w:fldChar w:fldCharType="begin"/>
+        </w:r>
+        <w:r>
+          <w:rPr>
+            <w:rFonts w:eastAsia="Calibri" w:cs="Times New Roman"/>
+            <w:noProof/>
+            <w:webHidden/>
+            <w:color w:val="000000" w:themeColor="text1"/>
+          </w:rPr>
+          <w:instrText xml:space="preserve"> PAGEREF _Toc200035993 \h </w:instrText>
+        </w:r>
+        <w:r>
+          <w:rPr>
+            <w:rFonts w:eastAsia="Calibri" w:cs="Times New Roman"/>
+            <w:noProof/>
+            <w:webHidden/>
+            <w:color w:val="000000" w:themeColor="text1"/>
+          </w:rPr>
+        </w:r>
+        <w:r>
+          <w:rPr>
+            <w:rFonts w:eastAsia="Calibri" w:cs="Times New Roman"/>
+            <w:noProof/>
+            <w:webHidden/>
+            <w:color w:val="000000" w:themeColor="text1"/>
+          </w:rPr>
+          <w:fldChar w:fldCharType="separate"/>
+        </w:r>
+        <w:r>
+          <w:rPr>
+            <w:rFonts w:eastAsia="Calibri" w:cs="Times New Roman"/>
+            <w:noProof/>
+            <w:webHidden/>
+            <w:color w:val="000000" w:themeColor="text1"/>
+          </w:rPr>
+          <w:t>6</w:t>
+        </w:r>
+        <w:r>
+          <w:rPr>
+            <w:rFonts w:eastAsia="Calibri" w:cs="Times New Roman"/>
+            <w:noProof/>
+            <w:webHidden/>
+            <w:color w:val="000000" w:themeColor="text1"/>
+          </w:rPr>
+          <w:fldChar w:fldCharType="end"/>
+        </w:r>
+      </w:hyperlink>
+    </w:p>
+    <w:p>
+      <w:pPr>
+        <w:tabs>
+          <w:tab w:val="right" w:leader="dot" w:pos="9061"/>
+        </w:tabs>
+        <w:spacing w:after="100"/>
+        <w:ind w:firstLine="0"/>
         <w:jc w:val="left"/>
         <w:rPr>
-          <w:szCs w:val="26"/>
-        </w:rPr>
-      </w:pPr>
-      <w:r>
-        <w:rPr>
-          <w:szCs w:val="26"/>
-        </w:rPr>
-        <w:t>CHƯƠNG 1: TỔNG QUAN ĐỀ TÀI VÀ CƠ SỞ LÝ THUYẾT</w:t>
-      </w:r>
-    </w:p>
-    <w:p>
-      <w:pPr>
-        <w:pStyle w:val="ListParagraph"/>
-        <w:numPr>
-          <w:ilvl w:val="1"/>
-          <w:numId w:val="1"/>
-        </w:numPr>
-        <w:spacing w:after="0"/>
-        <w:ind w:left="1134" w:hanging="425"/>
-        <w:rPr>
-          <w:sz w:val="26"/>
-          <w:szCs w:val="26"/>
-        </w:rPr>
-      </w:pPr>
-      <w:r>
-        <w:rPr>
-          <w:sz w:val="26"/>
-          <w:szCs w:val="26"/>
-        </w:rPr>
-        <w:t>Tổng quan đề tài</w:t>
-      </w:r>
-    </w:p>
-    <w:p>
-      <w:pPr>
-        <w:pStyle w:val="ListParagraph"/>
-        <w:numPr>
-          <w:ilvl w:val="1"/>
-          <w:numId w:val="1"/>
-        </w:numPr>
-        <w:spacing w:after="0"/>
-        <w:ind w:hanging="434"/>
-        <w:rPr>
-          <w:sz w:val="26"/>
-          <w:szCs w:val="26"/>
-        </w:rPr>
-      </w:pPr>
-      <w:r>
-        <w:rPr>
-          <w:sz w:val="26"/>
-          <w:szCs w:val="26"/>
-        </w:rPr>
-        <w:t>Cơ sở lý thuyết</w:t>
-      </w:r>
-    </w:p>
-    <w:p>
-      <w:pPr>
-        <w:spacing w:after="0"/>
-        <w:ind w:firstLine="284"/>
-        <w:rPr>
-          <w:szCs w:val="26"/>
-        </w:rPr>
-      </w:pPr>
-      <w:r>
-        <w:rPr>
-          <w:szCs w:val="26"/>
-        </w:rPr>
-        <w:t>CHƯƠNG 2: THU THẬP VÀ XỬ LÝ DỮ LIỆU</w:t>
-      </w:r>
-    </w:p>
-    <w:p>
-      <w:pPr>
-        <w:spacing w:after="0"/>
-        <w:ind w:firstLine="284"/>
-        <w:rPr>
-          <w:szCs w:val="26"/>
-        </w:rPr>
-      </w:pPr>
-      <w:r>
-        <w:rPr>
-          <w:szCs w:val="26"/>
-        </w:rPr>
-        <w:t>CHƯƠNG 3: PHƯƠNG PHÁP NGHIÊN CỨU</w:t>
-      </w:r>
-    </w:p>
-    <w:p>
-      <w:pPr>
-        <w:spacing w:after="0"/>
-        <w:ind w:firstLine="284"/>
-        <w:rPr>
-          <w:szCs w:val="26"/>
-        </w:rPr>
-      </w:pPr>
-      <w:r>
-        <w:rPr>
-          <w:szCs w:val="26"/>
-        </w:rPr>
-        <w:t>CHƯƠNG 4: KẾT QUẢ VÀ PHÂN TÍCH</w:t>
-      </w:r>
-    </w:p>
-    <w:p>
-      <w:pPr>
-        <w:spacing w:after="0"/>
-        <w:ind w:firstLine="284"/>
-        <w:rPr>
-          <w:szCs w:val="26"/>
-        </w:rPr>
-      </w:pPr>
-      <w:r>
-        <w:rPr>
-          <w:szCs w:val="26"/>
-        </w:rPr>
-        <w:t>CHƯƠNG 5: THẢO LUẬN, KẾT LUẬN VÀ HƯỚNG PHÁT TRIỂN TƯƠNG LAI</w:t>
-      </w:r>
-    </w:p>
-    <w:p>
-      <w:pPr>
-        <w:spacing w:after="0"/>
-        <w:ind w:firstLine="284"/>
-        <w:rPr>
-          <w:szCs w:val="26"/>
-        </w:rPr>
-      </w:pPr>
-      <w:r>
-        <w:rPr>
-          <w:szCs w:val="26"/>
-        </w:rPr>
-        <w:tab/>
-        <w:t>5.1 Thảo luận</w:t>
-      </w:r>
-    </w:p>
-    <w:p>
-      <w:pPr>
-        <w:spacing w:after="0"/>
-        <w:ind w:firstLine="284"/>
-        <w:rPr>
-          <w:szCs w:val="26"/>
-        </w:rPr>
-      </w:pPr>
-      <w:r>
-        <w:rPr>
-          <w:szCs w:val="26"/>
-        </w:rPr>
-        <w:tab/>
-        <w:t>5.2 Kết luận</w:t>
-      </w:r>
-    </w:p>
-    <w:p>
-      <w:pPr>
-        <w:spacing w:after="0"/>
-        <w:ind w:firstLine="284"/>
-        <w:rPr>
-          <w:szCs w:val="26"/>
-        </w:rPr>
-      </w:pPr>
-      <w:r>
-        <w:rPr>
-          <w:szCs w:val="26"/>
-        </w:rPr>
-        <w:tab/>
-        <w:t>5.3 Hạn chế của đề tài</w:t>
-      </w:r>
-    </w:p>
-    <w:p>
-      <w:pPr>
-        <w:spacing w:after="0"/>
-        <w:ind w:firstLine="284"/>
-        <w:rPr>
-          <w:szCs w:val="26"/>
-        </w:rPr>
-      </w:pPr>
-      <w:r>
-        <w:rPr>
-          <w:szCs w:val="26"/>
-        </w:rPr>
-        <w:tab/>
-        <w:t>5.4 Hướng phát triển tương lai</w:t>
-      </w:r>
-    </w:p>
-    <w:p>
-      <w:pPr>
-        <w:spacing w:after="0"/>
-        <w:ind w:firstLine="284"/>
-        <w:rPr>
-          <w:szCs w:val="26"/>
-        </w:rPr>
-      </w:pPr>
-      <w:r>
-        <w:rPr>
-          <w:szCs w:val="26"/>
-        </w:rPr>
-        <w:t>DANH MỤC TÀI LIỆU THAM KHẢO</w:t>
-      </w:r>
+          <w:rFonts w:ascii="Calibri" w:eastAsia="DengXian" w:hAnsi="Calibri" w:cs="Times New Roman"/>
+          <w:noProof/>
+          <w:color w:val="000000" w:themeColor="text1"/>
+          <w:kern w:val="2"/>
+          <w:sz w:val="24"/>
+          <w:szCs w:val="24"/>
+          <w:lang w:eastAsia="ko-KR"/>
+          <w14:ligatures w14:val="standardContextual"/>
+        </w:rPr>
+      </w:pPr>
+      <w:hyperlink w:anchor="_Toc200035994" w:history="1">
+        <w:r>
+          <w:rPr>
+            <w:rFonts w:eastAsia="Calibri" w:cs="Times New Roman"/>
+            <w:noProof/>
+            <w:color w:val="000000" w:themeColor="text1"/>
+            <w:u w:val="single"/>
+            <w:lang w:val="vi-VN"/>
+          </w:rPr>
+          <w:t>CHƯƠNG 1. TỔNG QUAN ĐỀ TÀI VÀ CƠ SỞ LÝ THUYẾT</w:t>
+        </w:r>
+        <w:r>
+          <w:rPr>
+            <w:rFonts w:eastAsia="Calibri" w:cs="Times New Roman"/>
+            <w:noProof/>
+            <w:webHidden/>
+            <w:color w:val="000000" w:themeColor="text1"/>
+          </w:rPr>
+          <w:tab/>
+        </w:r>
+        <w:r>
+          <w:rPr>
+            <w:rFonts w:eastAsia="Calibri" w:cs="Times New Roman"/>
+            <w:noProof/>
+            <w:webHidden/>
+            <w:color w:val="000000" w:themeColor="text1"/>
+          </w:rPr>
+          <w:fldChar w:fldCharType="begin"/>
+        </w:r>
+        <w:r>
+          <w:rPr>
+            <w:rFonts w:eastAsia="Calibri" w:cs="Times New Roman"/>
+            <w:noProof/>
+            <w:webHidden/>
+            <w:color w:val="000000" w:themeColor="text1"/>
+          </w:rPr>
+          <w:instrText xml:space="preserve"> PAGEREF _Toc200035994 \h </w:instrText>
+        </w:r>
+        <w:r>
+          <w:rPr>
+            <w:rFonts w:eastAsia="Calibri" w:cs="Times New Roman"/>
+            <w:noProof/>
+            <w:webHidden/>
+            <w:color w:val="000000" w:themeColor="text1"/>
+          </w:rPr>
+        </w:r>
+        <w:r>
+          <w:rPr>
+            <w:rFonts w:eastAsia="Calibri" w:cs="Times New Roman"/>
+            <w:noProof/>
+            <w:webHidden/>
+            <w:color w:val="000000" w:themeColor="text1"/>
+          </w:rPr>
+          <w:fldChar w:fldCharType="separate"/>
+        </w:r>
+        <w:r>
+          <w:rPr>
+            <w:rFonts w:eastAsia="Calibri" w:cs="Times New Roman"/>
+            <w:noProof/>
+            <w:webHidden/>
+            <w:color w:val="000000" w:themeColor="text1"/>
+          </w:rPr>
+          <w:t>8</w:t>
+        </w:r>
+        <w:r>
+          <w:rPr>
+            <w:rFonts w:eastAsia="Calibri" w:cs="Times New Roman"/>
+            <w:noProof/>
+            <w:webHidden/>
+            <w:color w:val="000000" w:themeColor="text1"/>
+          </w:rPr>
+          <w:fldChar w:fldCharType="end"/>
+        </w:r>
+      </w:hyperlink>
+    </w:p>
+    <w:p>
+      <w:pPr>
+        <w:tabs>
+          <w:tab w:val="right" w:leader="dot" w:pos="9061"/>
+        </w:tabs>
+        <w:spacing w:after="100"/>
+        <w:ind w:left="260" w:firstLine="0"/>
+        <w:jc w:val="left"/>
+        <w:rPr>
+          <w:rFonts w:ascii="Calibri" w:eastAsia="DengXian" w:hAnsi="Calibri" w:cs="Times New Roman"/>
+          <w:noProof/>
+          <w:color w:val="000000" w:themeColor="text1"/>
+          <w:kern w:val="2"/>
+          <w:sz w:val="24"/>
+          <w:szCs w:val="24"/>
+          <w:lang w:eastAsia="ko-KR"/>
+          <w14:ligatures w14:val="standardContextual"/>
+        </w:rPr>
+      </w:pPr>
+      <w:hyperlink w:anchor="_Toc200035995" w:history="1">
+        <w:r>
+          <w:rPr>
+            <w:rFonts w:eastAsia="Calibri" w:cs="Times New Roman"/>
+            <w:noProof/>
+            <w:color w:val="000000" w:themeColor="text1"/>
+            <w:u w:val="single"/>
+            <w:lang w:val="vi-VN"/>
+          </w:rPr>
+          <w:t>1.1. Tổng quan đề tài</w:t>
+        </w:r>
+        <w:r>
+          <w:rPr>
+            <w:rFonts w:eastAsia="Calibri" w:cs="Times New Roman"/>
+            <w:noProof/>
+            <w:webHidden/>
+            <w:color w:val="000000" w:themeColor="text1"/>
+          </w:rPr>
+          <w:tab/>
+        </w:r>
+        <w:r>
+          <w:rPr>
+            <w:rFonts w:eastAsia="Calibri" w:cs="Times New Roman"/>
+            <w:noProof/>
+            <w:webHidden/>
+            <w:color w:val="000000" w:themeColor="text1"/>
+          </w:rPr>
+          <w:fldChar w:fldCharType="begin"/>
+        </w:r>
+        <w:r>
+          <w:rPr>
+            <w:rFonts w:eastAsia="Calibri" w:cs="Times New Roman"/>
+            <w:noProof/>
+            <w:webHidden/>
+            <w:color w:val="000000" w:themeColor="text1"/>
+          </w:rPr>
+          <w:instrText xml:space="preserve"> PAGEREF _Toc200035995 \h </w:instrText>
+        </w:r>
+        <w:r>
+          <w:rPr>
+            <w:rFonts w:eastAsia="Calibri" w:cs="Times New Roman"/>
+            <w:noProof/>
+            <w:webHidden/>
+            <w:color w:val="000000" w:themeColor="text1"/>
+          </w:rPr>
+        </w:r>
+        <w:r>
+          <w:rPr>
+            <w:rFonts w:eastAsia="Calibri" w:cs="Times New Roman"/>
+            <w:noProof/>
+            <w:webHidden/>
+            <w:color w:val="000000" w:themeColor="text1"/>
+          </w:rPr>
+          <w:fldChar w:fldCharType="separate"/>
+        </w:r>
+        <w:r>
+          <w:rPr>
+            <w:rFonts w:eastAsia="Calibri" w:cs="Times New Roman"/>
+            <w:noProof/>
+            <w:webHidden/>
+            <w:color w:val="000000" w:themeColor="text1"/>
+          </w:rPr>
+          <w:t>8</w:t>
+        </w:r>
+        <w:r>
+          <w:rPr>
+            <w:rFonts w:eastAsia="Calibri" w:cs="Times New Roman"/>
+            <w:noProof/>
+            <w:webHidden/>
+            <w:color w:val="000000" w:themeColor="text1"/>
+          </w:rPr>
+          <w:fldChar w:fldCharType="end"/>
+        </w:r>
+      </w:hyperlink>
+    </w:p>
+    <w:p>
+      <w:pPr>
+        <w:tabs>
+          <w:tab w:val="right" w:leader="dot" w:pos="9061"/>
+        </w:tabs>
+        <w:spacing w:after="100"/>
+        <w:ind w:left="260" w:firstLine="0"/>
+        <w:jc w:val="left"/>
+        <w:rPr>
+          <w:rFonts w:ascii="Calibri" w:eastAsia="DengXian" w:hAnsi="Calibri" w:cs="Times New Roman"/>
+          <w:noProof/>
+          <w:color w:val="000000" w:themeColor="text1"/>
+          <w:kern w:val="2"/>
+          <w:sz w:val="24"/>
+          <w:szCs w:val="24"/>
+          <w:lang w:eastAsia="ko-KR"/>
+          <w14:ligatures w14:val="standardContextual"/>
+        </w:rPr>
+      </w:pPr>
+      <w:hyperlink w:anchor="_Toc200035999" w:history="1">
+        <w:r>
+          <w:rPr>
+            <w:rFonts w:eastAsia="Calibri" w:cs="Times New Roman"/>
+            <w:noProof/>
+            <w:color w:val="000000" w:themeColor="text1"/>
+            <w:u w:val="single"/>
+            <w:lang w:val="vi-VN"/>
+          </w:rPr>
+          <w:t>1.2. Cơ sở lý thuyết</w:t>
+        </w:r>
+        <w:r>
+          <w:rPr>
+            <w:rFonts w:eastAsia="Calibri" w:cs="Times New Roman"/>
+            <w:noProof/>
+            <w:webHidden/>
+            <w:color w:val="000000" w:themeColor="text1"/>
+          </w:rPr>
+          <w:tab/>
+        </w:r>
+        <w:r>
+          <w:rPr>
+            <w:rFonts w:eastAsia="Calibri" w:cs="Times New Roman"/>
+            <w:noProof/>
+            <w:webHidden/>
+            <w:color w:val="000000" w:themeColor="text1"/>
+          </w:rPr>
+          <w:fldChar w:fldCharType="begin"/>
+        </w:r>
+        <w:r>
+          <w:rPr>
+            <w:rFonts w:eastAsia="Calibri" w:cs="Times New Roman"/>
+            <w:noProof/>
+            <w:webHidden/>
+            <w:color w:val="000000" w:themeColor="text1"/>
+          </w:rPr>
+          <w:instrText xml:space="preserve"> PAGEREF _Toc200035999 \h </w:instrText>
+        </w:r>
+        <w:r>
+          <w:rPr>
+            <w:rFonts w:eastAsia="Calibri" w:cs="Times New Roman"/>
+            <w:noProof/>
+            <w:webHidden/>
+            <w:color w:val="000000" w:themeColor="text1"/>
+          </w:rPr>
+        </w:r>
+        <w:r>
+          <w:rPr>
+            <w:rFonts w:eastAsia="Calibri" w:cs="Times New Roman"/>
+            <w:noProof/>
+            <w:webHidden/>
+            <w:color w:val="000000" w:themeColor="text1"/>
+          </w:rPr>
+          <w:fldChar w:fldCharType="separate"/>
+        </w:r>
+        <w:r>
+          <w:rPr>
+            <w:rFonts w:eastAsia="Calibri" w:cs="Times New Roman"/>
+            <w:noProof/>
+            <w:webHidden/>
+            <w:color w:val="000000" w:themeColor="text1"/>
+          </w:rPr>
+          <w:t>11</w:t>
+        </w:r>
+        <w:r>
+          <w:rPr>
+            <w:rFonts w:eastAsia="Calibri" w:cs="Times New Roman"/>
+            <w:noProof/>
+            <w:webHidden/>
+            <w:color w:val="000000" w:themeColor="text1"/>
+          </w:rPr>
+          <w:fldChar w:fldCharType="end"/>
+        </w:r>
+      </w:hyperlink>
+    </w:p>
+    <w:p>
+      <w:pPr>
+        <w:tabs>
+          <w:tab w:val="right" w:leader="dot" w:pos="9061"/>
+        </w:tabs>
+        <w:spacing w:after="100"/>
+        <w:ind w:firstLine="0"/>
+        <w:jc w:val="left"/>
+        <w:rPr>
+          <w:rFonts w:ascii="Calibri" w:eastAsia="DengXian" w:hAnsi="Calibri" w:cs="Times New Roman"/>
+          <w:noProof/>
+          <w:color w:val="000000" w:themeColor="text1"/>
+          <w:kern w:val="2"/>
+          <w:sz w:val="24"/>
+          <w:szCs w:val="24"/>
+          <w:lang w:eastAsia="ko-KR"/>
+          <w14:ligatures w14:val="standardContextual"/>
+        </w:rPr>
+      </w:pPr>
+      <w:hyperlink w:anchor="_Toc200036007" w:history="1">
+        <w:r>
+          <w:rPr>
+            <w:rFonts w:eastAsia="Calibri" w:cs="Times New Roman"/>
+            <w:noProof/>
+            <w:color w:val="000000" w:themeColor="text1"/>
+            <w:u w:val="single"/>
+            <w:lang w:val="vi-VN"/>
+          </w:rPr>
+          <w:t>CHƯƠNG 2.</w:t>
+        </w:r>
+        <w:r>
+          <w:rPr>
+            <w:rFonts w:eastAsia="Calibri" w:cs="Times New Roman"/>
+            <w:noProof/>
+            <w:color w:val="000000" w:themeColor="text1"/>
+            <w:u w:val="single"/>
+          </w:rPr>
+          <w:t xml:space="preserve"> THU THẬP VÀ XỬ LÝ DỮ LIỆU</w:t>
+        </w:r>
+        <w:r>
+          <w:rPr>
+            <w:rFonts w:eastAsia="Calibri" w:cs="Times New Roman"/>
+            <w:noProof/>
+            <w:webHidden/>
+            <w:color w:val="000000" w:themeColor="text1"/>
+          </w:rPr>
+          <w:tab/>
+        </w:r>
+        <w:r>
+          <w:rPr>
+            <w:rFonts w:eastAsia="Calibri" w:cs="Times New Roman"/>
+            <w:noProof/>
+            <w:webHidden/>
+            <w:color w:val="000000" w:themeColor="text1"/>
+          </w:rPr>
+          <w:fldChar w:fldCharType="begin"/>
+        </w:r>
+        <w:r>
+          <w:rPr>
+            <w:rFonts w:eastAsia="Calibri" w:cs="Times New Roman"/>
+            <w:noProof/>
+            <w:webHidden/>
+            <w:color w:val="000000" w:themeColor="text1"/>
+          </w:rPr>
+          <w:instrText xml:space="preserve"> PAGEREF _Toc200036007 \h </w:instrText>
+        </w:r>
+        <w:r>
+          <w:rPr>
+            <w:rFonts w:eastAsia="Calibri" w:cs="Times New Roman"/>
+            <w:noProof/>
+            <w:webHidden/>
+            <w:color w:val="000000" w:themeColor="text1"/>
+          </w:rPr>
+        </w:r>
+        <w:r>
+          <w:rPr>
+            <w:rFonts w:eastAsia="Calibri" w:cs="Times New Roman"/>
+            <w:noProof/>
+            <w:webHidden/>
+            <w:color w:val="000000" w:themeColor="text1"/>
+          </w:rPr>
+          <w:fldChar w:fldCharType="separate"/>
+        </w:r>
+        <w:r>
+          <w:rPr>
+            <w:rFonts w:eastAsia="Calibri" w:cs="Times New Roman"/>
+            <w:noProof/>
+            <w:webHidden/>
+            <w:color w:val="000000" w:themeColor="text1"/>
+          </w:rPr>
+          <w:t>37</w:t>
+        </w:r>
+        <w:r>
+          <w:rPr>
+            <w:rFonts w:eastAsia="Calibri" w:cs="Times New Roman"/>
+            <w:noProof/>
+            <w:webHidden/>
+            <w:color w:val="000000" w:themeColor="text1"/>
+          </w:rPr>
+          <w:fldChar w:fldCharType="end"/>
+        </w:r>
+      </w:hyperlink>
+    </w:p>
+    <w:p>
+      <w:pPr>
+        <w:tabs>
+          <w:tab w:val="right" w:leader="dot" w:pos="9061"/>
+        </w:tabs>
+        <w:spacing w:after="100"/>
+        <w:ind w:firstLine="0"/>
+        <w:jc w:val="left"/>
+        <w:rPr>
+          <w:rFonts w:ascii="Calibri" w:eastAsia="DengXian" w:hAnsi="Calibri" w:cs="Times New Roman"/>
+          <w:noProof/>
+          <w:color w:val="000000" w:themeColor="text1"/>
+          <w:kern w:val="2"/>
+          <w:sz w:val="24"/>
+          <w:szCs w:val="24"/>
+          <w:lang w:eastAsia="ko-KR"/>
+          <w14:ligatures w14:val="standardContextual"/>
+        </w:rPr>
+      </w:pPr>
+      <w:hyperlink w:anchor="_Toc200036013" w:history="1">
+        <w:r>
+          <w:rPr>
+            <w:rFonts w:eastAsia="Calibri" w:cs="Times New Roman"/>
+            <w:noProof/>
+            <w:color w:val="000000" w:themeColor="text1"/>
+            <w:u w:val="single"/>
+            <w:lang w:val="vi-VN"/>
+          </w:rPr>
+          <w:t>CHƯƠNG 3.</w:t>
+        </w:r>
+        <w:r>
+          <w:rPr>
+            <w:rFonts w:eastAsia="Calibri" w:cs="Times New Roman"/>
+            <w:noProof/>
+            <w:color w:val="000000" w:themeColor="text1"/>
+            <w:u w:val="single"/>
+          </w:rPr>
+          <w:t xml:space="preserve"> PHƯƠNG PHÁP NGHIÊN CỨU</w:t>
+        </w:r>
+        <w:r>
+          <w:rPr>
+            <w:rFonts w:eastAsia="Calibri" w:cs="Times New Roman"/>
+            <w:noProof/>
+            <w:webHidden/>
+            <w:color w:val="000000" w:themeColor="text1"/>
+          </w:rPr>
+          <w:tab/>
+        </w:r>
+        <w:r>
+          <w:rPr>
+            <w:rFonts w:eastAsia="Calibri" w:cs="Times New Roman"/>
+            <w:noProof/>
+            <w:webHidden/>
+            <w:color w:val="000000" w:themeColor="text1"/>
+          </w:rPr>
+          <w:fldChar w:fldCharType="begin"/>
+        </w:r>
+        <w:r>
+          <w:rPr>
+            <w:rFonts w:eastAsia="Calibri" w:cs="Times New Roman"/>
+            <w:noProof/>
+            <w:webHidden/>
+            <w:color w:val="000000" w:themeColor="text1"/>
+          </w:rPr>
+          <w:instrText xml:space="preserve"> PAGEREF _Toc200036013 \h </w:instrText>
+        </w:r>
+        <w:r>
+          <w:rPr>
+            <w:rFonts w:eastAsia="Calibri" w:cs="Times New Roman"/>
+            <w:noProof/>
+            <w:webHidden/>
+            <w:color w:val="000000" w:themeColor="text1"/>
+          </w:rPr>
+        </w:r>
+        <w:r>
+          <w:rPr>
+            <w:rFonts w:eastAsia="Calibri" w:cs="Times New Roman"/>
+            <w:noProof/>
+            <w:webHidden/>
+            <w:color w:val="000000" w:themeColor="text1"/>
+          </w:rPr>
+          <w:fldChar w:fldCharType="separate"/>
+        </w:r>
+        <w:r>
+          <w:rPr>
+            <w:rFonts w:eastAsia="Calibri" w:cs="Times New Roman"/>
+            <w:noProof/>
+            <w:webHidden/>
+            <w:color w:val="000000" w:themeColor="text1"/>
+          </w:rPr>
+          <w:t>42</w:t>
+        </w:r>
+        <w:r>
+          <w:rPr>
+            <w:rFonts w:eastAsia="Calibri" w:cs="Times New Roman"/>
+            <w:noProof/>
+            <w:webHidden/>
+            <w:color w:val="000000" w:themeColor="text1"/>
+          </w:rPr>
+          <w:fldChar w:fldCharType="end"/>
+        </w:r>
+      </w:hyperlink>
+    </w:p>
+    <w:p>
+      <w:pPr>
+        <w:tabs>
+          <w:tab w:val="right" w:leader="dot" w:pos="9061"/>
+        </w:tabs>
+        <w:spacing w:after="100"/>
+        <w:ind w:firstLine="0"/>
+        <w:jc w:val="left"/>
+        <w:rPr>
+          <w:rFonts w:ascii="Calibri" w:eastAsia="DengXian" w:hAnsi="Calibri" w:cs="Times New Roman"/>
+          <w:noProof/>
+          <w:color w:val="000000" w:themeColor="text1"/>
+          <w:kern w:val="2"/>
+          <w:sz w:val="24"/>
+          <w:szCs w:val="24"/>
+          <w:lang w:eastAsia="ko-KR"/>
+          <w14:ligatures w14:val="standardContextual"/>
+        </w:rPr>
+      </w:pPr>
+      <w:hyperlink w:anchor="_Toc200036041" w:history="1">
+        <w:r>
+          <w:rPr>
+            <w:rFonts w:eastAsia="Calibri" w:cs="Times New Roman"/>
+            <w:noProof/>
+            <w:color w:val="000000" w:themeColor="text1"/>
+            <w:u w:val="single"/>
+          </w:rPr>
+          <w:t>CHƯƠNG 4. KẾT QUẢ VÀ PHÂN TÍCH</w:t>
+        </w:r>
+        <w:r>
+          <w:rPr>
+            <w:rFonts w:eastAsia="Calibri" w:cs="Times New Roman"/>
+            <w:noProof/>
+            <w:webHidden/>
+            <w:color w:val="000000" w:themeColor="text1"/>
+          </w:rPr>
+          <w:tab/>
+        </w:r>
+        <w:r>
+          <w:rPr>
+            <w:rFonts w:eastAsia="Calibri" w:cs="Times New Roman"/>
+            <w:noProof/>
+            <w:webHidden/>
+            <w:color w:val="000000" w:themeColor="text1"/>
+          </w:rPr>
+          <w:fldChar w:fldCharType="begin"/>
+        </w:r>
+        <w:r>
+          <w:rPr>
+            <w:rFonts w:eastAsia="Calibri" w:cs="Times New Roman"/>
+            <w:noProof/>
+            <w:webHidden/>
+            <w:color w:val="000000" w:themeColor="text1"/>
+          </w:rPr>
+          <w:instrText xml:space="preserve"> PAGEREF _Toc200036041 \h </w:instrText>
+        </w:r>
+        <w:r>
+          <w:rPr>
+            <w:rFonts w:eastAsia="Calibri" w:cs="Times New Roman"/>
+            <w:noProof/>
+            <w:webHidden/>
+            <w:color w:val="000000" w:themeColor="text1"/>
+          </w:rPr>
+        </w:r>
+        <w:r>
+          <w:rPr>
+            <w:rFonts w:eastAsia="Calibri" w:cs="Times New Roman"/>
+            <w:noProof/>
+            <w:webHidden/>
+            <w:color w:val="000000" w:themeColor="text1"/>
+          </w:rPr>
+          <w:fldChar w:fldCharType="separate"/>
+        </w:r>
+        <w:r>
+          <w:rPr>
+            <w:rFonts w:eastAsia="Calibri" w:cs="Times New Roman"/>
+            <w:noProof/>
+            <w:webHidden/>
+            <w:color w:val="000000" w:themeColor="text1"/>
+          </w:rPr>
+          <w:t>75</w:t>
+        </w:r>
+        <w:r>
+          <w:rPr>
+            <w:rFonts w:eastAsia="Calibri" w:cs="Times New Roman"/>
+            <w:noProof/>
+            <w:webHidden/>
+            <w:color w:val="000000" w:themeColor="text1"/>
+          </w:rPr>
+          <w:fldChar w:fldCharType="end"/>
+        </w:r>
+      </w:hyperlink>
+    </w:p>
+    <w:p>
+      <w:pPr>
+        <w:tabs>
+          <w:tab w:val="right" w:leader="dot" w:pos="9061"/>
+        </w:tabs>
+        <w:spacing w:after="100"/>
+        <w:ind w:firstLine="0"/>
+        <w:jc w:val="left"/>
+        <w:rPr>
+          <w:rFonts w:ascii="Calibri" w:eastAsia="DengXian" w:hAnsi="Calibri" w:cs="Times New Roman"/>
+          <w:noProof/>
+          <w:color w:val="000000" w:themeColor="text1"/>
+          <w:kern w:val="2"/>
+          <w:sz w:val="24"/>
+          <w:szCs w:val="24"/>
+          <w:lang w:eastAsia="ko-KR"/>
+          <w14:ligatures w14:val="standardContextual"/>
+        </w:rPr>
+      </w:pPr>
+      <w:hyperlink w:anchor="_Toc200036077" w:history="1">
+        <w:r>
+          <w:rPr>
+            <w:rFonts w:eastAsia="Calibri" w:cs="Times New Roman"/>
+            <w:noProof/>
+            <w:color w:val="000000" w:themeColor="text1"/>
+            <w:u w:val="single"/>
+          </w:rPr>
+          <w:t>CHƯƠNG 5. THẢO LUẬN, KẾT LUẬN VÀ HƯỚNG PHÁT TRIỂN TƯƠNG LAI</w:t>
+        </w:r>
+        <w:r>
+          <w:rPr>
+            <w:rFonts w:eastAsia="Calibri" w:cs="Times New Roman"/>
+            <w:noProof/>
+            <w:webHidden/>
+            <w:color w:val="000000" w:themeColor="text1"/>
+          </w:rPr>
+          <w:tab/>
+        </w:r>
+        <w:r>
+          <w:rPr>
+            <w:rFonts w:eastAsia="Calibri" w:cs="Times New Roman"/>
+            <w:noProof/>
+            <w:webHidden/>
+            <w:color w:val="000000" w:themeColor="text1"/>
+          </w:rPr>
+          <w:fldChar w:fldCharType="begin"/>
+        </w:r>
+        <w:r>
+          <w:rPr>
+            <w:rFonts w:eastAsia="Calibri" w:cs="Times New Roman"/>
+            <w:noProof/>
+            <w:webHidden/>
+            <w:color w:val="000000" w:themeColor="text1"/>
+          </w:rPr>
+          <w:instrText xml:space="preserve"> PAGEREF _Toc200036077 \h </w:instrText>
+        </w:r>
+        <w:r>
+          <w:rPr>
+            <w:rFonts w:eastAsia="Calibri" w:cs="Times New Roman"/>
+            <w:noProof/>
+            <w:webHidden/>
+            <w:color w:val="000000" w:themeColor="text1"/>
+          </w:rPr>
+        </w:r>
+        <w:r>
+          <w:rPr>
+            <w:rFonts w:eastAsia="Calibri" w:cs="Times New Roman"/>
+            <w:noProof/>
+            <w:webHidden/>
+            <w:color w:val="000000" w:themeColor="text1"/>
+          </w:rPr>
+          <w:fldChar w:fldCharType="separate"/>
+        </w:r>
+        <w:r>
+          <w:rPr>
+            <w:rFonts w:eastAsia="Calibri" w:cs="Times New Roman"/>
+            <w:noProof/>
+            <w:webHidden/>
+            <w:color w:val="000000" w:themeColor="text1"/>
+          </w:rPr>
+          <w:t>118</w:t>
+        </w:r>
+        <w:r>
+          <w:rPr>
+            <w:rFonts w:eastAsia="Calibri" w:cs="Times New Roman"/>
+            <w:noProof/>
+            <w:webHidden/>
+            <w:color w:val="000000" w:themeColor="text1"/>
+          </w:rPr>
+          <w:fldChar w:fldCharType="end"/>
+        </w:r>
+      </w:hyperlink>
+    </w:p>
+    <w:p>
+      <w:pPr>
+        <w:tabs>
+          <w:tab w:val="right" w:leader="dot" w:pos="9061"/>
+        </w:tabs>
+        <w:spacing w:after="100"/>
+        <w:ind w:left="260" w:firstLine="0"/>
+        <w:jc w:val="left"/>
+        <w:rPr>
+          <w:rFonts w:ascii="Calibri" w:eastAsia="DengXian" w:hAnsi="Calibri" w:cs="Times New Roman"/>
+          <w:noProof/>
+          <w:color w:val="000000" w:themeColor="text1"/>
+          <w:kern w:val="2"/>
+          <w:sz w:val="24"/>
+          <w:szCs w:val="24"/>
+          <w:lang w:eastAsia="ko-KR"/>
+          <w14:ligatures w14:val="standardContextual"/>
+        </w:rPr>
+      </w:pPr>
+      <w:hyperlink w:anchor="_Toc200036078" w:history="1">
+        <w:r>
+          <w:rPr>
+            <w:rFonts w:eastAsia="Calibri" w:cs="Times New Roman"/>
+            <w:noProof/>
+            <w:color w:val="000000" w:themeColor="text1"/>
+            <w:u w:val="single"/>
+          </w:rPr>
+          <w:t>5.1. Thảo luận</w:t>
+        </w:r>
+        <w:r>
+          <w:rPr>
+            <w:rFonts w:eastAsia="Calibri" w:cs="Times New Roman"/>
+            <w:noProof/>
+            <w:webHidden/>
+            <w:color w:val="000000" w:themeColor="text1"/>
+          </w:rPr>
+          <w:tab/>
+        </w:r>
+        <w:r>
+          <w:rPr>
+            <w:rFonts w:eastAsia="Calibri" w:cs="Times New Roman"/>
+            <w:noProof/>
+            <w:webHidden/>
+            <w:color w:val="000000" w:themeColor="text1"/>
+          </w:rPr>
+          <w:fldChar w:fldCharType="begin"/>
+        </w:r>
+        <w:r>
+          <w:rPr>
+            <w:rFonts w:eastAsia="Calibri" w:cs="Times New Roman"/>
+            <w:noProof/>
+            <w:webHidden/>
+            <w:color w:val="000000" w:themeColor="text1"/>
+          </w:rPr>
+          <w:instrText xml:space="preserve"> PAGEREF _Toc200036078 \h </w:instrText>
+        </w:r>
+        <w:r>
+          <w:rPr>
+            <w:rFonts w:eastAsia="Calibri" w:cs="Times New Roman"/>
+            <w:noProof/>
+            <w:webHidden/>
+            <w:color w:val="000000" w:themeColor="text1"/>
+          </w:rPr>
+        </w:r>
+        <w:r>
+          <w:rPr>
+            <w:rFonts w:eastAsia="Calibri" w:cs="Times New Roman"/>
+            <w:noProof/>
+            <w:webHidden/>
+            <w:color w:val="000000" w:themeColor="text1"/>
+          </w:rPr>
+          <w:fldChar w:fldCharType="separate"/>
+        </w:r>
+        <w:r>
+          <w:rPr>
+            <w:rFonts w:eastAsia="Calibri" w:cs="Times New Roman"/>
+            <w:noProof/>
+            <w:webHidden/>
+            <w:color w:val="000000" w:themeColor="text1"/>
+          </w:rPr>
+          <w:t>118</w:t>
+        </w:r>
+        <w:r>
+          <w:rPr>
+            <w:rFonts w:eastAsia="Calibri" w:cs="Times New Roman"/>
+            <w:noProof/>
+            <w:webHidden/>
+            <w:color w:val="000000" w:themeColor="text1"/>
+          </w:rPr>
+          <w:fldChar w:fldCharType="end"/>
+        </w:r>
+      </w:hyperlink>
+    </w:p>
+    <w:p>
+      <w:pPr>
+        <w:tabs>
+          <w:tab w:val="right" w:leader="dot" w:pos="9061"/>
+        </w:tabs>
+        <w:spacing w:after="100"/>
+        <w:ind w:left="260" w:firstLine="0"/>
+        <w:jc w:val="left"/>
+        <w:rPr>
+          <w:rFonts w:ascii="Calibri" w:eastAsia="DengXian" w:hAnsi="Calibri" w:cs="Times New Roman"/>
+          <w:noProof/>
+          <w:color w:val="000000" w:themeColor="text1"/>
+          <w:kern w:val="2"/>
+          <w:sz w:val="24"/>
+          <w:szCs w:val="24"/>
+          <w:lang w:eastAsia="ko-KR"/>
+          <w14:ligatures w14:val="standardContextual"/>
+        </w:rPr>
+      </w:pPr>
+      <w:hyperlink w:anchor="_Toc200036082" w:history="1">
+        <w:r>
+          <w:rPr>
+            <w:rFonts w:eastAsia="Calibri" w:cs="Times New Roman"/>
+            <w:noProof/>
+            <w:color w:val="000000" w:themeColor="text1"/>
+            <w:u w:val="single"/>
+          </w:rPr>
+          <w:t>5.2. Kết luận</w:t>
+        </w:r>
+        <w:r>
+          <w:rPr>
+            <w:rFonts w:eastAsia="Calibri" w:cs="Times New Roman"/>
+            <w:noProof/>
+            <w:webHidden/>
+            <w:color w:val="000000" w:themeColor="text1"/>
+          </w:rPr>
+          <w:tab/>
+        </w:r>
+        <w:r>
+          <w:rPr>
+            <w:rFonts w:eastAsia="Calibri" w:cs="Times New Roman"/>
+            <w:noProof/>
+            <w:webHidden/>
+            <w:color w:val="000000" w:themeColor="text1"/>
+          </w:rPr>
+          <w:fldChar w:fldCharType="begin"/>
+        </w:r>
+        <w:r>
+          <w:rPr>
+            <w:rFonts w:eastAsia="Calibri" w:cs="Times New Roman"/>
+            <w:noProof/>
+            <w:webHidden/>
+            <w:color w:val="000000" w:themeColor="text1"/>
+          </w:rPr>
+          <w:instrText xml:space="preserve"> PAGEREF _Toc200036082 \h </w:instrText>
+        </w:r>
+        <w:r>
+          <w:rPr>
+            <w:rFonts w:eastAsia="Calibri" w:cs="Times New Roman"/>
+            <w:noProof/>
+            <w:webHidden/>
+            <w:color w:val="000000" w:themeColor="text1"/>
+          </w:rPr>
+        </w:r>
+        <w:r>
+          <w:rPr>
+            <w:rFonts w:eastAsia="Calibri" w:cs="Times New Roman"/>
+            <w:noProof/>
+            <w:webHidden/>
+            <w:color w:val="000000" w:themeColor="text1"/>
+          </w:rPr>
+          <w:fldChar w:fldCharType="separate"/>
+        </w:r>
+        <w:r>
+          <w:rPr>
+            <w:rFonts w:eastAsia="Calibri" w:cs="Times New Roman"/>
+            <w:noProof/>
+            <w:webHidden/>
+            <w:color w:val="000000" w:themeColor="text1"/>
+          </w:rPr>
+          <w:t>119</w:t>
+        </w:r>
+        <w:r>
+          <w:rPr>
+            <w:rFonts w:eastAsia="Calibri" w:cs="Times New Roman"/>
+            <w:noProof/>
+            <w:webHidden/>
+            <w:color w:val="000000" w:themeColor="text1"/>
+          </w:rPr>
+          <w:fldChar w:fldCharType="end"/>
+        </w:r>
+      </w:hyperlink>
+    </w:p>
+    <w:p>
+      <w:pPr>
+        <w:tabs>
+          <w:tab w:val="right" w:leader="dot" w:pos="9061"/>
+        </w:tabs>
+        <w:spacing w:after="100"/>
+        <w:ind w:left="260" w:firstLine="0"/>
+        <w:jc w:val="left"/>
+        <w:rPr>
+          <w:rFonts w:ascii="Calibri" w:eastAsia="DengXian" w:hAnsi="Calibri" w:cs="Times New Roman"/>
+          <w:noProof/>
+          <w:color w:val="000000" w:themeColor="text1"/>
+          <w:kern w:val="2"/>
+          <w:sz w:val="24"/>
+          <w:szCs w:val="24"/>
+          <w:lang w:eastAsia="ko-KR"/>
+          <w14:ligatures w14:val="standardContextual"/>
+        </w:rPr>
+      </w:pPr>
+      <w:hyperlink w:anchor="_Toc200036083" w:history="1">
+        <w:r>
+          <w:rPr>
+            <w:rFonts w:eastAsia="Calibri" w:cs="Times New Roman"/>
+            <w:noProof/>
+            <w:color w:val="000000" w:themeColor="text1"/>
+            <w:u w:val="single"/>
+          </w:rPr>
+          <w:t>5.3. Hạn chế của nghiên cứu</w:t>
+        </w:r>
+        <w:r>
+          <w:rPr>
+            <w:rFonts w:eastAsia="Calibri" w:cs="Times New Roman"/>
+            <w:noProof/>
+            <w:webHidden/>
+            <w:color w:val="000000" w:themeColor="text1"/>
+          </w:rPr>
+          <w:tab/>
+        </w:r>
+        <w:r>
+          <w:rPr>
+            <w:rFonts w:eastAsia="Calibri" w:cs="Times New Roman"/>
+            <w:noProof/>
+            <w:webHidden/>
+            <w:color w:val="000000" w:themeColor="text1"/>
+          </w:rPr>
+          <w:fldChar w:fldCharType="begin"/>
+        </w:r>
+        <w:r>
+          <w:rPr>
+            <w:rFonts w:eastAsia="Calibri" w:cs="Times New Roman"/>
+            <w:noProof/>
+            <w:webHidden/>
+            <w:color w:val="000000" w:themeColor="text1"/>
+          </w:rPr>
+          <w:instrText xml:space="preserve"> PAGEREF _Toc200036083 \h </w:instrText>
+        </w:r>
+        <w:r>
+          <w:rPr>
+            <w:rFonts w:eastAsia="Calibri" w:cs="Times New Roman"/>
+            <w:noProof/>
+            <w:webHidden/>
+            <w:color w:val="000000" w:themeColor="text1"/>
+          </w:rPr>
+        </w:r>
+        <w:r>
+          <w:rPr>
+            <w:rFonts w:eastAsia="Calibri" w:cs="Times New Roman"/>
+            <w:noProof/>
+            <w:webHidden/>
+            <w:color w:val="000000" w:themeColor="text1"/>
+          </w:rPr>
+          <w:fldChar w:fldCharType="separate"/>
+        </w:r>
+        <w:r>
+          <w:rPr>
+            <w:rFonts w:eastAsia="Calibri" w:cs="Times New Roman"/>
+            <w:noProof/>
+            <w:webHidden/>
+            <w:color w:val="000000" w:themeColor="text1"/>
+          </w:rPr>
+          <w:t>120</w:t>
+        </w:r>
+        <w:r>
+          <w:rPr>
+            <w:rFonts w:eastAsia="Calibri" w:cs="Times New Roman"/>
+            <w:noProof/>
+            <w:webHidden/>
+            <w:color w:val="000000" w:themeColor="text1"/>
+          </w:rPr>
+          <w:fldChar w:fldCharType="end"/>
+        </w:r>
+      </w:hyperlink>
+    </w:p>
+    <w:p>
+      <w:pPr>
+        <w:tabs>
+          <w:tab w:val="right" w:leader="dot" w:pos="9061"/>
+        </w:tabs>
+        <w:spacing w:after="100"/>
+        <w:ind w:left="260" w:firstLine="0"/>
+        <w:jc w:val="left"/>
+        <w:rPr>
+          <w:rFonts w:ascii="Calibri" w:eastAsia="DengXian" w:hAnsi="Calibri" w:cs="Times New Roman"/>
+          <w:noProof/>
+          <w:color w:val="000000" w:themeColor="text1"/>
+          <w:kern w:val="2"/>
+          <w:sz w:val="24"/>
+          <w:szCs w:val="24"/>
+          <w:lang w:eastAsia="ko-KR"/>
+          <w14:ligatures w14:val="standardContextual"/>
+        </w:rPr>
+      </w:pPr>
+      <w:hyperlink w:anchor="_Toc200036084" w:history="1">
+        <w:r>
+          <w:rPr>
+            <w:rFonts w:eastAsia="Calibri" w:cs="Times New Roman"/>
+            <w:noProof/>
+            <w:color w:val="000000" w:themeColor="text1"/>
+            <w:u w:val="single"/>
+          </w:rPr>
+          <w:t>5.4. Hướng phát triển tương lai</w:t>
+        </w:r>
+        <w:r>
+          <w:rPr>
+            <w:rFonts w:eastAsia="Calibri" w:cs="Times New Roman"/>
+            <w:noProof/>
+            <w:webHidden/>
+            <w:color w:val="000000" w:themeColor="text1"/>
+          </w:rPr>
+          <w:tab/>
+        </w:r>
+        <w:r>
+          <w:rPr>
+            <w:rFonts w:eastAsia="Calibri" w:cs="Times New Roman"/>
+            <w:noProof/>
+            <w:webHidden/>
+            <w:color w:val="000000" w:themeColor="text1"/>
+          </w:rPr>
+          <w:fldChar w:fldCharType="begin"/>
+        </w:r>
+        <w:r>
+          <w:rPr>
+            <w:rFonts w:eastAsia="Calibri" w:cs="Times New Roman"/>
+            <w:noProof/>
+            <w:webHidden/>
+            <w:color w:val="000000" w:themeColor="text1"/>
+          </w:rPr>
+          <w:instrText xml:space="preserve"> PAGEREF _Toc200036084 \h </w:instrText>
+        </w:r>
+        <w:r>
+          <w:rPr>
+            <w:rFonts w:eastAsia="Calibri" w:cs="Times New Roman"/>
+            <w:noProof/>
+            <w:webHidden/>
+            <w:color w:val="000000" w:themeColor="text1"/>
+          </w:rPr>
+        </w:r>
+        <w:r>
+          <w:rPr>
+            <w:rFonts w:eastAsia="Calibri" w:cs="Times New Roman"/>
+            <w:noProof/>
+            <w:webHidden/>
+            <w:color w:val="000000" w:themeColor="text1"/>
+          </w:rPr>
+          <w:fldChar w:fldCharType="separate"/>
+        </w:r>
+        <w:r>
+          <w:rPr>
+            <w:rFonts w:eastAsia="Calibri" w:cs="Times New Roman"/>
+            <w:noProof/>
+            <w:webHidden/>
+            <w:color w:val="000000" w:themeColor="text1"/>
+          </w:rPr>
+          <w:t>120</w:t>
+        </w:r>
+        <w:r>
+          <w:rPr>
+            <w:rFonts w:eastAsia="Calibri" w:cs="Times New Roman"/>
+            <w:noProof/>
+            <w:webHidden/>
+            <w:color w:val="000000" w:themeColor="text1"/>
+          </w:rPr>
+          <w:fldChar w:fldCharType="end"/>
+        </w:r>
+      </w:hyperlink>
+    </w:p>
+    <w:p>
+      <w:pPr>
+        <w:tabs>
+          <w:tab w:val="right" w:leader="dot" w:pos="9061"/>
+        </w:tabs>
+        <w:spacing w:after="100"/>
+        <w:ind w:firstLine="0"/>
+        <w:jc w:val="left"/>
+        <w:rPr>
+          <w:rFonts w:eastAsia="Calibri" w:cs="Times New Roman"/>
+          <w:noProof/>
+          <w:color w:val="000000" w:themeColor="text1"/>
+          <w:u w:val="single"/>
+        </w:rPr>
+      </w:pPr>
+      <w:hyperlink w:anchor="_Toc200036089" w:history="1">
+        <w:r>
+          <w:rPr>
+            <w:rFonts w:eastAsia="Calibri" w:cs="Times New Roman"/>
+            <w:noProof/>
+            <w:color w:val="000000" w:themeColor="text1"/>
+            <w:u w:val="single"/>
+          </w:rPr>
+          <w:t>DANH MỤC TÀI LIỆU THAM KHẢO</w:t>
+        </w:r>
+        <w:r>
+          <w:rPr>
+            <w:rFonts w:eastAsia="Calibri" w:cs="Times New Roman"/>
+            <w:noProof/>
+            <w:webHidden/>
+            <w:color w:val="000000" w:themeColor="text1"/>
+            <w:u w:val="single"/>
+          </w:rPr>
+          <w:tab/>
+        </w:r>
+        <w:r>
+          <w:rPr>
+            <w:rFonts w:eastAsia="Calibri" w:cs="Times New Roman"/>
+            <w:noProof/>
+            <w:webHidden/>
+            <w:color w:val="000000" w:themeColor="text1"/>
+            <w:u w:val="single"/>
+          </w:rPr>
+          <w:fldChar w:fldCharType="begin"/>
+        </w:r>
+        <w:r>
+          <w:rPr>
+            <w:rFonts w:eastAsia="Calibri" w:cs="Times New Roman"/>
+            <w:noProof/>
+            <w:webHidden/>
+            <w:color w:val="000000" w:themeColor="text1"/>
+            <w:u w:val="single"/>
+          </w:rPr>
+          <w:instrText xml:space="preserve"> PAGEREF _Toc200036089 \h </w:instrText>
+        </w:r>
+        <w:r>
+          <w:rPr>
+            <w:rFonts w:eastAsia="Calibri" w:cs="Times New Roman"/>
+            <w:noProof/>
+            <w:webHidden/>
+            <w:color w:val="000000" w:themeColor="text1"/>
+            <w:u w:val="single"/>
+          </w:rPr>
+        </w:r>
+        <w:r>
+          <w:rPr>
+            <w:rFonts w:eastAsia="Calibri" w:cs="Times New Roman"/>
+            <w:noProof/>
+            <w:webHidden/>
+            <w:color w:val="000000" w:themeColor="text1"/>
+            <w:u w:val="single"/>
+          </w:rPr>
+          <w:fldChar w:fldCharType="separate"/>
+        </w:r>
+        <w:r>
+          <w:rPr>
+            <w:rFonts w:eastAsia="Calibri" w:cs="Times New Roman"/>
+            <w:noProof/>
+            <w:webHidden/>
+            <w:color w:val="000000" w:themeColor="text1"/>
+            <w:u w:val="single"/>
+          </w:rPr>
+          <w:t>122</w:t>
+        </w:r>
+        <w:r>
+          <w:rPr>
+            <w:rFonts w:eastAsia="Calibri" w:cs="Times New Roman"/>
+            <w:noProof/>
+            <w:webHidden/>
+            <w:color w:val="000000" w:themeColor="text1"/>
+            <w:u w:val="single"/>
+          </w:rPr>
+          <w:fldChar w:fldCharType="end"/>
+        </w:r>
+      </w:hyperlink>
     </w:p>
     <w:p>
       <w:pPr>
@@ -10966,8 +12309,7 @@
     </w:p>
     <w:p>
       <w:pPr>
-        <w:ind w:firstLine="284"/>
-        <w:jc w:val="center"/>
+        <w:ind w:firstLine="0"/>
         <w:rPr>
           <w:b/>
           <w:bCs/>
@@ -10977,83 +12319,7 @@
     </w:p>
     <w:p>
       <w:pPr>
-        <w:ind w:firstLine="284"/>
-        <w:jc w:val="center"/>
-        <w:rPr>
-          <w:b/>
-          <w:bCs/>
-          <w:szCs w:val="26"/>
-        </w:rPr>
-      </w:pPr>
-    </w:p>
-    <w:p>
-      <w:pPr>
-        <w:ind w:firstLine="284"/>
-        <w:jc w:val="center"/>
-        <w:rPr>
-          <w:b/>
-          <w:bCs/>
-          <w:szCs w:val="26"/>
-        </w:rPr>
-      </w:pPr>
-    </w:p>
-    <w:p>
-      <w:pPr>
-        <w:ind w:firstLine="284"/>
-        <w:jc w:val="center"/>
-        <w:rPr>
-          <w:b/>
-          <w:bCs/>
-          <w:szCs w:val="26"/>
-        </w:rPr>
-      </w:pPr>
-    </w:p>
-    <w:p>
-      <w:pPr>
-        <w:ind w:firstLine="284"/>
-        <w:jc w:val="center"/>
-        <w:rPr>
-          <w:b/>
-          <w:bCs/>
-          <w:szCs w:val="26"/>
-        </w:rPr>
-      </w:pPr>
-    </w:p>
-    <w:p>
-      <w:pPr>
         <w:ind w:firstLine="0"/>
-        <w:rPr>
-          <w:b/>
-          <w:bCs/>
-          <w:szCs w:val="26"/>
-        </w:rPr>
-      </w:pPr>
-    </w:p>
-    <w:p>
-      <w:pPr>
-        <w:ind w:firstLine="284"/>
-        <w:jc w:val="center"/>
-        <w:rPr>
-          <w:b/>
-          <w:bCs/>
-          <w:szCs w:val="26"/>
-        </w:rPr>
-      </w:pPr>
-    </w:p>
-    <w:p>
-      <w:pPr>
-        <w:ind w:firstLine="284"/>
-        <w:jc w:val="center"/>
-        <w:rPr>
-          <w:b/>
-          <w:bCs/>
-          <w:szCs w:val="26"/>
-        </w:rPr>
-      </w:pPr>
-    </w:p>
-    <w:p>
-      <w:pPr>
-        <w:ind w:firstLine="284"/>
         <w:jc w:val="center"/>
         <w:rPr>
           <w:b/>
@@ -11062,20 +12328,56 @@
           <w:szCs w:val="32"/>
         </w:rPr>
       </w:pPr>
-      <w:r>
+    </w:p>
+    <w:p>
+      <w:pPr>
+        <w:ind w:firstLine="0"/>
+        <w:jc w:val="center"/>
         <w:rPr>
           <w:b/>
           <w:bCs/>
           <w:sz w:val="32"/>
           <w:szCs w:val="32"/>
         </w:rPr>
+      </w:pPr>
+    </w:p>
+    <w:p>
+      <w:pPr>
+        <w:ind w:firstLine="0"/>
+        <w:jc w:val="center"/>
+        <w:rPr>
+          <w:b/>
+          <w:bCs/>
+          <w:sz w:val="32"/>
+          <w:szCs w:val="32"/>
+        </w:rPr>
+      </w:pPr>
+    </w:p>
+    <w:p>
+      <w:pPr>
+        <w:ind w:firstLine="0"/>
+        <w:jc w:val="center"/>
+        <w:rPr>
+          <w:b/>
+          <w:bCs/>
+          <w:sz w:val="32"/>
+          <w:szCs w:val="32"/>
+        </w:rPr>
+      </w:pPr>
+      <w:r>
+        <w:rPr>
+          <w:b/>
+          <w:bCs/>
+          <w:sz w:val="32"/>
+          <w:szCs w:val="32"/>
+        </w:rPr>
         <w:lastRenderedPageBreak/>
         <w:t>CHƯƠNG 1: TỔNG QUAN ĐỀ TÀI VÀ CƠ SỞ LÝ THUYẾT</w:t>
       </w:r>
     </w:p>
     <w:p>
       <w:pPr>
-        <w:pStyle w:val="ListParagraph"/>
+        <w:pStyle w:val="oancuaDanhsach"/>
         <w:numPr>
           <w:ilvl w:val="1"/>
           <w:numId w:val="3"/>
@@ -11188,7 +12490,7 @@
     </w:p>
     <w:p>
       <w:pPr>
-        <w:pStyle w:val="NormalWeb"/>
+        <w:pStyle w:val="ThngthngWeb"/>
         <w:tabs>
           <w:tab w:val="left" w:pos="2868"/>
         </w:tabs>
@@ -11221,7 +12523,7 @@
     </w:p>
     <w:p>
       <w:pPr>
-        <w:pStyle w:val="NormalWeb"/>
+        <w:pStyle w:val="ThngthngWeb"/>
         <w:tabs>
           <w:tab w:val="left" w:pos="2868"/>
         </w:tabs>
@@ -11241,7 +12543,7 @@
     </w:p>
     <w:p>
       <w:pPr>
-        <w:pStyle w:val="NormalWeb"/>
+        <w:pStyle w:val="ThngthngWeb"/>
         <w:tabs>
           <w:tab w:val="left" w:pos="2868"/>
         </w:tabs>
@@ -11261,7 +12563,7 @@
     </w:p>
     <w:p>
       <w:pPr>
-        <w:pStyle w:val="NormalWeb"/>
+        <w:pStyle w:val="ThngthngWeb"/>
         <w:tabs>
           <w:tab w:val="left" w:pos="2868"/>
         </w:tabs>
@@ -11281,7 +12583,7 @@
     </w:p>
     <w:p>
       <w:pPr>
-        <w:pStyle w:val="NormalWeb"/>
+        <w:pStyle w:val="ThngthngWeb"/>
         <w:tabs>
           <w:tab w:val="left" w:pos="2868"/>
         </w:tabs>
@@ -11301,7 +12603,7 @@
     </w:p>
     <w:p>
       <w:pPr>
-        <w:pStyle w:val="NormalWeb"/>
+        <w:pStyle w:val="ThngthngWeb"/>
         <w:numPr>
           <w:ilvl w:val="0"/>
           <w:numId w:val="4"/>
@@ -11325,7 +12627,7 @@
     </w:p>
     <w:p>
       <w:pPr>
-        <w:pStyle w:val="NormalWeb"/>
+        <w:pStyle w:val="ThngthngWeb"/>
         <w:numPr>
           <w:ilvl w:val="0"/>
           <w:numId w:val="4"/>
@@ -11349,7 +12651,7 @@
     </w:p>
     <w:p>
       <w:pPr>
-        <w:pStyle w:val="NormalWeb"/>
+        <w:pStyle w:val="ThngthngWeb"/>
         <w:numPr>
           <w:ilvl w:val="0"/>
           <w:numId w:val="4"/>
@@ -11373,7 +12675,7 @@
     </w:p>
     <w:p>
       <w:pPr>
-        <w:pStyle w:val="NormalWeb"/>
+        <w:pStyle w:val="ThngthngWeb"/>
         <w:numPr>
           <w:ilvl w:val="0"/>
           <w:numId w:val="4"/>
@@ -11397,7 +12699,7 @@
     </w:p>
     <w:p>
       <w:pPr>
-        <w:pStyle w:val="NormalWeb"/>
+        <w:pStyle w:val="ThngthngWeb"/>
         <w:tabs>
           <w:tab w:val="left" w:pos="2868"/>
         </w:tabs>
@@ -11411,7 +12713,7 @@
     </w:p>
     <w:p>
       <w:pPr>
-        <w:pStyle w:val="NormalWeb"/>
+        <w:pStyle w:val="ThngthngWeb"/>
         <w:tabs>
           <w:tab w:val="left" w:pos="2868"/>
         </w:tabs>
@@ -11432,7 +12734,7 @@
     </w:p>
     <w:p>
       <w:pPr>
-        <w:pStyle w:val="NormalWeb"/>
+        <w:pStyle w:val="ThngthngWeb"/>
         <w:tabs>
           <w:tab w:val="left" w:pos="2868"/>
         </w:tabs>
@@ -11452,7 +12754,7 @@
     </w:p>
     <w:p>
       <w:pPr>
-        <w:pStyle w:val="NormalWeb"/>
+        <w:pStyle w:val="ThngthngWeb"/>
         <w:tabs>
           <w:tab w:val="left" w:pos="2868"/>
         </w:tabs>
@@ -11472,7 +12774,7 @@
     </w:p>
     <w:p>
       <w:pPr>
-        <w:pStyle w:val="NormalWeb"/>
+        <w:pStyle w:val="ThngthngWeb"/>
         <w:numPr>
           <w:ilvl w:val="0"/>
           <w:numId w:val="5"/>
@@ -11496,7 +12798,7 @@
     </w:p>
     <w:p>
       <w:pPr>
-        <w:pStyle w:val="NormalWeb"/>
+        <w:pStyle w:val="ThngthngWeb"/>
         <w:tabs>
           <w:tab w:val="left" w:pos="2868"/>
         </w:tabs>
@@ -11516,7 +12818,7 @@
     </w:p>
     <w:p>
       <w:pPr>
-        <w:pStyle w:val="NormalWeb"/>
+        <w:pStyle w:val="ThngthngWeb"/>
         <w:numPr>
           <w:ilvl w:val="0"/>
           <w:numId w:val="5"/>
@@ -11540,7 +12842,7 @@
     </w:p>
     <w:p>
       <w:pPr>
-        <w:pStyle w:val="NormalWeb"/>
+        <w:pStyle w:val="ThngthngWeb"/>
         <w:tabs>
           <w:tab w:val="left" w:pos="2868"/>
         </w:tabs>
@@ -11560,7 +12862,7 @@
     </w:p>
     <w:p>
       <w:pPr>
-        <w:pStyle w:val="NormalWeb"/>
+        <w:pStyle w:val="ThngthngWeb"/>
         <w:tabs>
           <w:tab w:val="left" w:pos="2868"/>
         </w:tabs>
@@ -11580,7 +12882,7 @@
     </w:p>
     <w:p>
       <w:pPr>
-        <w:pStyle w:val="NormalWeb"/>
+        <w:pStyle w:val="ThngthngWeb"/>
         <w:numPr>
           <w:ilvl w:val="0"/>
           <w:numId w:val="6"/>
@@ -11604,7 +12906,7 @@
     </w:p>
     <w:p>
       <w:pPr>
-        <w:pStyle w:val="NormalWeb"/>
+        <w:pStyle w:val="ThngthngWeb"/>
         <w:numPr>
           <w:ilvl w:val="0"/>
           <w:numId w:val="6"/>
@@ -11628,7 +12930,7 @@
     </w:p>
     <w:p>
       <w:pPr>
-        <w:pStyle w:val="NormalWeb"/>
+        <w:pStyle w:val="ThngthngWeb"/>
         <w:tabs>
           <w:tab w:val="left" w:pos="2868"/>
         </w:tabs>
@@ -11648,7 +12950,7 @@
     </w:p>
     <w:p>
       <w:pPr>
-        <w:pStyle w:val="NormalWeb"/>
+        <w:pStyle w:val="ThngthngWeb"/>
         <w:numPr>
           <w:ilvl w:val="0"/>
           <w:numId w:val="7"/>
@@ -11672,7 +12974,7 @@
     </w:p>
     <w:p>
       <w:pPr>
-        <w:pStyle w:val="NormalWeb"/>
+        <w:pStyle w:val="ThngthngWeb"/>
         <w:tabs>
           <w:tab w:val="left" w:pos="2868"/>
         </w:tabs>
@@ -11692,7 +12994,7 @@
     </w:p>
     <w:p>
       <w:pPr>
-        <w:pStyle w:val="NormalWeb"/>
+        <w:pStyle w:val="ThngthngWeb"/>
         <w:tabs>
           <w:tab w:val="left" w:pos="2868"/>
         </w:tabs>
@@ -11712,7 +13014,7 @@
     </w:p>
     <w:p>
       <w:pPr>
-        <w:pStyle w:val="NormalWeb"/>
+        <w:pStyle w:val="ThngthngWeb"/>
         <w:tabs>
           <w:tab w:val="left" w:pos="2868"/>
         </w:tabs>
@@ -11732,7 +13034,7 @@
     </w:p>
     <w:p>
       <w:pPr>
-        <w:pStyle w:val="NormalWeb"/>
+        <w:pStyle w:val="ThngthngWeb"/>
         <w:tabs>
           <w:tab w:val="left" w:pos="2868"/>
         </w:tabs>
@@ -11752,7 +13054,7 @@
     </w:p>
     <w:p>
       <w:pPr>
-        <w:pStyle w:val="NormalWeb"/>
+        <w:pStyle w:val="ThngthngWeb"/>
         <w:tabs>
           <w:tab w:val="left" w:pos="2868"/>
         </w:tabs>
@@ -11835,6 +13137,21 @@
         </w:rPr>
         <w:t>Dataset được sử dụng trong đề tài gồm khoảng 44.898 mẫu tin tức, được gán nhãn "Fake" và "Real". Dữ liệu bao gồm các trường như tiêu đề, nội dung và nhãn phân loại.</w:t>
       </w:r>
+      <w:r>
+        <w:rPr>
+          <w:szCs w:val="26"/>
+        </w:rPr>
+        <w:t xml:space="preserve"> Nguồn: </w:t>
+      </w:r>
+      <w:hyperlink r:id="rId9" w:history="1">
+        <w:r>
+          <w:rPr>
+            <w:rStyle w:val="Siuktni"/>
+            <w:szCs w:val="26"/>
+          </w:rPr>
+          <w:t>https://www.kaggle.com/datasets/clmentbisaillon/fake-and-real-news-dataset</w:t>
+        </w:r>
+      </w:hyperlink>
     </w:p>
     <w:p>
       <w:pPr>
@@ -11969,6 +13286,7 @@
       </w:pPr>
       <w:r>
         <w:rPr>
+          <w:noProof/>
           <w:szCs w:val="26"/>
         </w:rPr>
         <w:drawing>
@@ -11987,7 +13305,7 @@
                     <pic:cNvPicPr/>
                   </pic:nvPicPr>
                   <pic:blipFill>
-                    <a:blip r:embed="rId9"/>
+                    <a:blip r:embed="rId10"/>
                     <a:stretch>
                       <a:fillRect/>
                     </a:stretch>
@@ -12085,6 +13403,7 @@
         <w:rPr>
           <w:b/>
           <w:bCs/>
+          <w:noProof/>
           <w:szCs w:val="26"/>
         </w:rPr>
         <w:lastRenderedPageBreak/>
@@ -12104,7 +13423,7 @@
                     <pic:cNvPicPr/>
                   </pic:nvPicPr>
                   <pic:blipFill>
-                    <a:blip r:embed="rId10"/>
+                    <a:blip r:embed="rId11"/>
                     <a:stretch>
                       <a:fillRect/>
                     </a:stretch>
@@ -12134,6 +13453,7 @@
       </w:pPr>
       <w:r>
         <w:rPr>
+          <w:noProof/>
           <w:szCs w:val="26"/>
         </w:rPr>
         <w:drawing>
@@ -12152,7 +13472,7 @@
                     <pic:cNvPicPr/>
                   </pic:nvPicPr>
                   <pic:blipFill>
-                    <a:blip r:embed="rId11"/>
+                    <a:blip r:embed="rId12"/>
                     <a:stretch>
                       <a:fillRect/>
                     </a:stretch>
@@ -12585,9 +13905,10 @@
     </w:p>
     <w:tbl>
       <w:tblPr>
-        <w:tblStyle w:val="TableGrid"/>
+        <w:tblStyle w:val="LiBang"/>
+        <w:tblpPr w:leftFromText="180" w:rightFromText="180" w:vertAnchor="text" w:horzAnchor="margin" w:tblpXSpec="center" w:tblpY="47"/>
+        <w:tblOverlap w:val="never"/>
         <w:tblW w:w="0" w:type="auto"/>
-        <w:tblInd w:w="2333" w:type="dxa"/>
         <w:tblLook w:val="04A0" w:firstRow="1" w:lastRow="0" w:firstColumn="1" w:lastColumn="0" w:noHBand="0" w:noVBand="1"/>
       </w:tblPr>
       <w:tblGrid>
@@ -12602,6 +13923,7 @@
           </w:tcPr>
           <w:p>
             <w:pPr>
+              <w:jc w:val="left"/>
               <w:rPr>
                 <w:b/>
                 <w:bCs/>
@@ -12625,6 +13947,7 @@
           </w:tcPr>
           <w:p>
             <w:pPr>
+              <w:jc w:val="left"/>
               <w:rPr>
                 <w:b/>
                 <w:bCs/>
@@ -12650,6 +13973,7 @@
           </w:tcPr>
           <w:p>
             <w:pPr>
+              <w:jc w:val="left"/>
               <w:rPr>
                 <w:szCs w:val="26"/>
               </w:rPr>
@@ -12669,6 +13993,7 @@
           </w:tcPr>
           <w:p>
             <w:pPr>
+              <w:jc w:val="left"/>
               <w:rPr>
                 <w:szCs w:val="26"/>
               </w:rPr>
@@ -12690,6 +14015,7 @@
           </w:tcPr>
           <w:p>
             <w:pPr>
+              <w:jc w:val="left"/>
               <w:rPr>
                 <w:szCs w:val="26"/>
               </w:rPr>
@@ -12709,6 +14035,7 @@
           </w:tcPr>
           <w:p>
             <w:pPr>
+              <w:jc w:val="left"/>
               <w:rPr>
                 <w:szCs w:val="26"/>
               </w:rPr>
@@ -12730,6 +14057,7 @@
           </w:tcPr>
           <w:p>
             <w:pPr>
+              <w:jc w:val="left"/>
               <w:rPr>
                 <w:szCs w:val="26"/>
               </w:rPr>
@@ -12749,6 +14077,7 @@
           </w:tcPr>
           <w:p>
             <w:pPr>
+              <w:jc w:val="left"/>
               <w:rPr>
                 <w:szCs w:val="26"/>
               </w:rPr>
@@ -12757,7 +14086,19 @@
               <w:rPr>
                 <w:szCs w:val="26"/>
               </w:rPr>
-              <w:t>~95%</w:t>
+              <w:t>~9</w:t>
+            </w:r>
+            <w:r>
+              <w:rPr>
+                <w:szCs w:val="26"/>
+              </w:rPr>
+              <w:t>9.96</w:t>
+            </w:r>
+            <w:r>
+              <w:rPr>
+                <w:szCs w:val="26"/>
+              </w:rPr>
+              <w:t>%</w:t>
             </w:r>
           </w:p>
         </w:tc>
@@ -12773,11 +14114,101 @@
     </w:p>
     <w:p>
       <w:pPr>
+        <w:rPr>
+          <w:szCs w:val="26"/>
+        </w:rPr>
+      </w:pPr>
+    </w:p>
+    <w:p>
+      <w:pPr>
+        <w:rPr>
+          <w:szCs w:val="26"/>
+        </w:rPr>
+      </w:pPr>
+    </w:p>
+    <w:p>
+      <w:pPr>
         <w:jc w:val="left"/>
         <w:rPr>
           <w:szCs w:val="26"/>
         </w:rPr>
       </w:pPr>
+    </w:p>
+    <w:p>
+      <w:pPr>
+        <w:jc w:val="left"/>
+        <w:rPr>
+          <w:szCs w:val="26"/>
+        </w:rPr>
+      </w:pPr>
+      <w:r>
+        <w:rPr>
+          <w:szCs w:val="26"/>
+        </w:rPr>
+        <w:br w:type="textWrapping" w:clear="all"/>
+      </w:r>
+    </w:p>
+    <w:p>
+      <w:pPr>
+        <w:pStyle w:val="u1"/>
+      </w:pPr>
+      <w:r>
+        <w:rPr>
+          <w:noProof/>
+        </w:rPr>
+        <w:drawing>
+          <wp:inline distT="0" distB="0" distL="0" distR="0" wp14:anchorId="60B496D1" wp14:editId="51D9C173">
+            <wp:extent cx="5760085" cy="1834515"/>
+            <wp:effectExtent l="0" t="0" r="0" b="0"/>
+            <wp:docPr id="946874786" name="Hình ảnh 1"/>
+            <wp:cNvGraphicFramePr>
+              <a:graphicFrameLocks xmlns:a="http://schemas.openxmlformats.org/drawingml/2006/main" noChangeAspect="1"/>
+            </wp:cNvGraphicFramePr>
+            <a:graphic xmlns:a="http://schemas.openxmlformats.org/drawingml/2006/main">
+              <a:graphicData uri="http://schemas.openxmlformats.org/drawingml/2006/picture">
+                <pic:pic xmlns:pic="http://schemas.openxmlformats.org/drawingml/2006/picture">
+                  <pic:nvPicPr>
+                    <pic:cNvPr id="946874786" name=""/>
+                    <pic:cNvPicPr/>
+                  </pic:nvPicPr>
+                  <pic:blipFill>
+                    <a:blip r:embed="rId13"/>
+                    <a:stretch>
+                      <a:fillRect/>
+                    </a:stretch>
+                  </pic:blipFill>
+                  <pic:spPr>
+                    <a:xfrm>
+                      <a:off x="0" y="0"/>
+                      <a:ext cx="5760085" cy="1834515"/>
+                    </a:xfrm>
+                    <a:prstGeom prst="rect">
+                      <a:avLst/>
+                    </a:prstGeom>
+                  </pic:spPr>
+                </pic:pic>
+              </a:graphicData>
+            </a:graphic>
+          </wp:inline>
+        </w:drawing>
+      </w:r>
+    </w:p>
+    <w:p>
+      <w:pPr>
+        <w:jc w:val="left"/>
+        <w:rPr>
+          <w:szCs w:val="26"/>
+        </w:rPr>
+      </w:pPr>
+    </w:p>
+    <w:p>
+      <w:pPr>
+        <w:ind w:firstLine="0"/>
+        <w:jc w:val="left"/>
+        <w:rPr>
+          <w:szCs w:val="26"/>
+        </w:rPr>
+      </w:pPr>
       <w:r>
         <w:rPr>
           <w:szCs w:val="26"/>
@@ -12787,6 +14218,7 @@
     </w:p>
     <w:p>
       <w:pPr>
+        <w:ind w:firstLine="0"/>
         <w:jc w:val="left"/>
         <w:rPr>
           <w:szCs w:val="26"/>
@@ -12805,6 +14237,11 @@
           <w:ilvl w:val="0"/>
           <w:numId w:val="12"/>
         </w:numPr>
+        <w:tabs>
+          <w:tab w:val="clear" w:pos="720"/>
+          <w:tab w:val="num" w:pos="567"/>
+        </w:tabs>
+        <w:ind w:hanging="436"/>
         <w:jc w:val="left"/>
         <w:rPr>
           <w:szCs w:val="26"/>
@@ -12823,6 +14260,11 @@
           <w:ilvl w:val="0"/>
           <w:numId w:val="12"/>
         </w:numPr>
+        <w:tabs>
+          <w:tab w:val="clear" w:pos="720"/>
+          <w:tab w:val="num" w:pos="567"/>
+        </w:tabs>
+        <w:ind w:hanging="436"/>
         <w:jc w:val="left"/>
         <w:rPr>
           <w:szCs w:val="26"/>
@@ -12837,6 +14279,7 @@
     </w:p>
     <w:p>
       <w:pPr>
+        <w:ind w:firstLine="0"/>
         <w:jc w:val="left"/>
         <w:rPr>
           <w:szCs w:val="26"/>
@@ -12851,6 +14294,53 @@
     </w:p>
     <w:p>
       <w:pPr>
+        <w:pStyle w:val="KhngDncch"/>
+        <w:ind w:firstLine="0"/>
+      </w:pPr>
+      <w:r>
+        <w:rPr>
+          <w:noProof/>
+        </w:rPr>
+        <w:lastRenderedPageBreak/>
+        <w:drawing>
+          <wp:inline distT="0" distB="0" distL="0" distR="0" wp14:anchorId="117AD080" wp14:editId="74C6A844">
+            <wp:extent cx="5760085" cy="3230245"/>
+            <wp:effectExtent l="0" t="0" r="0" b="8255"/>
+            <wp:docPr id="1674399207" name="Hình ảnh 1"/>
+            <wp:cNvGraphicFramePr>
+              <a:graphicFrameLocks xmlns:a="http://schemas.openxmlformats.org/drawingml/2006/main" noChangeAspect="1"/>
+            </wp:cNvGraphicFramePr>
+            <a:graphic xmlns:a="http://schemas.openxmlformats.org/drawingml/2006/main">
+              <a:graphicData uri="http://schemas.openxmlformats.org/drawingml/2006/picture">
+                <pic:pic xmlns:pic="http://schemas.openxmlformats.org/drawingml/2006/picture">
+                  <pic:nvPicPr>
+                    <pic:cNvPr id="1674399207" name=""/>
+                    <pic:cNvPicPr/>
+                  </pic:nvPicPr>
+                  <pic:blipFill>
+                    <a:blip r:embed="rId14"/>
+                    <a:stretch>
+                      <a:fillRect/>
+                    </a:stretch>
+                  </pic:blipFill>
+                  <pic:spPr>
+                    <a:xfrm>
+                      <a:off x="0" y="0"/>
+                      <a:ext cx="5760085" cy="3230245"/>
+                    </a:xfrm>
+                    <a:prstGeom prst="rect">
+                      <a:avLst/>
+                    </a:prstGeom>
+                  </pic:spPr>
+                </pic:pic>
+              </a:graphicData>
+            </a:graphic>
+          </wp:inline>
+        </w:drawing>
+      </w:r>
+    </w:p>
+    <w:p>
+      <w:pPr>
         <w:jc w:val="center"/>
         <w:rPr>
           <w:szCs w:val="26"/>
@@ -12859,6 +14349,63 @@
     </w:p>
     <w:p>
       <w:pPr>
+        <w:tabs>
+          <w:tab w:val="left" w:pos="3924"/>
+        </w:tabs>
+        <w:rPr>
+          <w:szCs w:val="26"/>
+        </w:rPr>
+      </w:pPr>
+      <w:r>
+        <w:rPr>
+          <w:szCs w:val="26"/>
+        </w:rPr>
+        <w:tab/>
+      </w:r>
+      <w:r>
+        <w:rPr>
+          <w:noProof/>
+          <w:szCs w:val="26"/>
+        </w:rPr>
+        <w:drawing>
+          <wp:inline distT="0" distB="0" distL="0" distR="0" wp14:anchorId="463837B6" wp14:editId="4DBCB440">
+            <wp:extent cx="5760085" cy="3204845"/>
+            <wp:effectExtent l="0" t="0" r="0" b="0"/>
+            <wp:docPr id="277408462" name="Hình ảnh 1"/>
+            <wp:cNvGraphicFramePr>
+              <a:graphicFrameLocks xmlns:a="http://schemas.openxmlformats.org/drawingml/2006/main" noChangeAspect="1"/>
+            </wp:cNvGraphicFramePr>
+            <a:graphic xmlns:a="http://schemas.openxmlformats.org/drawingml/2006/main">
+              <a:graphicData uri="http://schemas.openxmlformats.org/drawingml/2006/picture">
+                <pic:pic xmlns:pic="http://schemas.openxmlformats.org/drawingml/2006/picture">
+                  <pic:nvPicPr>
+                    <pic:cNvPr id="277408462" name=""/>
+                    <pic:cNvPicPr/>
+                  </pic:nvPicPr>
+                  <pic:blipFill>
+                    <a:blip r:embed="rId15"/>
+                    <a:stretch>
+                      <a:fillRect/>
+                    </a:stretch>
+                  </pic:blipFill>
+                  <pic:spPr>
+                    <a:xfrm>
+                      <a:off x="0" y="0"/>
+                      <a:ext cx="5760085" cy="3204845"/>
+                    </a:xfrm>
+                    <a:prstGeom prst="rect">
+                      <a:avLst/>
+                    </a:prstGeom>
+                  </pic:spPr>
+                </pic:pic>
+              </a:graphicData>
+            </a:graphic>
+          </wp:inline>
+        </w:drawing>
+      </w:r>
+    </w:p>
+    <w:p>
+      <w:pPr>
         <w:jc w:val="center"/>
         <w:rPr>
           <w:szCs w:val="26"/>
@@ -12867,11 +14414,79 @@
     </w:p>
     <w:p>
       <w:pPr>
+        <w:tabs>
+          <w:tab w:val="left" w:pos="3828"/>
+        </w:tabs>
         <w:jc w:val="center"/>
         <w:rPr>
           <w:szCs w:val="26"/>
         </w:rPr>
       </w:pPr>
+      <w:r>
+        <w:rPr>
+          <w:szCs w:val="26"/>
+        </w:rPr>
+        <w:t>Learning Curve (Đường cong thể hiện quá trình học</w:t>
+      </w:r>
+      <w:r>
+        <w:rPr>
+          <w:szCs w:val="26"/>
+        </w:rPr>
+        <w:t xml:space="preserve"> của mô hình</w:t>
+      </w:r>
+      <w:r>
+        <w:rPr>
+          <w:szCs w:val="26"/>
+        </w:rPr>
+        <w:t>)</w:t>
+      </w:r>
+    </w:p>
+    <w:p>
+      <w:pPr>
+        <w:pStyle w:val="KhngDncch"/>
+        <w:ind w:firstLine="0"/>
+      </w:pPr>
+      <w:r>
+        <w:rPr>
+          <w:noProof/>
+        </w:rPr>
+        <w:lastRenderedPageBreak/>
+        <w:drawing>
+          <wp:inline distT="0" distB="0" distL="0" distR="0" wp14:anchorId="6039A678" wp14:editId="1F184844">
+            <wp:extent cx="5760085" cy="4537075"/>
+            <wp:effectExtent l="0" t="0" r="0" b="0"/>
+            <wp:docPr id="848529719" name="Hình ảnh 1"/>
+            <wp:cNvGraphicFramePr>
+              <a:graphicFrameLocks xmlns:a="http://schemas.openxmlformats.org/drawingml/2006/main" noChangeAspect="1"/>
+            </wp:cNvGraphicFramePr>
+            <a:graphic xmlns:a="http://schemas.openxmlformats.org/drawingml/2006/main">
+              <a:graphicData uri="http://schemas.openxmlformats.org/drawingml/2006/picture">
+                <pic:pic xmlns:pic="http://schemas.openxmlformats.org/drawingml/2006/picture">
+                  <pic:nvPicPr>
+                    <pic:cNvPr id="848529719" name=""/>
+                    <pic:cNvPicPr/>
+                  </pic:nvPicPr>
+                  <pic:blipFill>
+                    <a:blip r:embed="rId16"/>
+                    <a:stretch>
+                      <a:fillRect/>
+                    </a:stretch>
+                  </pic:blipFill>
+                  <pic:spPr>
+                    <a:xfrm>
+                      <a:off x="0" y="0"/>
+                      <a:ext cx="5760085" cy="4537075"/>
+                    </a:xfrm>
+                    <a:prstGeom prst="rect">
+                      <a:avLst/>
+                    </a:prstGeom>
+                  </pic:spPr>
+                </pic:pic>
+              </a:graphicData>
+            </a:graphic>
+          </wp:inline>
+        </w:drawing>
+      </w:r>
     </w:p>
     <w:p>
       <w:pPr>
@@ -12888,74 +14503,238 @@
           <w:szCs w:val="26"/>
         </w:rPr>
       </w:pPr>
-    </w:p>
-    <w:p>
-      <w:pPr>
+      <w:r>
+        <w:rPr>
+          <w:szCs w:val="26"/>
+        </w:rPr>
+        <w:t>Confusion Matrix (Ma trận nhầm lẫn)</w:t>
+      </w:r>
+    </w:p>
+    <w:p>
+      <w:pPr>
+        <w:ind w:firstLine="0"/>
+        <w:rPr>
+          <w:szCs w:val="26"/>
+        </w:rPr>
+      </w:pPr>
+    </w:p>
+    <w:p>
+      <w:pPr>
+        <w:ind w:firstLine="0"/>
+        <w:rPr>
+          <w:szCs w:val="26"/>
+        </w:rPr>
+      </w:pPr>
+      <w:r>
+        <w:rPr>
+          <w:szCs w:val="26"/>
+        </w:rPr>
+        <w:t>Triển khai bằng ứng dụng web Flask</w:t>
+      </w:r>
+    </w:p>
+    <w:p>
+      <w:pPr>
+        <w:ind w:firstLine="0"/>
+        <w:rPr>
+          <w:szCs w:val="26"/>
+        </w:rPr>
+      </w:pPr>
+      <w:r>
+        <w:rPr>
+          <w:szCs w:val="26"/>
+        </w:rPr>
+        <w:t>Trang dự đoán</w:t>
+      </w:r>
+    </w:p>
+    <w:p>
+      <w:pPr>
+        <w:tabs>
+          <w:tab w:val="left" w:pos="1704"/>
+        </w:tabs>
+        <w:ind w:firstLine="0"/>
+        <w:rPr>
+          <w:b/>
+          <w:bCs/>
+          <w:szCs w:val="26"/>
+        </w:rPr>
+      </w:pPr>
+      <w:r>
+        <w:rPr>
+          <w:b/>
+          <w:bCs/>
+          <w:noProof/>
+          <w:szCs w:val="26"/>
+        </w:rPr>
+        <w:lastRenderedPageBreak/>
+        <w:drawing>
+          <wp:inline distT="0" distB="0" distL="0" distR="0" wp14:anchorId="32DE2891" wp14:editId="27C4440C">
+            <wp:extent cx="5760085" cy="5228590"/>
+            <wp:effectExtent l="0" t="0" r="0" b="0"/>
+            <wp:docPr id="1057639137" name="Hình ảnh 1"/>
+            <wp:cNvGraphicFramePr>
+              <a:graphicFrameLocks xmlns:a="http://schemas.openxmlformats.org/drawingml/2006/main" noChangeAspect="1"/>
+            </wp:cNvGraphicFramePr>
+            <a:graphic xmlns:a="http://schemas.openxmlformats.org/drawingml/2006/main">
+              <a:graphicData uri="http://schemas.openxmlformats.org/drawingml/2006/picture">
+                <pic:pic xmlns:pic="http://schemas.openxmlformats.org/drawingml/2006/picture">
+                  <pic:nvPicPr>
+                    <pic:cNvPr id="1057639137" name=""/>
+                    <pic:cNvPicPr/>
+                  </pic:nvPicPr>
+                  <pic:blipFill>
+                    <a:blip r:embed="rId17"/>
+                    <a:stretch>
+                      <a:fillRect/>
+                    </a:stretch>
+                  </pic:blipFill>
+                  <pic:spPr>
+                    <a:xfrm>
+                      <a:off x="0" y="0"/>
+                      <a:ext cx="5760085" cy="5228590"/>
+                    </a:xfrm>
+                    <a:prstGeom prst="rect">
+                      <a:avLst/>
+                    </a:prstGeom>
+                  </pic:spPr>
+                </pic:pic>
+              </a:graphicData>
+            </a:graphic>
+          </wp:inline>
+        </w:drawing>
+      </w:r>
+    </w:p>
+    <w:p>
+      <w:pPr>
+        <w:rPr>
+          <w:b/>
+          <w:bCs/>
+          <w:szCs w:val="26"/>
+        </w:rPr>
+      </w:pPr>
+    </w:p>
+    <w:p>
+      <w:pPr>
+        <w:ind w:firstLine="0"/>
+        <w:rPr>
+          <w:szCs w:val="26"/>
+        </w:rPr>
+      </w:pPr>
+      <w:r>
+        <w:rPr>
+          <w:szCs w:val="26"/>
+        </w:rPr>
+        <w:t>Trang chủ</w:t>
+      </w:r>
+    </w:p>
+    <w:p>
+      <w:pPr>
+        <w:ind w:firstLine="0"/>
+        <w:rPr>
+          <w:szCs w:val="26"/>
+        </w:rPr>
+      </w:pPr>
+      <w:r>
+        <w:rPr>
+          <w:szCs w:val="26"/>
+        </w:rPr>
+        <w:t>Trang About</w:t>
+      </w:r>
+    </w:p>
+    <w:p>
+      <w:pPr>
+        <w:rPr>
+          <w:b/>
+          <w:bCs/>
+          <w:szCs w:val="26"/>
+        </w:rPr>
+      </w:pPr>
+    </w:p>
+    <w:p>
+      <w:pPr>
+        <w:rPr>
+          <w:b/>
+          <w:bCs/>
+          <w:szCs w:val="26"/>
+        </w:rPr>
+      </w:pPr>
+    </w:p>
+    <w:p>
+      <w:pPr>
+        <w:rPr>
+          <w:b/>
+          <w:bCs/>
+          <w:szCs w:val="26"/>
+        </w:rPr>
+      </w:pPr>
+    </w:p>
+    <w:p>
+      <w:pPr>
+        <w:rPr>
+          <w:b/>
+          <w:bCs/>
+          <w:szCs w:val="26"/>
+        </w:rPr>
+      </w:pPr>
+    </w:p>
+    <w:p>
+      <w:pPr>
+        <w:ind w:firstLine="0"/>
+        <w:rPr>
+          <w:b/>
+          <w:bCs/>
+          <w:szCs w:val="26"/>
+        </w:rPr>
+      </w:pPr>
+    </w:p>
+    <w:p>
+      <w:pPr>
+        <w:ind w:firstLine="0"/>
         <w:jc w:val="center"/>
         <w:rPr>
-          <w:szCs w:val="26"/>
-        </w:rPr>
-      </w:pPr>
-    </w:p>
-    <w:p>
-      <w:pPr>
+          <w:b/>
+          <w:bCs/>
+          <w:szCs w:val="26"/>
+        </w:rPr>
+      </w:pPr>
+    </w:p>
+    <w:p>
+      <w:pPr>
+        <w:ind w:firstLine="0"/>
         <w:jc w:val="center"/>
         <w:rPr>
-          <w:szCs w:val="26"/>
-        </w:rPr>
-      </w:pPr>
-    </w:p>
-    <w:p>
-      <w:pPr>
+          <w:b/>
+          <w:bCs/>
+          <w:szCs w:val="26"/>
+        </w:rPr>
+      </w:pPr>
+    </w:p>
+    <w:p>
+      <w:pPr>
+        <w:ind w:firstLine="0"/>
         <w:jc w:val="center"/>
         <w:rPr>
-          <w:szCs w:val="26"/>
-        </w:rPr>
-      </w:pPr>
-    </w:p>
-    <w:p>
-      <w:pPr>
+          <w:b/>
+          <w:bCs/>
+          <w:szCs w:val="26"/>
+        </w:rPr>
+      </w:pPr>
+    </w:p>
+    <w:p>
+      <w:pPr>
+        <w:ind w:firstLine="0"/>
         <w:jc w:val="center"/>
         <w:rPr>
-          <w:szCs w:val="26"/>
-        </w:rPr>
-      </w:pPr>
-    </w:p>
-    <w:p>
-      <w:pPr>
+          <w:b/>
+          <w:bCs/>
+          <w:szCs w:val="26"/>
+        </w:rPr>
+      </w:pPr>
+    </w:p>
+    <w:p>
+      <w:pPr>
+        <w:ind w:firstLine="0"/>
         <w:jc w:val="center"/>
         <w:rPr>
-          <w:szCs w:val="26"/>
-        </w:rPr>
-      </w:pPr>
-    </w:p>
-    <w:p>
-      <w:pPr>
-        <w:jc w:val="center"/>
-        <w:rPr>
-          <w:szCs w:val="26"/>
-        </w:rPr>
-      </w:pPr>
-    </w:p>
-    <w:p>
-      <w:pPr>
-        <w:jc w:val="center"/>
-        <w:rPr>
-          <w:szCs w:val="26"/>
-        </w:rPr>
-      </w:pPr>
-    </w:p>
-    <w:p>
-      <w:pPr>
-        <w:jc w:val="center"/>
-        <w:rPr>
-          <w:szCs w:val="26"/>
-        </w:rPr>
-      </w:pPr>
-    </w:p>
-    <w:p>
-      <w:pPr>
-        <w:rPr>
           <w:b/>
           <w:bCs/>
           <w:szCs w:val="26"/>
@@ -12967,7 +14746,6 @@
           <w:bCs/>
           <w:szCs w:val="26"/>
         </w:rPr>
-        <w:lastRenderedPageBreak/>
         <w:t>CHƯƠNG 5: THẢO LUẬN, KẾT LUẬN VÀ HƯỚNG PHÁT TRIỂN</w:t>
       </w:r>
     </w:p>
@@ -13148,23 +14926,6 @@
           <w:szCs w:val="26"/>
         </w:rPr>
         <w:t xml:space="preserve">Kết hợp nhiều mô hình (ensemble) </w:t>
-      </w:r>
-    </w:p>
-    <w:p>
-      <w:pPr>
-        <w:numPr>
-          <w:ilvl w:val="0"/>
-          <w:numId w:val="14"/>
-        </w:numPr>
-        <w:rPr>
-          <w:szCs w:val="26"/>
-        </w:rPr>
-      </w:pPr>
-      <w:r>
-        <w:rPr>
-          <w:szCs w:val="26"/>
-        </w:rPr>
-        <w:t xml:space="preserve">Ứng dụng các mô hình mới hơn như GPT </w:t>
       </w:r>
     </w:p>
     <w:p>
@@ -15707,7 +17468,7 @@
     <w:lsdException w:name="Unresolved Mention" w:semiHidden="1" w:unhideWhenUsed="1"/>
     <w:lsdException w:name="Smart Link" w:semiHidden="1" w:unhideWhenUsed="1"/>
   </w:latentStyles>
-  <w:style w:type="paragraph" w:default="1" w:styleId="Normal">
+  <w:style w:type="paragraph" w:default="1" w:styleId="Binhthng">
     <w:name w:val="Normal"/>
     <w:qFormat/>
     <w:rsid w:val="00684F81"/>
@@ -15722,11 +17483,11 @@
       <w14:ligatures w14:val="none"/>
     </w:rPr>
   </w:style>
-  <w:style w:type="paragraph" w:styleId="Heading1">
+  <w:style w:type="paragraph" w:styleId="u1">
     <w:name w:val="heading 1"/>
-    <w:basedOn w:val="Normal"/>
-    <w:next w:val="Normal"/>
-    <w:link w:val="Heading1Char"/>
+    <w:basedOn w:val="Binhthng"/>
+    <w:next w:val="Binhthng"/>
+    <w:link w:val="u1Char"/>
     <w:uiPriority w:val="9"/>
     <w:qFormat/>
     <w:rsid w:val="0011309A"/>
@@ -15747,11 +17508,11 @@
       <w14:ligatures w14:val="standardContextual"/>
     </w:rPr>
   </w:style>
-  <w:style w:type="paragraph" w:styleId="Heading2">
+  <w:style w:type="paragraph" w:styleId="u2">
     <w:name w:val="heading 2"/>
-    <w:basedOn w:val="Normal"/>
-    <w:next w:val="Normal"/>
-    <w:link w:val="Heading2Char"/>
+    <w:basedOn w:val="Binhthng"/>
+    <w:next w:val="Binhthng"/>
+    <w:link w:val="u2Char"/>
     <w:uiPriority w:val="9"/>
     <w:unhideWhenUsed/>
     <w:qFormat/>
@@ -15773,11 +17534,11 @@
       <w14:ligatures w14:val="standardContextual"/>
     </w:rPr>
   </w:style>
-  <w:style w:type="paragraph" w:styleId="Heading3">
+  <w:style w:type="paragraph" w:styleId="u3">
     <w:name w:val="heading 3"/>
-    <w:basedOn w:val="Normal"/>
-    <w:next w:val="Normal"/>
-    <w:link w:val="Heading3Char"/>
+    <w:basedOn w:val="Binhthng"/>
+    <w:next w:val="Binhthng"/>
+    <w:link w:val="u3Char"/>
     <w:uiPriority w:val="9"/>
     <w:unhideWhenUsed/>
     <w:qFormat/>
@@ -15799,11 +17560,11 @@
       <w14:ligatures w14:val="standardContextual"/>
     </w:rPr>
   </w:style>
-  <w:style w:type="paragraph" w:styleId="Heading4">
+  <w:style w:type="paragraph" w:styleId="u4">
     <w:name w:val="heading 4"/>
-    <w:basedOn w:val="Normal"/>
-    <w:next w:val="Normal"/>
-    <w:link w:val="Heading4Char"/>
+    <w:basedOn w:val="Binhthng"/>
+    <w:next w:val="Binhthng"/>
+    <w:link w:val="u4Char"/>
     <w:uiPriority w:val="9"/>
     <w:semiHidden/>
     <w:unhideWhenUsed/>
@@ -15827,11 +17588,11 @@
       <w14:ligatures w14:val="standardContextual"/>
     </w:rPr>
   </w:style>
-  <w:style w:type="paragraph" w:styleId="Heading5">
+  <w:style w:type="paragraph" w:styleId="u5">
     <w:name w:val="heading 5"/>
-    <w:basedOn w:val="Normal"/>
-    <w:next w:val="Normal"/>
-    <w:link w:val="Heading5Char"/>
+    <w:basedOn w:val="Binhthng"/>
+    <w:next w:val="Binhthng"/>
+    <w:link w:val="u5Char"/>
     <w:uiPriority w:val="9"/>
     <w:semiHidden/>
     <w:unhideWhenUsed/>
@@ -15853,11 +17614,11 @@
       <w14:ligatures w14:val="standardContextual"/>
     </w:rPr>
   </w:style>
-  <w:style w:type="paragraph" w:styleId="Heading6">
+  <w:style w:type="paragraph" w:styleId="u6">
     <w:name w:val="heading 6"/>
-    <w:basedOn w:val="Normal"/>
-    <w:next w:val="Normal"/>
-    <w:link w:val="Heading6Char"/>
+    <w:basedOn w:val="Binhthng"/>
+    <w:next w:val="Binhthng"/>
+    <w:link w:val="u6Char"/>
     <w:uiPriority w:val="9"/>
     <w:semiHidden/>
     <w:unhideWhenUsed/>
@@ -15881,11 +17642,11 @@
       <w14:ligatures w14:val="standardContextual"/>
     </w:rPr>
   </w:style>
-  <w:style w:type="paragraph" w:styleId="Heading7">
+  <w:style w:type="paragraph" w:styleId="u7">
     <w:name w:val="heading 7"/>
-    <w:basedOn w:val="Normal"/>
-    <w:next w:val="Normal"/>
-    <w:link w:val="Heading7Char"/>
+    <w:basedOn w:val="Binhthng"/>
+    <w:next w:val="Binhthng"/>
+    <w:link w:val="u7Char"/>
     <w:uiPriority w:val="9"/>
     <w:semiHidden/>
     <w:unhideWhenUsed/>
@@ -15907,11 +17668,11 @@
       <w14:ligatures w14:val="standardContextual"/>
     </w:rPr>
   </w:style>
-  <w:style w:type="paragraph" w:styleId="Heading8">
+  <w:style w:type="paragraph" w:styleId="u8">
     <w:name w:val="heading 8"/>
-    <w:basedOn w:val="Normal"/>
-    <w:next w:val="Normal"/>
-    <w:link w:val="Heading8Char"/>
+    <w:basedOn w:val="Binhthng"/>
+    <w:next w:val="Binhthng"/>
+    <w:link w:val="u8Char"/>
     <w:uiPriority w:val="9"/>
     <w:semiHidden/>
     <w:unhideWhenUsed/>
@@ -15935,11 +17696,11 @@
       <w14:ligatures w14:val="standardContextual"/>
     </w:rPr>
   </w:style>
-  <w:style w:type="paragraph" w:styleId="Heading9">
+  <w:style w:type="paragraph" w:styleId="u9">
     <w:name w:val="heading 9"/>
-    <w:basedOn w:val="Normal"/>
-    <w:next w:val="Normal"/>
-    <w:link w:val="Heading9Char"/>
+    <w:basedOn w:val="Binhthng"/>
+    <w:next w:val="Binhthng"/>
+    <w:link w:val="u9Char"/>
     <w:uiPriority w:val="9"/>
     <w:semiHidden/>
     <w:unhideWhenUsed/>
@@ -15961,12 +17722,13 @@
       <w14:ligatures w14:val="standardContextual"/>
     </w:rPr>
   </w:style>
-  <w:style w:type="character" w:default="1" w:styleId="DefaultParagraphFont">
+  <w:style w:type="character" w:default="1" w:styleId="Phngmcinhcuaoanvn">
     <w:name w:val="Default Paragraph Font"/>
     <w:uiPriority w:val="1"/>
+    <w:semiHidden/>
     <w:unhideWhenUsed/>
   </w:style>
-  <w:style w:type="table" w:default="1" w:styleId="TableNormal">
+  <w:style w:type="table" w:default="1" w:styleId="BangThngthng">
     <w:name w:val="Normal Table"/>
     <w:uiPriority w:val="99"/>
     <w:semiHidden/>
@@ -15981,16 +17743,16 @@
       </w:tblCellMar>
     </w:tblPr>
   </w:style>
-  <w:style w:type="numbering" w:default="1" w:styleId="NoList">
+  <w:style w:type="numbering" w:default="1" w:styleId="Khngco">
     <w:name w:val="No List"/>
     <w:uiPriority w:val="99"/>
     <w:semiHidden/>
     <w:unhideWhenUsed/>
   </w:style>
-  <w:style w:type="character" w:customStyle="1" w:styleId="Heading1Char">
-    <w:name w:val="Heading 1 Char"/>
-    <w:basedOn w:val="DefaultParagraphFont"/>
-    <w:link w:val="Heading1"/>
+  <w:style w:type="character" w:customStyle="1" w:styleId="u1Char">
+    <w:name w:val="Đầu đề 1 Char"/>
+    <w:basedOn w:val="Phngmcinhcuaoanvn"/>
+    <w:link w:val="u1"/>
     <w:uiPriority w:val="9"/>
     <w:qFormat/>
     <w:rsid w:val="0011309A"/>
@@ -16001,10 +17763,10 @@
       <w:szCs w:val="40"/>
     </w:rPr>
   </w:style>
-  <w:style w:type="character" w:customStyle="1" w:styleId="Heading2Char">
-    <w:name w:val="Heading 2 Char"/>
-    <w:basedOn w:val="DefaultParagraphFont"/>
-    <w:link w:val="Heading2"/>
+  <w:style w:type="character" w:customStyle="1" w:styleId="u2Char">
+    <w:name w:val="Đầu đề 2 Char"/>
+    <w:basedOn w:val="Phngmcinhcuaoanvn"/>
+    <w:link w:val="u2"/>
     <w:uiPriority w:val="9"/>
     <w:semiHidden/>
     <w:rsid w:val="0011309A"/>
@@ -16015,10 +17777,10 @@
       <w:szCs w:val="32"/>
     </w:rPr>
   </w:style>
-  <w:style w:type="character" w:customStyle="1" w:styleId="Heading3Char">
-    <w:name w:val="Heading 3 Char"/>
-    <w:basedOn w:val="DefaultParagraphFont"/>
-    <w:link w:val="Heading3"/>
+  <w:style w:type="character" w:customStyle="1" w:styleId="u3Char">
+    <w:name w:val="Đầu đề 3 Char"/>
+    <w:basedOn w:val="Phngmcinhcuaoanvn"/>
+    <w:link w:val="u3"/>
     <w:uiPriority w:val="9"/>
     <w:semiHidden/>
     <w:rsid w:val="0011309A"/>
@@ -16028,10 +17790,10 @@
       <w:szCs w:val="28"/>
     </w:rPr>
   </w:style>
-  <w:style w:type="character" w:customStyle="1" w:styleId="Heading4Char">
-    <w:name w:val="Heading 4 Char"/>
-    <w:basedOn w:val="DefaultParagraphFont"/>
-    <w:link w:val="Heading4"/>
+  <w:style w:type="character" w:customStyle="1" w:styleId="u4Char">
+    <w:name w:val="Đầu đề 4 Char"/>
+    <w:basedOn w:val="Phngmcinhcuaoanvn"/>
+    <w:link w:val="u4"/>
     <w:uiPriority w:val="9"/>
     <w:semiHidden/>
     <w:rsid w:val="0011309A"/>
@@ -16042,10 +17804,10 @@
       <w:color w:val="2F5496" w:themeColor="accent1" w:themeShade="BF"/>
     </w:rPr>
   </w:style>
-  <w:style w:type="character" w:customStyle="1" w:styleId="Heading5Char">
-    <w:name w:val="Heading 5 Char"/>
-    <w:basedOn w:val="DefaultParagraphFont"/>
-    <w:link w:val="Heading5"/>
+  <w:style w:type="character" w:customStyle="1" w:styleId="u5Char">
+    <w:name w:val="Đầu đề 5 Char"/>
+    <w:basedOn w:val="Phngmcinhcuaoanvn"/>
+    <w:link w:val="u5"/>
     <w:uiPriority w:val="9"/>
     <w:semiHidden/>
     <w:rsid w:val="0011309A"/>
@@ -16054,10 +17816,10 @@
       <w:color w:val="2F5496" w:themeColor="accent1" w:themeShade="BF"/>
     </w:rPr>
   </w:style>
-  <w:style w:type="character" w:customStyle="1" w:styleId="Heading6Char">
-    <w:name w:val="Heading 6 Char"/>
-    <w:basedOn w:val="DefaultParagraphFont"/>
-    <w:link w:val="Heading6"/>
+  <w:style w:type="character" w:customStyle="1" w:styleId="u6Char">
+    <w:name w:val="Đầu đề 6 Char"/>
+    <w:basedOn w:val="Phngmcinhcuaoanvn"/>
+    <w:link w:val="u6"/>
     <w:uiPriority w:val="9"/>
     <w:semiHidden/>
     <w:rsid w:val="0011309A"/>
@@ -16068,10 +17830,10 @@
       <w:color w:val="595959" w:themeColor="text1" w:themeTint="A6"/>
     </w:rPr>
   </w:style>
-  <w:style w:type="character" w:customStyle="1" w:styleId="Heading7Char">
-    <w:name w:val="Heading 7 Char"/>
-    <w:basedOn w:val="DefaultParagraphFont"/>
-    <w:link w:val="Heading7"/>
+  <w:style w:type="character" w:customStyle="1" w:styleId="u7Char">
+    <w:name w:val="Đầu đề 7 Char"/>
+    <w:basedOn w:val="Phngmcinhcuaoanvn"/>
+    <w:link w:val="u7"/>
     <w:uiPriority w:val="9"/>
     <w:semiHidden/>
     <w:rsid w:val="0011309A"/>
@@ -16080,10 +17842,10 @@
       <w:color w:val="595959" w:themeColor="text1" w:themeTint="A6"/>
     </w:rPr>
   </w:style>
-  <w:style w:type="character" w:customStyle="1" w:styleId="Heading8Char">
-    <w:name w:val="Heading 8 Char"/>
-    <w:basedOn w:val="DefaultParagraphFont"/>
-    <w:link w:val="Heading8"/>
+  <w:style w:type="character" w:customStyle="1" w:styleId="u8Char">
+    <w:name w:val="Đầu đề 8 Char"/>
+    <w:basedOn w:val="Phngmcinhcuaoanvn"/>
+    <w:link w:val="u8"/>
     <w:uiPriority w:val="9"/>
     <w:semiHidden/>
     <w:rsid w:val="0011309A"/>
@@ -16094,10 +17856,10 @@
       <w:color w:val="272727" w:themeColor="text1" w:themeTint="D8"/>
     </w:rPr>
   </w:style>
-  <w:style w:type="character" w:customStyle="1" w:styleId="Heading9Char">
-    <w:name w:val="Heading 9 Char"/>
-    <w:basedOn w:val="DefaultParagraphFont"/>
-    <w:link w:val="Heading9"/>
+  <w:style w:type="character" w:customStyle="1" w:styleId="u9Char">
+    <w:name w:val="Đầu đề 9 Char"/>
+    <w:basedOn w:val="Phngmcinhcuaoanvn"/>
+    <w:link w:val="u9"/>
     <w:uiPriority w:val="9"/>
     <w:semiHidden/>
     <w:rsid w:val="0011309A"/>
@@ -16106,11 +17868,11 @@
       <w:color w:val="272727" w:themeColor="text1" w:themeTint="D8"/>
     </w:rPr>
   </w:style>
-  <w:style w:type="paragraph" w:styleId="Title">
+  <w:style w:type="paragraph" w:styleId="Tiu">
     <w:name w:val="Title"/>
-    <w:basedOn w:val="Normal"/>
-    <w:next w:val="Normal"/>
-    <w:link w:val="TitleChar"/>
+    <w:basedOn w:val="Binhthng"/>
+    <w:next w:val="Binhthng"/>
+    <w:link w:val="TiuChar"/>
     <w:uiPriority w:val="10"/>
     <w:qFormat/>
     <w:rsid w:val="0011309A"/>
@@ -16129,10 +17891,10 @@
       <w14:ligatures w14:val="standardContextual"/>
     </w:rPr>
   </w:style>
-  <w:style w:type="character" w:customStyle="1" w:styleId="TitleChar">
-    <w:name w:val="Title Char"/>
-    <w:basedOn w:val="DefaultParagraphFont"/>
-    <w:link w:val="Title"/>
+  <w:style w:type="character" w:customStyle="1" w:styleId="TiuChar">
+    <w:name w:val="Tiêu đề Char"/>
+    <w:basedOn w:val="Phngmcinhcuaoanvn"/>
+    <w:link w:val="Tiu"/>
     <w:uiPriority w:val="10"/>
     <w:rsid w:val="0011309A"/>
     <w:rPr>
@@ -16143,11 +17905,11 @@
       <w:szCs w:val="56"/>
     </w:rPr>
   </w:style>
-  <w:style w:type="paragraph" w:styleId="Subtitle">
+  <w:style w:type="paragraph" w:styleId="Tiuphu">
     <w:name w:val="Subtitle"/>
-    <w:basedOn w:val="Normal"/>
-    <w:next w:val="Normal"/>
-    <w:link w:val="SubtitleChar"/>
+    <w:basedOn w:val="Binhthng"/>
+    <w:next w:val="Binhthng"/>
+    <w:link w:val="TiuphuChar"/>
     <w:uiPriority w:val="11"/>
     <w:qFormat/>
     <w:rsid w:val="0011309A"/>
@@ -16169,10 +17931,10 @@
       <w14:ligatures w14:val="standardContextual"/>
     </w:rPr>
   </w:style>
-  <w:style w:type="character" w:customStyle="1" w:styleId="SubtitleChar">
-    <w:name w:val="Subtitle Char"/>
-    <w:basedOn w:val="DefaultParagraphFont"/>
-    <w:link w:val="Subtitle"/>
+  <w:style w:type="character" w:customStyle="1" w:styleId="TiuphuChar">
+    <w:name w:val="Tiêu đề phụ Char"/>
+    <w:basedOn w:val="Phngmcinhcuaoanvn"/>
+    <w:link w:val="Tiuphu"/>
     <w:uiPriority w:val="11"/>
     <w:rsid w:val="0011309A"/>
     <w:rPr>
@@ -16182,11 +17944,11 @@
       <w:szCs w:val="28"/>
     </w:rPr>
   </w:style>
-  <w:style w:type="paragraph" w:styleId="Quote">
+  <w:style w:type="paragraph" w:styleId="Litrichdn">
     <w:name w:val="Quote"/>
-    <w:basedOn w:val="Normal"/>
-    <w:next w:val="Normal"/>
-    <w:link w:val="QuoteChar"/>
+    <w:basedOn w:val="Binhthng"/>
+    <w:next w:val="Binhthng"/>
+    <w:link w:val="LitrichdnChar"/>
     <w:uiPriority w:val="29"/>
     <w:qFormat/>
     <w:rsid w:val="0011309A"/>
@@ -16204,10 +17966,10 @@
       <w14:ligatures w14:val="standardContextual"/>
     </w:rPr>
   </w:style>
-  <w:style w:type="character" w:customStyle="1" w:styleId="QuoteChar">
-    <w:name w:val="Quote Char"/>
-    <w:basedOn w:val="DefaultParagraphFont"/>
-    <w:link w:val="Quote"/>
+  <w:style w:type="character" w:customStyle="1" w:styleId="LitrichdnChar">
+    <w:name w:val="Lời trích dẫn Char"/>
+    <w:basedOn w:val="Phngmcinhcuaoanvn"/>
+    <w:link w:val="Litrichdn"/>
     <w:uiPriority w:val="29"/>
     <w:rsid w:val="0011309A"/>
     <w:rPr>
@@ -16216,10 +17978,10 @@
       <w:color w:val="404040" w:themeColor="text1" w:themeTint="BF"/>
     </w:rPr>
   </w:style>
-  <w:style w:type="paragraph" w:styleId="ListParagraph">
+  <w:style w:type="paragraph" w:styleId="oancuaDanhsach">
     <w:name w:val="List Paragraph"/>
-    <w:basedOn w:val="Normal"/>
-    <w:link w:val="ListParagraphChar"/>
+    <w:basedOn w:val="Binhthng"/>
+    <w:link w:val="oancuaDanhsachChar"/>
     <w:uiPriority w:val="1"/>
     <w:qFormat/>
     <w:rsid w:val="0011309A"/>
@@ -16235,9 +17997,9 @@
       <w14:ligatures w14:val="standardContextual"/>
     </w:rPr>
   </w:style>
-  <w:style w:type="character" w:styleId="IntenseEmphasis">
+  <w:style w:type="character" w:styleId="NhnmnhThm">
     <w:name w:val="Intense Emphasis"/>
-    <w:basedOn w:val="DefaultParagraphFont"/>
+    <w:basedOn w:val="Phngmcinhcuaoanvn"/>
     <w:uiPriority w:val="21"/>
     <w:qFormat/>
     <w:rsid w:val="0011309A"/>
@@ -16247,11 +18009,11 @@
       <w:color w:val="2F5496" w:themeColor="accent1" w:themeShade="BF"/>
     </w:rPr>
   </w:style>
-  <w:style w:type="paragraph" w:styleId="IntenseQuote">
+  <w:style w:type="paragraph" w:styleId="Nhaykepm">
     <w:name w:val="Intense Quote"/>
-    <w:basedOn w:val="Normal"/>
-    <w:next w:val="Normal"/>
-    <w:link w:val="IntenseQuoteChar"/>
+    <w:basedOn w:val="Binhthng"/>
+    <w:next w:val="Binhthng"/>
+    <w:link w:val="NhaykepmChar"/>
     <w:uiPriority w:val="30"/>
     <w:qFormat/>
     <w:rsid w:val="0011309A"/>
@@ -16273,10 +18035,10 @@
       <w14:ligatures w14:val="standardContextual"/>
     </w:rPr>
   </w:style>
-  <w:style w:type="character" w:customStyle="1" w:styleId="IntenseQuoteChar">
-    <w:name w:val="Intense Quote Char"/>
-    <w:basedOn w:val="DefaultParagraphFont"/>
-    <w:link w:val="IntenseQuote"/>
+  <w:style w:type="character" w:customStyle="1" w:styleId="NhaykepmChar">
+    <w:name w:val="Nháy kép Đậm Char"/>
+    <w:basedOn w:val="Phngmcinhcuaoanvn"/>
+    <w:link w:val="Nhaykepm"/>
     <w:uiPriority w:val="30"/>
     <w:rsid w:val="0011309A"/>
     <w:rPr>
@@ -16285,9 +18047,9 @@
       <w:color w:val="2F5496" w:themeColor="accent1" w:themeShade="BF"/>
     </w:rPr>
   </w:style>
-  <w:style w:type="character" w:styleId="IntenseReference">
+  <w:style w:type="character" w:styleId="ThamchiuNhnmnh">
     <w:name w:val="Intense Reference"/>
-    <w:basedOn w:val="DefaultParagraphFont"/>
+    <w:basedOn w:val="Phngmcinhcuaoanvn"/>
     <w:uiPriority w:val="32"/>
     <w:qFormat/>
     <w:rsid w:val="0011309A"/>
@@ -16299,10 +18061,10 @@
       <w:spacing w:val="5"/>
     </w:rPr>
   </w:style>
-  <w:style w:type="paragraph" w:styleId="TOCHeading">
+  <w:style w:type="paragraph" w:styleId="uMucluc">
     <w:name w:val="TOC Heading"/>
-    <w:basedOn w:val="Heading1"/>
-    <w:next w:val="Normal"/>
+    <w:basedOn w:val="u1"/>
+    <w:next w:val="Binhthng"/>
     <w:uiPriority w:val="39"/>
     <w:unhideWhenUsed/>
     <w:qFormat/>
@@ -16318,9 +18080,9 @@
       <w14:ligatures w14:val="none"/>
     </w:rPr>
   </w:style>
-  <w:style w:type="table" w:styleId="TableGrid">
+  <w:style w:type="table" w:styleId="LiBang">
     <w:name w:val="Table Grid"/>
-    <w:basedOn w:val="TableNormal"/>
+    <w:basedOn w:val="BangThngthng"/>
     <w:uiPriority w:val="39"/>
     <w:qFormat/>
     <w:rsid w:val="00EF1F11"/>
@@ -16347,10 +18109,10 @@
       </w:tblBorders>
     </w:tblPr>
   </w:style>
-  <w:style w:type="paragraph" w:styleId="Header">
+  <w:style w:type="paragraph" w:styleId="utrang">
     <w:name w:val="header"/>
-    <w:basedOn w:val="Normal"/>
-    <w:link w:val="HeaderChar"/>
+    <w:basedOn w:val="Binhthng"/>
+    <w:link w:val="utrangChar"/>
     <w:uiPriority w:val="99"/>
     <w:unhideWhenUsed/>
     <w:rsid w:val="0046545F"/>
@@ -16362,10 +18124,10 @@
       <w:spacing w:after="0" w:line="240" w:lineRule="auto"/>
     </w:pPr>
   </w:style>
-  <w:style w:type="character" w:customStyle="1" w:styleId="HeaderChar">
-    <w:name w:val="Header Char"/>
-    <w:basedOn w:val="DefaultParagraphFont"/>
-    <w:link w:val="Header"/>
+  <w:style w:type="character" w:customStyle="1" w:styleId="utrangChar">
+    <w:name w:val="Đầu trang Char"/>
+    <w:basedOn w:val="Phngmcinhcuaoanvn"/>
+    <w:link w:val="utrang"/>
     <w:uiPriority w:val="99"/>
     <w:rsid w:val="0046545F"/>
     <w:rPr>
@@ -16374,10 +18136,10 @@
       <w14:ligatures w14:val="none"/>
     </w:rPr>
   </w:style>
-  <w:style w:type="paragraph" w:styleId="Footer">
+  <w:style w:type="paragraph" w:styleId="Chntrang">
     <w:name w:val="footer"/>
-    <w:basedOn w:val="Normal"/>
-    <w:link w:val="FooterChar"/>
+    <w:basedOn w:val="Binhthng"/>
+    <w:link w:val="ChntrangChar"/>
     <w:uiPriority w:val="99"/>
     <w:unhideWhenUsed/>
     <w:rsid w:val="0046545F"/>
@@ -16389,10 +18151,10 @@
       <w:spacing w:after="0" w:line="240" w:lineRule="auto"/>
     </w:pPr>
   </w:style>
-  <w:style w:type="character" w:customStyle="1" w:styleId="FooterChar">
-    <w:name w:val="Footer Char"/>
-    <w:basedOn w:val="DefaultParagraphFont"/>
-    <w:link w:val="Footer"/>
+  <w:style w:type="character" w:customStyle="1" w:styleId="ChntrangChar">
+    <w:name w:val="Chân trang Char"/>
+    <w:basedOn w:val="Phngmcinhcuaoanvn"/>
+    <w:link w:val="Chntrang"/>
     <w:uiPriority w:val="99"/>
     <w:rsid w:val="0046545F"/>
     <w:rPr>
@@ -16401,17 +18163,17 @@
       <w14:ligatures w14:val="none"/>
     </w:rPr>
   </w:style>
-  <w:style w:type="character" w:customStyle="1" w:styleId="ListParagraphChar">
-    <w:name w:val="List Paragraph Char"/>
-    <w:basedOn w:val="DefaultParagraphFont"/>
-    <w:link w:val="ListParagraph"/>
+  <w:style w:type="character" w:customStyle="1" w:styleId="oancuaDanhsachChar">
+    <w:name w:val="Đoạn của Danh sách Char"/>
+    <w:basedOn w:val="Phngmcinhcuaoanvn"/>
+    <w:link w:val="oancuaDanhsach"/>
     <w:uiPriority w:val="1"/>
     <w:qFormat/>
     <w:rsid w:val="0046545F"/>
   </w:style>
-  <w:style w:type="paragraph" w:styleId="NormalWeb">
+  <w:style w:type="paragraph" w:styleId="ThngthngWeb">
     <w:name w:val="Normal (Web)"/>
-    <w:basedOn w:val="Normal"/>
+    <w:basedOn w:val="Binhthng"/>
     <w:uiPriority w:val="99"/>
     <w:unhideWhenUsed/>
     <w:rsid w:val="00684F81"/>
@@ -16427,8 +18189,61 @@
   </w:style>
   <w:style w:type="character" w:customStyle="1" w:styleId="whitespace-normal">
     <w:name w:val="whitespace-normal"/>
-    <w:basedOn w:val="DefaultParagraphFont"/>
+    <w:basedOn w:val="Phngmcinhcuaoanvn"/>
     <w:rsid w:val="00F33839"/>
+  </w:style>
+  <w:style w:type="character" w:styleId="Siuktni">
+    <w:name w:val="Hyperlink"/>
+    <w:basedOn w:val="Phngmcinhcuaoanvn"/>
+    <w:uiPriority w:val="99"/>
+    <w:unhideWhenUsed/>
+    <w:rsid w:val="002443CF"/>
+    <w:rPr>
+      <w:color w:val="0563C1" w:themeColor="hyperlink"/>
+      <w:u w:val="single"/>
+    </w:rPr>
+  </w:style>
+  <w:style w:type="character" w:styleId="cpChagiiquyt">
+    <w:name w:val="Unresolved Mention"/>
+    <w:basedOn w:val="Phngmcinhcuaoanvn"/>
+    <w:uiPriority w:val="99"/>
+    <w:semiHidden/>
+    <w:unhideWhenUsed/>
+    <w:rsid w:val="002443CF"/>
+    <w:rPr>
+      <w:color w:val="605E5C"/>
+      <w:shd w:val="clear" w:color="auto" w:fill="E1DFDD"/>
+    </w:rPr>
+  </w:style>
+  <w:style w:type="paragraph" w:styleId="KhngDncch">
+    <w:name w:val="No Spacing"/>
+    <w:uiPriority w:val="1"/>
+    <w:qFormat/>
+    <w:rsid w:val="007D36DA"/>
+    <w:pPr>
+      <w:spacing w:after="0" w:line="240" w:lineRule="auto"/>
+      <w:ind w:firstLine="567"/>
+      <w:jc w:val="both"/>
+    </w:pPr>
+    <w:rPr>
+      <w:kern w:val="0"/>
+      <w:sz w:val="26"/>
+      <w14:ligatures w14:val="none"/>
+    </w:rPr>
+  </w:style>
+  <w:style w:type="paragraph" w:styleId="Mucluc3">
+    <w:name w:val="toc 3"/>
+    <w:basedOn w:val="Binhthng"/>
+    <w:next w:val="Binhthng"/>
+    <w:autoRedefine/>
+    <w:uiPriority w:val="39"/>
+    <w:semiHidden/>
+    <w:unhideWhenUsed/>
+    <w:rsid w:val="000224D2"/>
+    <w:pPr>
+      <w:spacing w:after="100"/>
+      <w:ind w:left="520"/>
+    </w:pPr>
   </w:style>
 </w:styles>
 </file>

</xml_diff>

<commit_message>
cập nhật báo cáo
</commit_message>
<xml_diff>
--- a/BaoCaoDATN_TranDoanAnh.docx
+++ b/BaoCaoDATN_TranDoanAnh.docx
@@ -13912,7 +13912,7 @@
         <w:tblLook w:val="04A0" w:firstRow="1" w:lastRow="0" w:firstColumn="1" w:lastColumn="0" w:noHBand="0" w:noVBand="1"/>
       </w:tblPr>
       <w:tblGrid>
-        <w:gridCol w:w="1982"/>
+        <w:gridCol w:w="3942"/>
         <w:gridCol w:w="1837"/>
       </w:tblGrid>
       <w:tr>
@@ -13973,7 +13973,6 @@
           </w:tcPr>
           <w:p>
             <w:pPr>
-              <w:jc w:val="left"/>
               <w:rPr>
                 <w:szCs w:val="26"/>
               </w:rPr>
@@ -13984,6 +13983,24 @@
               </w:rPr>
               <w:t>TF-IDF</w:t>
             </w:r>
+            <w:r>
+              <w:rPr>
+                <w:szCs w:val="26"/>
+              </w:rPr>
+              <w:t xml:space="preserve"> </w:t>
+            </w:r>
+            <w:r>
+              <w:rPr>
+                <w:szCs w:val="26"/>
+              </w:rPr>
+              <w:t xml:space="preserve">+ </w:t>
+            </w:r>
+            <w:r>
+              <w:rPr>
+                <w:szCs w:val="26"/>
+              </w:rPr>
+              <w:t>Logistic Regression</w:t>
+            </w:r>
           </w:p>
         </w:tc>
         <w:tc>
@@ -13993,7 +14010,6 @@
           </w:tcPr>
           <w:p>
             <w:pPr>
-              <w:jc w:val="left"/>
               <w:rPr>
                 <w:szCs w:val="26"/>
               </w:rPr>
@@ -14002,7 +14018,19 @@
               <w:rPr>
                 <w:szCs w:val="26"/>
               </w:rPr>
-              <w:t>~88%</w:t>
+              <w:t>~</w:t>
+            </w:r>
+            <w:r>
+              <w:rPr>
+                <w:szCs w:val="26"/>
+              </w:rPr>
+              <w:t>98.2</w:t>
+            </w:r>
+            <w:r>
+              <w:rPr>
+                <w:szCs w:val="26"/>
+              </w:rPr>
+              <w:t>%</w:t>
             </w:r>
           </w:p>
         </w:tc>
@@ -14015,7 +14043,6 @@
           </w:tcPr>
           <w:p>
             <w:pPr>
-              <w:jc w:val="left"/>
               <w:rPr>
                 <w:szCs w:val="26"/>
               </w:rPr>
@@ -14026,6 +14053,18 @@
               </w:rPr>
               <w:t>Embedding</w:t>
             </w:r>
+            <w:r>
+              <w:rPr>
+                <w:szCs w:val="26"/>
+              </w:rPr>
+              <w:t xml:space="preserve"> + SV</w:t>
+            </w:r>
+            <w:r>
+              <w:rPr>
+                <w:szCs w:val="26"/>
+              </w:rPr>
+              <w:t>M</w:t>
+            </w:r>
           </w:p>
         </w:tc>
         <w:tc>
@@ -14035,7 +14074,6 @@
           </w:tcPr>
           <w:p>
             <w:pPr>
-              <w:jc w:val="left"/>
               <w:rPr>
                 <w:szCs w:val="26"/>
               </w:rPr>
@@ -14044,7 +14082,19 @@
               <w:rPr>
                 <w:szCs w:val="26"/>
               </w:rPr>
-              <w:t>~91%</w:t>
+              <w:t>~</w:t>
+            </w:r>
+            <w:r>
+              <w:rPr>
+                <w:szCs w:val="26"/>
+              </w:rPr>
+              <w:t>60</w:t>
+            </w:r>
+            <w:r>
+              <w:rPr>
+                <w:szCs w:val="26"/>
+              </w:rPr>
+              <w:t>%</w:t>
             </w:r>
           </w:p>
         </w:tc>
@@ -14057,7 +14107,6 @@
           </w:tcPr>
           <w:p>
             <w:pPr>
-              <w:jc w:val="left"/>
               <w:rPr>
                 <w:szCs w:val="26"/>
               </w:rPr>
@@ -14077,7 +14126,6 @@
           </w:tcPr>
           <w:p>
             <w:pPr>
-              <w:jc w:val="left"/>
               <w:rPr>
                 <w:szCs w:val="26"/>
               </w:rPr>
@@ -14147,6 +14195,152 @@
         </w:rPr>
         <w:br w:type="textWrapping" w:clear="all"/>
       </w:r>
+      <w:r>
+        <w:rPr>
+          <w:noProof/>
+          <w:szCs w:val="26"/>
+        </w:rPr>
+        <w:drawing>
+          <wp:inline distT="0" distB="0" distL="0" distR="0" wp14:anchorId="03E77C1E" wp14:editId="490F523D">
+            <wp:extent cx="5760085" cy="2129790"/>
+            <wp:effectExtent l="0" t="0" r="0" b="3810"/>
+            <wp:docPr id="1523768752" name="Hình ảnh 1"/>
+            <wp:cNvGraphicFramePr>
+              <a:graphicFrameLocks xmlns:a="http://schemas.openxmlformats.org/drawingml/2006/main" noChangeAspect="1"/>
+            </wp:cNvGraphicFramePr>
+            <a:graphic xmlns:a="http://schemas.openxmlformats.org/drawingml/2006/main">
+              <a:graphicData uri="http://schemas.openxmlformats.org/drawingml/2006/picture">
+                <pic:pic xmlns:pic="http://schemas.openxmlformats.org/drawingml/2006/picture">
+                  <pic:nvPicPr>
+                    <pic:cNvPr id="1523768752" name=""/>
+                    <pic:cNvPicPr/>
+                  </pic:nvPicPr>
+                  <pic:blipFill>
+                    <a:blip r:embed="rId13"/>
+                    <a:stretch>
+                      <a:fillRect/>
+                    </a:stretch>
+                  </pic:blipFill>
+                  <pic:spPr>
+                    <a:xfrm>
+                      <a:off x="0" y="0"/>
+                      <a:ext cx="5760085" cy="2129790"/>
+                    </a:xfrm>
+                    <a:prstGeom prst="rect">
+                      <a:avLst/>
+                    </a:prstGeom>
+                  </pic:spPr>
+                </pic:pic>
+              </a:graphicData>
+            </a:graphic>
+          </wp:inline>
+        </w:drawing>
+      </w:r>
+    </w:p>
+    <w:p>
+      <w:pPr>
+        <w:ind w:firstLine="0"/>
+        <w:jc w:val="left"/>
+        <w:rPr>
+          <w:szCs w:val="26"/>
+        </w:rPr>
+      </w:pPr>
+      <w:r>
+        <w:rPr>
+          <w:szCs w:val="26"/>
+        </w:rPr>
+        <w:tab/>
+      </w:r>
+      <w:r>
+        <w:rPr>
+          <w:szCs w:val="26"/>
+        </w:rPr>
+        <w:tab/>
+      </w:r>
+      <w:r>
+        <w:rPr>
+          <w:szCs w:val="26"/>
+        </w:rPr>
+        <w:tab/>
+      </w:r>
+      <w:r>
+        <w:rPr>
+          <w:szCs w:val="26"/>
+        </w:rPr>
+        <w:tab/>
+      </w:r>
+      <w:r>
+        <w:rPr>
+          <w:szCs w:val="26"/>
+        </w:rPr>
+        <w:tab/>
+        <w:t>TF-IDF + Logistic Regression</w:t>
+      </w:r>
+    </w:p>
+    <w:p>
+      <w:pPr>
+        <w:ind w:firstLine="0"/>
+        <w:jc w:val="left"/>
+        <w:rPr>
+          <w:szCs w:val="26"/>
+        </w:rPr>
+      </w:pPr>
+      <w:r>
+        <w:rPr>
+          <w:noProof/>
+          <w:szCs w:val="26"/>
+        </w:rPr>
+        <w:drawing>
+          <wp:inline distT="0" distB="0" distL="0" distR="0" wp14:anchorId="616644BC" wp14:editId="3B856BB6">
+            <wp:extent cx="5760085" cy="2093595"/>
+            <wp:effectExtent l="0" t="0" r="0" b="1905"/>
+            <wp:docPr id="798550529" name="Hình ảnh 1"/>
+            <wp:cNvGraphicFramePr>
+              <a:graphicFrameLocks xmlns:a="http://schemas.openxmlformats.org/drawingml/2006/main" noChangeAspect="1"/>
+            </wp:cNvGraphicFramePr>
+            <a:graphic xmlns:a="http://schemas.openxmlformats.org/drawingml/2006/main">
+              <a:graphicData uri="http://schemas.openxmlformats.org/drawingml/2006/picture">
+                <pic:pic xmlns:pic="http://schemas.openxmlformats.org/drawingml/2006/picture">
+                  <pic:nvPicPr>
+                    <pic:cNvPr id="798550529" name=""/>
+                    <pic:cNvPicPr/>
+                  </pic:nvPicPr>
+                  <pic:blipFill>
+                    <a:blip r:embed="rId14"/>
+                    <a:stretch>
+                      <a:fillRect/>
+                    </a:stretch>
+                  </pic:blipFill>
+                  <pic:spPr>
+                    <a:xfrm>
+                      <a:off x="0" y="0"/>
+                      <a:ext cx="5760085" cy="2093595"/>
+                    </a:xfrm>
+                    <a:prstGeom prst="rect">
+                      <a:avLst/>
+                    </a:prstGeom>
+                  </pic:spPr>
+                </pic:pic>
+              </a:graphicData>
+            </a:graphic>
+          </wp:inline>
+        </w:drawing>
+      </w:r>
+    </w:p>
+    <w:p>
+      <w:pPr>
+        <w:ind w:firstLine="0"/>
+        <w:jc w:val="center"/>
+        <w:rPr>
+          <w:szCs w:val="26"/>
+        </w:rPr>
+      </w:pPr>
+      <w:r>
+        <w:rPr>
+          <w:szCs w:val="26"/>
+        </w:rPr>
+        <w:t>WordEmbedding + SVM</w:t>
+      </w:r>
     </w:p>
     <w:p>
       <w:pPr>
@@ -14156,6 +14350,7 @@
         <w:rPr>
           <w:noProof/>
         </w:rPr>
+        <w:lastRenderedPageBreak/>
         <w:drawing>
           <wp:inline distT="0" distB="0" distL="0" distR="0" wp14:anchorId="60B496D1" wp14:editId="51D9C173">
             <wp:extent cx="5760085" cy="1834515"/>
@@ -14172,7 +14367,7 @@
                     <pic:cNvPicPr/>
                   </pic:nvPicPr>
                   <pic:blipFill>
-                    <a:blip r:embed="rId13"/>
+                    <a:blip r:embed="rId15"/>
                     <a:stretch>
                       <a:fillRect/>
                     </a:stretch>
@@ -14195,11 +14390,18 @@
     </w:p>
     <w:p>
       <w:pPr>
-        <w:jc w:val="left"/>
-        <w:rPr>
-          <w:szCs w:val="26"/>
-        </w:rPr>
-      </w:pPr>
+        <w:ind w:firstLine="0"/>
+        <w:jc w:val="center"/>
+        <w:rPr>
+          <w:szCs w:val="26"/>
+        </w:rPr>
+      </w:pPr>
+      <w:r>
+        <w:rPr>
+          <w:szCs w:val="26"/>
+        </w:rPr>
+        <w:t>PhoBERT</w:t>
+      </w:r>
     </w:p>
     <w:p>
       <w:pPr>
@@ -14301,7 +14503,6 @@
         <w:rPr>
           <w:noProof/>
         </w:rPr>
-        <w:lastRenderedPageBreak/>
         <w:drawing>
           <wp:inline distT="0" distB="0" distL="0" distR="0" wp14:anchorId="117AD080" wp14:editId="74C6A844">
             <wp:extent cx="5760085" cy="3230245"/>
@@ -14318,7 +14519,7 @@
                     <pic:cNvPicPr/>
                   </pic:nvPicPr>
                   <pic:blipFill>
-                    <a:blip r:embed="rId14"/>
+                    <a:blip r:embed="rId16"/>
                     <a:stretch>
                       <a:fillRect/>
                     </a:stretch>
@@ -14360,6 +14561,7 @@
         <w:rPr>
           <w:szCs w:val="26"/>
         </w:rPr>
+        <w:lastRenderedPageBreak/>
         <w:tab/>
       </w:r>
       <w:r>
@@ -14383,7 +14585,7 @@
                     <pic:cNvPicPr/>
                   </pic:nvPicPr>
                   <pic:blipFill>
-                    <a:blip r:embed="rId15"/>
+                    <a:blip r:embed="rId17"/>
                     <a:stretch>
                       <a:fillRect/>
                     </a:stretch>
@@ -14450,7 +14652,6 @@
         <w:rPr>
           <w:noProof/>
         </w:rPr>
-        <w:lastRenderedPageBreak/>
         <w:drawing>
           <wp:inline distT="0" distB="0" distL="0" distR="0" wp14:anchorId="6039A678" wp14:editId="1F184844">
             <wp:extent cx="5760085" cy="4537075"/>
@@ -14467,7 +14668,7 @@
                     <pic:cNvPicPr/>
                   </pic:nvPicPr>
                   <pic:blipFill>
-                    <a:blip r:embed="rId16"/>
+                    <a:blip r:embed="rId18"/>
                     <a:stretch>
                       <a:fillRect/>
                     </a:stretch>
@@ -14507,6 +14708,7 @@
         <w:rPr>
           <w:szCs w:val="26"/>
         </w:rPr>
+        <w:lastRenderedPageBreak/>
         <w:t>Confusion Matrix (Ma trận nhầm lẫn)</w:t>
       </w:r>
     </w:p>
@@ -14521,13 +14723,20 @@
     <w:p>
       <w:pPr>
         <w:ind w:firstLine="0"/>
-        <w:rPr>
-          <w:szCs w:val="26"/>
-        </w:rPr>
-      </w:pPr>
-      <w:r>
-        <w:rPr>
-          <w:szCs w:val="26"/>
+        <w:jc w:val="center"/>
+        <w:rPr>
+          <w:b/>
+          <w:bCs/>
+          <w:sz w:val="40"/>
+          <w:szCs w:val="40"/>
+        </w:rPr>
+      </w:pPr>
+      <w:r>
+        <w:rPr>
+          <w:b/>
+          <w:bCs/>
+          <w:sz w:val="40"/>
+          <w:szCs w:val="40"/>
         </w:rPr>
         <w:t>Triển khai bằng ứng dụng web Flask</w:t>
       </w:r>
@@ -14548,29 +14757,21 @@
     </w:p>
     <w:p>
       <w:pPr>
-        <w:tabs>
-          <w:tab w:val="left" w:pos="1704"/>
-        </w:tabs>
         <w:ind w:firstLine="0"/>
         <w:rPr>
-          <w:b/>
-          <w:bCs/>
-          <w:szCs w:val="26"/>
-        </w:rPr>
-      </w:pPr>
-      <w:r>
-        <w:rPr>
-          <w:b/>
-          <w:bCs/>
+          <w:szCs w:val="26"/>
+        </w:rPr>
+      </w:pPr>
+      <w:r>
+        <w:rPr>
           <w:noProof/>
           <w:szCs w:val="26"/>
         </w:rPr>
-        <w:lastRenderedPageBreak/>
         <w:drawing>
-          <wp:inline distT="0" distB="0" distL="0" distR="0" wp14:anchorId="32DE2891" wp14:editId="27C4440C">
-            <wp:extent cx="5760085" cy="5228590"/>
-            <wp:effectExtent l="0" t="0" r="0" b="0"/>
-            <wp:docPr id="1057639137" name="Hình ảnh 1"/>
+          <wp:inline distT="0" distB="0" distL="0" distR="0" wp14:anchorId="7379FDF8" wp14:editId="7B5F2F26">
+            <wp:extent cx="5760085" cy="2390140"/>
+            <wp:effectExtent l="0" t="0" r="3175" b="0"/>
+            <wp:docPr id="1207280824" name="Hình ảnh 1"/>
             <wp:cNvGraphicFramePr>
               <a:graphicFrameLocks xmlns:a="http://schemas.openxmlformats.org/drawingml/2006/main" noChangeAspect="1"/>
             </wp:cNvGraphicFramePr>
@@ -14578,11 +14779,11 @@
               <a:graphicData uri="http://schemas.openxmlformats.org/drawingml/2006/picture">
                 <pic:pic xmlns:pic="http://schemas.openxmlformats.org/drawingml/2006/picture">
                   <pic:nvPicPr>
-                    <pic:cNvPr id="1057639137" name=""/>
+                    <pic:cNvPr id="1207280824" name=""/>
                     <pic:cNvPicPr/>
                   </pic:nvPicPr>
                   <pic:blipFill>
-                    <a:blip r:embed="rId17"/>
+                    <a:blip r:embed="rId19"/>
                     <a:stretch>
                       <a:fillRect/>
                     </a:stretch>
@@ -14590,7 +14791,7 @@
                   <pic:spPr>
                     <a:xfrm>
                       <a:off x="0" y="0"/>
-                      <a:ext cx="5760085" cy="5228590"/>
+                      <a:ext cx="5760085" cy="2390140"/>
                     </a:xfrm>
                     <a:prstGeom prst="rect">
                       <a:avLst/>
@@ -14605,6 +14806,7 @@
     </w:p>
     <w:p>
       <w:pPr>
+        <w:ind w:firstLine="0"/>
         <w:rPr>
           <w:b/>
           <w:bCs/>
@@ -14635,6 +14837,63 @@
       </w:pPr>
       <w:r>
         <w:rPr>
+          <w:noProof/>
+          <w:szCs w:val="26"/>
+        </w:rPr>
+        <w:drawing>
+          <wp:inline distT="0" distB="0" distL="0" distR="0" wp14:anchorId="420101DD" wp14:editId="56CA89FF">
+            <wp:extent cx="5760085" cy="2607945"/>
+            <wp:effectExtent l="0" t="0" r="0" b="1905"/>
+            <wp:docPr id="112661151" name="Hình ảnh 1"/>
+            <wp:cNvGraphicFramePr>
+              <a:graphicFrameLocks xmlns:a="http://schemas.openxmlformats.org/drawingml/2006/main" noChangeAspect="1"/>
+            </wp:cNvGraphicFramePr>
+            <a:graphic xmlns:a="http://schemas.openxmlformats.org/drawingml/2006/main">
+              <a:graphicData uri="http://schemas.openxmlformats.org/drawingml/2006/picture">
+                <pic:pic xmlns:pic="http://schemas.openxmlformats.org/drawingml/2006/picture">
+                  <pic:nvPicPr>
+                    <pic:cNvPr id="112661151" name=""/>
+                    <pic:cNvPicPr/>
+                  </pic:nvPicPr>
+                  <pic:blipFill>
+                    <a:blip r:embed="rId20"/>
+                    <a:stretch>
+                      <a:fillRect/>
+                    </a:stretch>
+                  </pic:blipFill>
+                  <pic:spPr>
+                    <a:xfrm>
+                      <a:off x="0" y="0"/>
+                      <a:ext cx="5760085" cy="2607945"/>
+                    </a:xfrm>
+                    <a:prstGeom prst="rect">
+                      <a:avLst/>
+                    </a:prstGeom>
+                  </pic:spPr>
+                </pic:pic>
+              </a:graphicData>
+            </a:graphic>
+          </wp:inline>
+        </w:drawing>
+      </w:r>
+    </w:p>
+    <w:p>
+      <w:pPr>
+        <w:ind w:firstLine="0"/>
+        <w:rPr>
+          <w:szCs w:val="26"/>
+        </w:rPr>
+      </w:pPr>
+    </w:p>
+    <w:p>
+      <w:pPr>
+        <w:ind w:firstLine="0"/>
+        <w:rPr>
+          <w:szCs w:val="26"/>
+        </w:rPr>
+      </w:pPr>
+      <w:r>
+        <w:rPr>
           <w:szCs w:val="26"/>
         </w:rPr>
         <w:t>Trang About</w:t>
@@ -14642,6 +14901,56 @@
     </w:p>
     <w:p>
       <w:pPr>
+        <w:ind w:firstLine="0"/>
+        <w:rPr>
+          <w:szCs w:val="26"/>
+        </w:rPr>
+      </w:pPr>
+      <w:r>
+        <w:rPr>
+          <w:noProof/>
+          <w:szCs w:val="26"/>
+        </w:rPr>
+        <w:lastRenderedPageBreak/>
+        <w:drawing>
+          <wp:inline distT="0" distB="0" distL="0" distR="0" wp14:anchorId="6D151C3B" wp14:editId="5E83E8DE">
+            <wp:extent cx="5760085" cy="2590165"/>
+            <wp:effectExtent l="0" t="0" r="0" b="635"/>
+            <wp:docPr id="1654178937" name="Hình ảnh 1"/>
+            <wp:cNvGraphicFramePr>
+              <a:graphicFrameLocks xmlns:a="http://schemas.openxmlformats.org/drawingml/2006/main" noChangeAspect="1"/>
+            </wp:cNvGraphicFramePr>
+            <a:graphic xmlns:a="http://schemas.openxmlformats.org/drawingml/2006/main">
+              <a:graphicData uri="http://schemas.openxmlformats.org/drawingml/2006/picture">
+                <pic:pic xmlns:pic="http://schemas.openxmlformats.org/drawingml/2006/picture">
+                  <pic:nvPicPr>
+                    <pic:cNvPr id="1654178937" name=""/>
+                    <pic:cNvPicPr/>
+                  </pic:nvPicPr>
+                  <pic:blipFill>
+                    <a:blip r:embed="rId21"/>
+                    <a:stretch>
+                      <a:fillRect/>
+                    </a:stretch>
+                  </pic:blipFill>
+                  <pic:spPr>
+                    <a:xfrm>
+                      <a:off x="0" y="0"/>
+                      <a:ext cx="5760085" cy="2590165"/>
+                    </a:xfrm>
+                    <a:prstGeom prst="rect">
+                      <a:avLst/>
+                    </a:prstGeom>
+                  </pic:spPr>
+                </pic:pic>
+              </a:graphicData>
+            </a:graphic>
+          </wp:inline>
+        </w:drawing>
+      </w:r>
+    </w:p>
+    <w:p>
+      <w:pPr>
         <w:rPr>
           <w:b/>
           <w:bCs/>
@@ -14651,12 +14960,66 @@
     </w:p>
     <w:p>
       <w:pPr>
-        <w:rPr>
-          <w:b/>
-          <w:bCs/>
-          <w:szCs w:val="26"/>
-        </w:rPr>
-      </w:pPr>
+        <w:ind w:firstLine="0"/>
+        <w:rPr>
+          <w:szCs w:val="26"/>
+        </w:rPr>
+      </w:pPr>
+      <w:r>
+        <w:rPr>
+          <w:szCs w:val="26"/>
+        </w:rPr>
+        <w:t>Lịch sử kiểm tra</w:t>
+      </w:r>
+    </w:p>
+    <w:p>
+      <w:pPr>
+        <w:ind w:firstLine="0"/>
+        <w:rPr>
+          <w:szCs w:val="26"/>
+        </w:rPr>
+      </w:pPr>
+      <w:r>
+        <w:rPr>
+          <w:noProof/>
+          <w:szCs w:val="26"/>
+        </w:rPr>
+        <w:drawing>
+          <wp:inline distT="0" distB="0" distL="0" distR="0" wp14:anchorId="3F7E08AF" wp14:editId="3704C4D1">
+            <wp:extent cx="5760085" cy="1979295"/>
+            <wp:effectExtent l="0" t="0" r="0" b="1905"/>
+            <wp:docPr id="210740412" name="Hình ảnh 1"/>
+            <wp:cNvGraphicFramePr>
+              <a:graphicFrameLocks xmlns:a="http://schemas.openxmlformats.org/drawingml/2006/main" noChangeAspect="1"/>
+            </wp:cNvGraphicFramePr>
+            <a:graphic xmlns:a="http://schemas.openxmlformats.org/drawingml/2006/main">
+              <a:graphicData uri="http://schemas.openxmlformats.org/drawingml/2006/picture">
+                <pic:pic xmlns:pic="http://schemas.openxmlformats.org/drawingml/2006/picture">
+                  <pic:nvPicPr>
+                    <pic:cNvPr id="210740412" name=""/>
+                    <pic:cNvPicPr/>
+                  </pic:nvPicPr>
+                  <pic:blipFill>
+                    <a:blip r:embed="rId22"/>
+                    <a:stretch>
+                      <a:fillRect/>
+                    </a:stretch>
+                  </pic:blipFill>
+                  <pic:spPr>
+                    <a:xfrm>
+                      <a:off x="0" y="0"/>
+                      <a:ext cx="5760085" cy="1979295"/>
+                    </a:xfrm>
+                    <a:prstGeom prst="rect">
+                      <a:avLst/>
+                    </a:prstGeom>
+                  </pic:spPr>
+                </pic:pic>
+              </a:graphicData>
+            </a:graphic>
+          </wp:inline>
+        </w:drawing>
+      </w:r>
     </w:p>
     <w:p>
       <w:pPr>
@@ -14699,6 +15062,107 @@
     </w:p>
     <w:p>
       <w:pPr>
+        <w:tabs>
+          <w:tab w:val="left" w:pos="564"/>
+          <w:tab w:val="center" w:pos="4535"/>
+        </w:tabs>
+        <w:ind w:firstLine="0"/>
+        <w:jc w:val="left"/>
+        <w:rPr>
+          <w:b/>
+          <w:bCs/>
+          <w:szCs w:val="26"/>
+        </w:rPr>
+      </w:pPr>
+    </w:p>
+    <w:p>
+      <w:pPr>
+        <w:tabs>
+          <w:tab w:val="left" w:pos="564"/>
+          <w:tab w:val="center" w:pos="4535"/>
+        </w:tabs>
+        <w:ind w:firstLine="0"/>
+        <w:jc w:val="left"/>
+        <w:rPr>
+          <w:b/>
+          <w:bCs/>
+          <w:szCs w:val="26"/>
+        </w:rPr>
+      </w:pPr>
+      <w:r>
+        <w:rPr>
+          <w:b/>
+          <w:bCs/>
+          <w:szCs w:val="26"/>
+        </w:rPr>
+        <w:tab/>
+      </w:r>
+    </w:p>
+    <w:p>
+      <w:pPr>
+        <w:tabs>
+          <w:tab w:val="left" w:pos="564"/>
+          <w:tab w:val="center" w:pos="4535"/>
+        </w:tabs>
+        <w:ind w:firstLine="0"/>
+        <w:jc w:val="left"/>
+        <w:rPr>
+          <w:b/>
+          <w:bCs/>
+          <w:szCs w:val="26"/>
+        </w:rPr>
+      </w:pPr>
+    </w:p>
+    <w:p>
+      <w:pPr>
+        <w:tabs>
+          <w:tab w:val="left" w:pos="564"/>
+          <w:tab w:val="center" w:pos="4535"/>
+        </w:tabs>
+        <w:ind w:firstLine="0"/>
+        <w:jc w:val="left"/>
+        <w:rPr>
+          <w:b/>
+          <w:bCs/>
+          <w:szCs w:val="26"/>
+        </w:rPr>
+      </w:pPr>
+    </w:p>
+    <w:p>
+      <w:pPr>
+        <w:tabs>
+          <w:tab w:val="left" w:pos="564"/>
+          <w:tab w:val="center" w:pos="4535"/>
+        </w:tabs>
+        <w:ind w:firstLine="0"/>
+        <w:jc w:val="left"/>
+        <w:rPr>
+          <w:b/>
+          <w:bCs/>
+          <w:szCs w:val="26"/>
+        </w:rPr>
+      </w:pPr>
+    </w:p>
+    <w:p>
+      <w:pPr>
+        <w:tabs>
+          <w:tab w:val="left" w:pos="564"/>
+          <w:tab w:val="center" w:pos="4535"/>
+        </w:tabs>
+        <w:ind w:firstLine="0"/>
+        <w:rPr>
+          <w:b/>
+          <w:bCs/>
+          <w:szCs w:val="26"/>
+        </w:rPr>
+      </w:pPr>
+    </w:p>
+    <w:p>
+      <w:pPr>
+        <w:tabs>
+          <w:tab w:val="left" w:pos="564"/>
+          <w:tab w:val="center" w:pos="4535"/>
+        </w:tabs>
         <w:ind w:firstLine="0"/>
         <w:jc w:val="center"/>
         <w:rPr>
@@ -14707,45 +15171,13 @@
           <w:szCs w:val="26"/>
         </w:rPr>
       </w:pPr>
-    </w:p>
-    <w:p>
-      <w:pPr>
-        <w:ind w:firstLine="0"/>
-        <w:jc w:val="center"/>
+      <w:r>
         <w:rPr>
           <w:b/>
           <w:bCs/>
           <w:szCs w:val="26"/>
         </w:rPr>
-      </w:pPr>
-    </w:p>
-    <w:p>
-      <w:pPr>
-        <w:ind w:firstLine="0"/>
-        <w:jc w:val="center"/>
-        <w:rPr>
-          <w:b/>
-          <w:bCs/>
-          <w:szCs w:val="26"/>
-        </w:rPr>
-      </w:pPr>
-    </w:p>
-    <w:p>
-      <w:pPr>
-        <w:ind w:firstLine="0"/>
-        <w:jc w:val="center"/>
-        <w:rPr>
-          <w:b/>
-          <w:bCs/>
-          <w:szCs w:val="26"/>
-        </w:rPr>
-      </w:pPr>
-      <w:r>
-        <w:rPr>
-          <w:b/>
-          <w:bCs/>
-          <w:szCs w:val="26"/>
-        </w:rPr>
+        <w:lastRenderedPageBreak/>
         <w:t>CHƯƠNG 5: THẢO LUẬN, KẾT LUẬN VÀ HƯỚNG PHÁT TRIỂN</w:t>
       </w:r>
     </w:p>

</xml_diff>

<commit_message>
cập nhật báo cáo 1
</commit_message>
<xml_diff>
--- a/BaoCaoDATN_TranDoanAnh.docx
+++ b/BaoCaoDATN_TranDoanAnh.docx
@@ -11825,7 +11825,23 @@
           <w:sz w:val="28"/>
           <w:szCs w:val="28"/>
         </w:rPr>
-        <w:t>Việc phát hiện tin giả bằng phương pháp thủ công là rất khó khăn do khối lượng dữ liệu lớn và tốc độ lan truyền nhanh. Do đó, việc xây dựng một hệ thống tự động nhận diện tin giả dựa trên các kỹ thuật xử lý ngôn ngữ tự nhiên (NLP) và học máy là cần thiết.</w:t>
+        <w:t xml:space="preserve">Việc phát hiện tin giả bằng phương pháp thủ công là rất khó khăn do khối lượng dữ liệu lớn và tốc độ lan truyền nhanh. Do đó, việc xây dựng một hệ thống tự động nhận diện tin giả dựa trên các kỹ thuật xử lý ngôn ngữ tự nhiên (NLP) và học </w:t>
+      </w:r>
+      <w:r>
+        <w:rPr>
+          <w:rFonts w:eastAsia="Times New Roman" w:cs="Times New Roman"/>
+          <w:sz w:val="28"/>
+          <w:szCs w:val="28"/>
+        </w:rPr>
+        <w:t xml:space="preserve">sâu (Deep Learning) </w:t>
+      </w:r>
+      <w:r>
+        <w:rPr>
+          <w:rFonts w:eastAsia="Times New Roman" w:cs="Times New Roman"/>
+          <w:sz w:val="28"/>
+          <w:szCs w:val="28"/>
+        </w:rPr>
+        <w:t>là cần thiết.</w:t>
       </w:r>
     </w:p>
     <w:p>
@@ -14256,21 +14272,932 @@
     </w:p>
     <w:p>
       <w:pPr>
+        <w:spacing w:before="100" w:beforeAutospacing="1" w:after="100" w:afterAutospacing="1" w:line="240" w:lineRule="auto"/>
         <w:ind w:firstLine="0"/>
-        <w:rPr>
-          <w:szCs w:val="26"/>
-        </w:rPr>
-      </w:pPr>
-      <w:r>
-        <w:rPr>
-          <w:szCs w:val="26"/>
-        </w:rPr>
-        <w:t>Trang dự đoán</w:t>
-      </w:r>
-    </w:p>
-    <w:p>
-      <w:pPr>
+        <w:jc w:val="left"/>
+        <w:outlineLvl w:val="1"/>
+        <w:rPr>
+          <w:rFonts w:eastAsia="Times New Roman" w:cs="Times New Roman"/>
+          <w:b/>
+          <w:bCs/>
+          <w:szCs w:val="26"/>
+        </w:rPr>
+      </w:pPr>
+      <w:r>
+        <w:rPr>
+          <w:rFonts w:eastAsia="Times New Roman" w:cs="Times New Roman"/>
+          <w:b/>
+          <w:bCs/>
+          <w:szCs w:val="26"/>
+        </w:rPr>
+        <w:t>1</w:t>
+      </w:r>
+      <w:r>
+        <w:rPr>
+          <w:rFonts w:eastAsia="Times New Roman" w:cs="Times New Roman"/>
+          <w:b/>
+          <w:bCs/>
+          <w:sz w:val="36"/>
+          <w:szCs w:val="36"/>
+        </w:rPr>
+        <w:t xml:space="preserve">. </w:t>
+      </w:r>
+      <w:r>
+        <w:rPr>
+          <w:rFonts w:eastAsia="Times New Roman" w:cs="Times New Roman"/>
+          <w:b/>
+          <w:bCs/>
+          <w:szCs w:val="26"/>
+        </w:rPr>
+        <w:t>Yêu cầu hệ thống</w:t>
+      </w:r>
+    </w:p>
+    <w:p>
+      <w:pPr>
+        <w:spacing w:before="100" w:beforeAutospacing="1" w:after="100" w:afterAutospacing="1" w:line="240" w:lineRule="auto"/>
         <w:ind w:firstLine="0"/>
+        <w:jc w:val="left"/>
+        <w:rPr>
+          <w:rFonts w:eastAsia="Times New Roman" w:cs="Times New Roman"/>
+          <w:szCs w:val="26"/>
+        </w:rPr>
+      </w:pPr>
+      <w:r>
+        <w:rPr>
+          <w:rFonts w:eastAsia="Times New Roman" w:cs="Times New Roman"/>
+          <w:szCs w:val="26"/>
+        </w:rPr>
+        <w:t>Trước khi chạy ứng dụng, cần cài đặt:</w:t>
+      </w:r>
+    </w:p>
+    <w:p>
+      <w:pPr>
+        <w:numPr>
+          <w:ilvl w:val="0"/>
+          <w:numId w:val="15"/>
+        </w:numPr>
+        <w:spacing w:before="100" w:beforeAutospacing="1" w:after="100" w:afterAutospacing="1"/>
+        <w:jc w:val="left"/>
+        <w:rPr>
+          <w:rFonts w:eastAsia="Times New Roman" w:cs="Times New Roman"/>
+          <w:szCs w:val="26"/>
+        </w:rPr>
+      </w:pPr>
+      <w:r>
+        <w:rPr>
+          <w:rFonts w:eastAsia="Times New Roman" w:cs="Times New Roman"/>
+          <w:szCs w:val="26"/>
+        </w:rPr>
+        <w:t xml:space="preserve">Python 3.10 trở lên </w:t>
+      </w:r>
+    </w:p>
+    <w:p>
+      <w:pPr>
+        <w:numPr>
+          <w:ilvl w:val="0"/>
+          <w:numId w:val="15"/>
+        </w:numPr>
+        <w:spacing w:before="100" w:beforeAutospacing="1" w:after="100" w:afterAutospacing="1"/>
+        <w:jc w:val="left"/>
+        <w:rPr>
+          <w:rFonts w:eastAsia="Times New Roman" w:cs="Times New Roman"/>
+          <w:szCs w:val="26"/>
+        </w:rPr>
+      </w:pPr>
+      <w:r>
+        <w:rPr>
+          <w:rFonts w:eastAsia="Times New Roman" w:cs="Times New Roman"/>
+          <w:szCs w:val="26"/>
+        </w:rPr>
+        <w:t xml:space="preserve">pip </w:t>
+      </w:r>
+    </w:p>
+    <w:p>
+      <w:pPr>
+        <w:numPr>
+          <w:ilvl w:val="0"/>
+          <w:numId w:val="15"/>
+        </w:numPr>
+        <w:spacing w:before="100" w:beforeAutospacing="1" w:after="100" w:afterAutospacing="1"/>
+        <w:jc w:val="left"/>
+        <w:rPr>
+          <w:rFonts w:eastAsia="Times New Roman" w:cs="Times New Roman"/>
+          <w:szCs w:val="26"/>
+        </w:rPr>
+      </w:pPr>
+      <w:r>
+        <w:rPr>
+          <w:rFonts w:eastAsia="Times New Roman" w:cs="Times New Roman"/>
+          <w:szCs w:val="26"/>
+        </w:rPr>
+        <w:t xml:space="preserve">Git </w:t>
+      </w:r>
+    </w:p>
+    <w:p>
+      <w:pPr>
+        <w:numPr>
+          <w:ilvl w:val="0"/>
+          <w:numId w:val="15"/>
+        </w:numPr>
+        <w:spacing w:before="100" w:beforeAutospacing="1" w:after="100" w:afterAutospacing="1"/>
+        <w:jc w:val="left"/>
+        <w:rPr>
+          <w:rFonts w:eastAsia="Times New Roman" w:cs="Times New Roman"/>
+          <w:szCs w:val="26"/>
+        </w:rPr>
+      </w:pPr>
+      <w:r>
+        <w:rPr>
+          <w:rFonts w:eastAsia="Times New Roman" w:cs="Times New Roman"/>
+          <w:szCs w:val="26"/>
+        </w:rPr>
+        <w:t xml:space="preserve">Kết nối Internet để tải mô hình PhoBERT lần đầu </w:t>
+      </w:r>
+    </w:p>
+    <w:p>
+      <w:pPr>
+        <w:spacing w:before="100" w:beforeAutospacing="1" w:after="100" w:afterAutospacing="1"/>
+        <w:ind w:firstLine="0"/>
+        <w:jc w:val="left"/>
+        <w:rPr>
+          <w:rFonts w:eastAsia="Times New Roman" w:cs="Times New Roman"/>
+          <w:szCs w:val="26"/>
+        </w:rPr>
+      </w:pPr>
+      <w:r>
+        <w:rPr>
+          <w:rFonts w:eastAsia="Times New Roman" w:cs="Times New Roman"/>
+          <w:szCs w:val="26"/>
+        </w:rPr>
+        <w:t>Khuyến nghị:</w:t>
+      </w:r>
+    </w:p>
+    <w:p>
+      <w:pPr>
+        <w:numPr>
+          <w:ilvl w:val="0"/>
+          <w:numId w:val="16"/>
+        </w:numPr>
+        <w:spacing w:before="100" w:beforeAutospacing="1" w:after="100" w:afterAutospacing="1"/>
+        <w:jc w:val="left"/>
+        <w:rPr>
+          <w:rFonts w:eastAsia="Times New Roman" w:cs="Times New Roman"/>
+          <w:szCs w:val="26"/>
+        </w:rPr>
+      </w:pPr>
+      <w:r>
+        <w:rPr>
+          <w:rFonts w:eastAsia="Times New Roman" w:cs="Times New Roman"/>
+          <w:szCs w:val="26"/>
+        </w:rPr>
+        <w:t xml:space="preserve">RAM tối thiểu: 8GB </w:t>
+      </w:r>
+    </w:p>
+    <w:p>
+      <w:pPr>
+        <w:numPr>
+          <w:ilvl w:val="0"/>
+          <w:numId w:val="16"/>
+        </w:numPr>
+        <w:spacing w:before="100" w:beforeAutospacing="1" w:after="100" w:afterAutospacing="1"/>
+        <w:jc w:val="left"/>
+        <w:rPr>
+          <w:rFonts w:eastAsia="Times New Roman" w:cs="Times New Roman"/>
+          <w:szCs w:val="26"/>
+        </w:rPr>
+      </w:pPr>
+      <w:r>
+        <w:rPr>
+          <w:rFonts w:eastAsia="Times New Roman" w:cs="Times New Roman"/>
+          <w:szCs w:val="26"/>
+        </w:rPr>
+        <w:t>GPU CUDA (nếu muốn tăng tốc suy luận hoặc huấn luyện)</w:t>
+      </w:r>
+    </w:p>
+    <w:p>
+      <w:pPr>
+        <w:pStyle w:val="u1"/>
+        <w:rPr>
+          <w:rFonts w:ascii="Times New Roman" w:hAnsi="Times New Roman" w:cs="Times New Roman"/>
+          <w:b/>
+          <w:bCs/>
+          <w:color w:val="auto"/>
+          <w:sz w:val="26"/>
+          <w:szCs w:val="26"/>
+        </w:rPr>
+      </w:pPr>
+      <w:r>
+        <w:rPr>
+          <w:rFonts w:ascii="Times New Roman" w:hAnsi="Times New Roman" w:cs="Times New Roman"/>
+          <w:b/>
+          <w:bCs/>
+          <w:color w:val="auto"/>
+          <w:sz w:val="26"/>
+          <w:szCs w:val="26"/>
+        </w:rPr>
+        <w:t>2</w:t>
+      </w:r>
+      <w:r>
+        <w:rPr>
+          <w:rFonts w:ascii="Times New Roman" w:hAnsi="Times New Roman" w:cs="Times New Roman"/>
+          <w:b/>
+          <w:bCs/>
+          <w:color w:val="auto"/>
+          <w:sz w:val="26"/>
+          <w:szCs w:val="26"/>
+        </w:rPr>
+        <w:t>. Tạo môi trường ảo (Virtual Environment)</w:t>
+      </w:r>
+    </w:p>
+    <w:p>
+      <w:pPr>
+        <w:pStyle w:val="u2"/>
+        <w:rPr>
+          <w:rFonts w:ascii="Times New Roman" w:hAnsi="Times New Roman" w:cs="Times New Roman"/>
+          <w:color w:val="auto"/>
+          <w:sz w:val="26"/>
+          <w:szCs w:val="26"/>
+        </w:rPr>
+      </w:pPr>
+      <w:r>
+        <w:rPr>
+          <w:rFonts w:ascii="Times New Roman" w:hAnsi="Times New Roman" w:cs="Times New Roman"/>
+          <w:color w:val="auto"/>
+          <w:sz w:val="26"/>
+          <w:szCs w:val="26"/>
+        </w:rPr>
+        <w:t>Windows</w:t>
+      </w:r>
+    </w:p>
+    <w:p>
+      <w:pPr>
+        <w:pStyle w:val="HTMLinhdangtrc"/>
+        <w:numPr>
+          <w:ilvl w:val="0"/>
+          <w:numId w:val="16"/>
+        </w:numPr>
+        <w:rPr>
+          <w:rFonts w:ascii="Times New Roman" w:hAnsi="Times New Roman" w:cs="Times New Roman"/>
+          <w:sz w:val="26"/>
+          <w:szCs w:val="26"/>
+        </w:rPr>
+      </w:pPr>
+      <w:r>
+        <w:rPr>
+          <w:rStyle w:val="MaHTML"/>
+          <w:rFonts w:ascii="Times New Roman" w:hAnsi="Times New Roman" w:cs="Times New Roman"/>
+          <w:sz w:val="26"/>
+          <w:szCs w:val="26"/>
+        </w:rPr>
+        <w:t xml:space="preserve">python </w:t>
+      </w:r>
+      <w:r>
+        <w:rPr>
+          <w:rStyle w:val="n"/>
+          <w:rFonts w:ascii="Times New Roman" w:hAnsi="Times New Roman" w:cs="Times New Roman"/>
+          <w:sz w:val="26"/>
+          <w:szCs w:val="26"/>
+        </w:rPr>
+        <w:t>-m</w:t>
+      </w:r>
+      <w:r>
+        <w:rPr>
+          <w:rStyle w:val="MaHTML"/>
+          <w:rFonts w:ascii="Times New Roman" w:hAnsi="Times New Roman" w:cs="Times New Roman"/>
+          <w:sz w:val="26"/>
+          <w:szCs w:val="26"/>
+        </w:rPr>
+        <w:t xml:space="preserve"> venv venv</w:t>
+      </w:r>
+    </w:p>
+    <w:p>
+      <w:pPr>
+        <w:pStyle w:val="ThngthngWeb"/>
+        <w:rPr>
+          <w:sz w:val="26"/>
+          <w:szCs w:val="26"/>
+        </w:rPr>
+      </w:pPr>
+      <w:r>
+        <w:rPr>
+          <w:sz w:val="26"/>
+          <w:szCs w:val="26"/>
+        </w:rPr>
+        <w:t>Kích hoạt môi trường:</w:t>
+      </w:r>
+    </w:p>
+    <w:p>
+      <w:pPr>
+        <w:pStyle w:val="HTMLinhdangtrc"/>
+        <w:numPr>
+          <w:ilvl w:val="0"/>
+          <w:numId w:val="16"/>
+        </w:numPr>
+        <w:rPr>
+          <w:rFonts w:ascii="Times New Roman" w:hAnsi="Times New Roman" w:cs="Times New Roman"/>
+          <w:sz w:val="26"/>
+          <w:szCs w:val="26"/>
+        </w:rPr>
+      </w:pPr>
+      <w:r>
+        <w:rPr>
+          <w:rStyle w:val="MaHTML"/>
+          <w:rFonts w:ascii="Times New Roman" w:hAnsi="Times New Roman" w:cs="Times New Roman"/>
+          <w:sz w:val="26"/>
+          <w:szCs w:val="26"/>
+        </w:rPr>
+        <w:t>venv\Scripts\activate</w:t>
+      </w:r>
+    </w:p>
+    <w:p>
+      <w:pPr>
+        <w:ind w:firstLine="0"/>
+        <w:rPr>
+          <w:b/>
+          <w:bCs/>
+          <w:sz w:val="40"/>
+          <w:szCs w:val="40"/>
+        </w:rPr>
+      </w:pPr>
+    </w:p>
+    <w:p>
+      <w:pPr>
+        <w:ind w:firstLine="0"/>
+        <w:rPr>
+          <w:b/>
+          <w:bCs/>
+          <w:szCs w:val="26"/>
+        </w:rPr>
+      </w:pPr>
+      <w:r>
+        <w:rPr>
+          <w:b/>
+          <w:bCs/>
+          <w:szCs w:val="26"/>
+        </w:rPr>
+        <w:t>3</w:t>
+      </w:r>
+      <w:r>
+        <w:rPr>
+          <w:b/>
+          <w:bCs/>
+          <w:szCs w:val="26"/>
+        </w:rPr>
+        <w:t>. Cài đặt thư viện</w:t>
+      </w:r>
+    </w:p>
+    <w:p>
+      <w:pPr>
+        <w:ind w:firstLine="0"/>
+        <w:rPr>
+          <w:szCs w:val="26"/>
+        </w:rPr>
+      </w:pPr>
+      <w:r>
+        <w:rPr>
+          <w:szCs w:val="26"/>
+        </w:rPr>
+        <w:t>Cài đặt toàn bộ thư viện cần thiết:</w:t>
+      </w:r>
+    </w:p>
+    <w:p>
+      <w:pPr>
+        <w:pStyle w:val="oancuaDanhsach"/>
+        <w:numPr>
+          <w:ilvl w:val="0"/>
+          <w:numId w:val="16"/>
+        </w:numPr>
+        <w:rPr>
+          <w:szCs w:val="26"/>
+        </w:rPr>
+      </w:pPr>
+      <w:r>
+        <w:rPr>
+          <w:szCs w:val="26"/>
+        </w:rPr>
+        <w:t>pip install -r requirements.txt</w:t>
+      </w:r>
+    </w:p>
+    <w:p>
+      <w:pPr>
+        <w:ind w:firstLine="0"/>
+        <w:rPr>
+          <w:b/>
+          <w:bCs/>
+          <w:szCs w:val="26"/>
+        </w:rPr>
+      </w:pPr>
+    </w:p>
+    <w:p>
+      <w:pPr>
+        <w:ind w:firstLine="0"/>
+        <w:rPr>
+          <w:b/>
+          <w:bCs/>
+          <w:szCs w:val="26"/>
+        </w:rPr>
+      </w:pPr>
+      <w:r>
+        <w:rPr>
+          <w:b/>
+          <w:bCs/>
+          <w:szCs w:val="26"/>
+        </w:rPr>
+        <w:t>4</w:t>
+      </w:r>
+      <w:r>
+        <w:rPr>
+          <w:b/>
+          <w:bCs/>
+          <w:szCs w:val="26"/>
+        </w:rPr>
+        <w:t>. Chuẩn bị mô hình PhoBERT</w:t>
+      </w:r>
+    </w:p>
+    <w:p>
+      <w:pPr>
+        <w:ind w:firstLine="0"/>
+        <w:rPr>
+          <w:szCs w:val="26"/>
+        </w:rPr>
+      </w:pPr>
+      <w:r>
+        <w:rPr>
+          <w:szCs w:val="26"/>
+        </w:rPr>
+        <w:t>Ứng dụng sử dụng mô hình:</w:t>
+      </w:r>
+    </w:p>
+    <w:p>
+      <w:pPr>
+        <w:numPr>
+          <w:ilvl w:val="0"/>
+          <w:numId w:val="17"/>
+        </w:numPr>
+        <w:rPr>
+          <w:szCs w:val="26"/>
+        </w:rPr>
+      </w:pPr>
+      <w:r>
+        <w:rPr>
+          <w:szCs w:val="26"/>
+        </w:rPr>
+        <w:t xml:space="preserve">PhoBERT </w:t>
+      </w:r>
+    </w:p>
+    <w:p>
+      <w:pPr>
+        <w:numPr>
+          <w:ilvl w:val="0"/>
+          <w:numId w:val="17"/>
+        </w:numPr>
+        <w:rPr>
+          <w:szCs w:val="26"/>
+        </w:rPr>
+      </w:pPr>
+      <w:r>
+        <w:rPr>
+          <w:szCs w:val="26"/>
+        </w:rPr>
+        <w:t xml:space="preserve">Fine-tuned cho bài toán nhận diện tin giả tiếng Việt </w:t>
+      </w:r>
+    </w:p>
+    <w:p>
+      <w:pPr>
+        <w:ind w:firstLine="0"/>
+        <w:rPr>
+          <w:szCs w:val="26"/>
+        </w:rPr>
+      </w:pPr>
+    </w:p>
+    <w:p>
+      <w:pPr>
+        <w:ind w:firstLine="0"/>
+        <w:rPr>
+          <w:szCs w:val="26"/>
+        </w:rPr>
+      </w:pPr>
+      <w:r>
+        <w:rPr>
+          <w:szCs w:val="26"/>
+        </w:rPr>
+        <w:lastRenderedPageBreak/>
+        <w:t xml:space="preserve">Thư mục </w:t>
+      </w:r>
+      <w:r>
+        <w:rPr>
+          <w:szCs w:val="26"/>
+        </w:rPr>
+        <w:t xml:space="preserve">model </w:t>
+      </w:r>
+      <w:r>
+        <w:rPr>
+          <w:szCs w:val="26"/>
+        </w:rPr>
+        <w:t>cần chứa:</w:t>
+      </w:r>
+    </w:p>
+    <w:p>
+      <w:pPr>
+        <w:numPr>
+          <w:ilvl w:val="0"/>
+          <w:numId w:val="18"/>
+        </w:numPr>
+        <w:rPr>
+          <w:szCs w:val="26"/>
+        </w:rPr>
+      </w:pPr>
+      <w:r>
+        <w:rPr>
+          <w:szCs w:val="26"/>
+        </w:rPr>
+        <w:t xml:space="preserve">config.json </w:t>
+      </w:r>
+    </w:p>
+    <w:p>
+      <w:pPr>
+        <w:numPr>
+          <w:ilvl w:val="0"/>
+          <w:numId w:val="18"/>
+        </w:numPr>
+        <w:rPr>
+          <w:szCs w:val="26"/>
+        </w:rPr>
+      </w:pPr>
+      <w:r>
+        <w:rPr>
+          <w:szCs w:val="26"/>
+        </w:rPr>
+        <w:t xml:space="preserve">model.safetensors hoặc pytorch_model.bin </w:t>
+      </w:r>
+    </w:p>
+    <w:p>
+      <w:pPr>
+        <w:numPr>
+          <w:ilvl w:val="0"/>
+          <w:numId w:val="18"/>
+        </w:numPr>
+        <w:rPr>
+          <w:szCs w:val="26"/>
+        </w:rPr>
+      </w:pPr>
+      <w:r>
+        <w:rPr>
+          <w:szCs w:val="26"/>
+        </w:rPr>
+        <w:t xml:space="preserve">tokenizer_config.json </w:t>
+      </w:r>
+    </w:p>
+    <w:p>
+      <w:pPr>
+        <w:numPr>
+          <w:ilvl w:val="0"/>
+          <w:numId w:val="18"/>
+        </w:numPr>
+        <w:rPr>
+          <w:szCs w:val="26"/>
+        </w:rPr>
+      </w:pPr>
+      <w:r>
+        <w:rPr>
+          <w:szCs w:val="26"/>
+        </w:rPr>
+        <w:t>vocab.txt</w:t>
+      </w:r>
+    </w:p>
+    <w:p>
+      <w:pPr>
+        <w:ind w:firstLine="0"/>
+        <w:rPr>
+          <w:szCs w:val="26"/>
+        </w:rPr>
+      </w:pPr>
+    </w:p>
+    <w:p>
+      <w:pPr>
+        <w:ind w:firstLine="0"/>
+        <w:rPr>
+          <w:b/>
+          <w:bCs/>
+          <w:szCs w:val="26"/>
+        </w:rPr>
+      </w:pPr>
+      <w:r>
+        <w:rPr>
+          <w:b/>
+          <w:bCs/>
+          <w:szCs w:val="26"/>
+        </w:rPr>
+        <w:t>5</w:t>
+      </w:r>
+      <w:r>
+        <w:rPr>
+          <w:b/>
+          <w:bCs/>
+          <w:szCs w:val="26"/>
+        </w:rPr>
+        <w:t>. Chạy ứng dụng Flask</w:t>
+      </w:r>
+    </w:p>
+    <w:p>
+      <w:pPr>
+        <w:ind w:firstLine="0"/>
+        <w:rPr>
+          <w:szCs w:val="26"/>
+        </w:rPr>
+      </w:pPr>
+      <w:r>
+        <w:rPr>
+          <w:szCs w:val="26"/>
+        </w:rPr>
+        <w:t>Khởi động ứng dụng:</w:t>
+      </w:r>
+    </w:p>
+    <w:p>
+      <w:pPr>
+        <w:pStyle w:val="oancuaDanhsach"/>
+        <w:numPr>
+          <w:ilvl w:val="0"/>
+          <w:numId w:val="18"/>
+        </w:numPr>
+        <w:rPr>
+          <w:szCs w:val="26"/>
+        </w:rPr>
+      </w:pPr>
+      <w:r>
+        <w:rPr>
+          <w:szCs w:val="26"/>
+        </w:rPr>
+        <w:t>python app.py</w:t>
+      </w:r>
+    </w:p>
+    <w:p>
+      <w:pPr>
+        <w:ind w:firstLine="0"/>
+        <w:rPr>
+          <w:szCs w:val="26"/>
+        </w:rPr>
+      </w:pPr>
+      <w:r>
+        <w:rPr>
+          <w:szCs w:val="26"/>
+        </w:rPr>
+        <w:t>Nếu chạy thành công, terminal sẽ hiển thị:</w:t>
+      </w:r>
+    </w:p>
+    <w:p>
+      <w:pPr>
+        <w:pStyle w:val="oancuaDanhsach"/>
+        <w:numPr>
+          <w:ilvl w:val="0"/>
+          <w:numId w:val="18"/>
+        </w:numPr>
+        <w:rPr>
+          <w:szCs w:val="26"/>
+        </w:rPr>
+      </w:pPr>
+      <w:r>
+        <w:rPr>
+          <w:szCs w:val="26"/>
+        </w:rPr>
+        <w:t>Running on http://127.0.0.1:5000</w:t>
+      </w:r>
+    </w:p>
+    <w:p>
+      <w:pPr>
+        <w:ind w:firstLine="0"/>
+        <w:rPr>
+          <w:szCs w:val="26"/>
+        </w:rPr>
+      </w:pPr>
+    </w:p>
+    <w:p>
+      <w:pPr>
+        <w:ind w:firstLine="0"/>
+        <w:rPr>
+          <w:b/>
+          <w:bCs/>
+          <w:szCs w:val="26"/>
+        </w:rPr>
+      </w:pPr>
+      <w:r>
+        <w:rPr>
+          <w:b/>
+          <w:bCs/>
+          <w:szCs w:val="26"/>
+        </w:rPr>
+        <w:t>6</w:t>
+      </w:r>
+      <w:r>
+        <w:rPr>
+          <w:b/>
+          <w:bCs/>
+          <w:szCs w:val="26"/>
+        </w:rPr>
+        <w:t>. Truy cập ứng dụng</w:t>
+      </w:r>
+    </w:p>
+    <w:p>
+      <w:pPr>
+        <w:ind w:firstLine="0"/>
+        <w:rPr>
+          <w:szCs w:val="26"/>
+        </w:rPr>
+      </w:pPr>
+      <w:r>
+        <w:rPr>
+          <w:szCs w:val="26"/>
+        </w:rPr>
+        <w:t>Mở trình duyệt và truy cập:</w:t>
+      </w:r>
+    </w:p>
+    <w:p>
+      <w:pPr>
+        <w:pStyle w:val="oancuaDanhsach"/>
+        <w:numPr>
+          <w:ilvl w:val="0"/>
+          <w:numId w:val="18"/>
+        </w:numPr>
+        <w:rPr>
+          <w:szCs w:val="26"/>
+        </w:rPr>
+      </w:pPr>
+      <w:r>
+        <w:rPr>
+          <w:szCs w:val="26"/>
+        </w:rPr>
+        <w:t>http://127.0.0.1:5000</w:t>
+      </w:r>
+    </w:p>
+    <w:p>
+      <w:pPr>
+        <w:ind w:firstLine="0"/>
+        <w:rPr>
+          <w:szCs w:val="26"/>
+        </w:rPr>
+      </w:pPr>
+    </w:p>
+    <w:p>
+      <w:pPr>
+        <w:ind w:firstLine="0"/>
+        <w:rPr>
+          <w:b/>
+          <w:bCs/>
+          <w:szCs w:val="26"/>
+        </w:rPr>
+      </w:pPr>
+      <w:r>
+        <w:rPr>
+          <w:b/>
+          <w:bCs/>
+          <w:szCs w:val="26"/>
+        </w:rPr>
+        <w:t>7</w:t>
+      </w:r>
+      <w:r>
+        <w:rPr>
+          <w:b/>
+          <w:bCs/>
+          <w:szCs w:val="26"/>
+        </w:rPr>
+        <w:t>. Các chức năng của hệ thống</w:t>
+      </w:r>
+    </w:p>
+    <w:p>
+      <w:pPr>
+        <w:ind w:firstLine="0"/>
+        <w:rPr>
+          <w:b/>
+          <w:bCs/>
+          <w:szCs w:val="26"/>
+        </w:rPr>
+      </w:pPr>
+      <w:r>
+        <w:rPr>
+          <w:b/>
+          <w:bCs/>
+          <w:szCs w:val="26"/>
+        </w:rPr>
+        <w:t>Trang Dự Đoán (/predict)</w:t>
+      </w:r>
+    </w:p>
+    <w:p>
+      <w:pPr>
+        <w:ind w:firstLine="0"/>
+        <w:rPr>
+          <w:szCs w:val="26"/>
+        </w:rPr>
+      </w:pPr>
+      <w:r>
+        <w:rPr>
+          <w:szCs w:val="26"/>
+        </w:rPr>
+        <w:t>Cho phép:</w:t>
+      </w:r>
+    </w:p>
+    <w:p>
+      <w:pPr>
+        <w:numPr>
+          <w:ilvl w:val="0"/>
+          <w:numId w:val="19"/>
+        </w:numPr>
+        <w:rPr>
+          <w:szCs w:val="26"/>
+        </w:rPr>
+      </w:pPr>
+      <w:r>
+        <w:rPr>
+          <w:szCs w:val="26"/>
+        </w:rPr>
+        <w:t xml:space="preserve">nhập nội dung tin tức </w:t>
+      </w:r>
+    </w:p>
+    <w:p>
+      <w:pPr>
+        <w:numPr>
+          <w:ilvl w:val="0"/>
+          <w:numId w:val="19"/>
+        </w:numPr>
+        <w:rPr>
+          <w:szCs w:val="26"/>
+        </w:rPr>
+      </w:pPr>
+      <w:r>
+        <w:rPr>
+          <w:szCs w:val="26"/>
+        </w:rPr>
+        <w:t xml:space="preserve">phân tích bằng mô hình PhoBERT </w:t>
+      </w:r>
+    </w:p>
+    <w:p>
+      <w:pPr>
+        <w:numPr>
+          <w:ilvl w:val="0"/>
+          <w:numId w:val="19"/>
+        </w:numPr>
+        <w:rPr>
+          <w:szCs w:val="26"/>
+        </w:rPr>
+      </w:pPr>
+      <w:r>
+        <w:rPr>
+          <w:szCs w:val="26"/>
+        </w:rPr>
+        <w:t xml:space="preserve">trả về kết quả: </w:t>
+      </w:r>
+    </w:p>
+    <w:p>
+      <w:pPr>
+        <w:numPr>
+          <w:ilvl w:val="1"/>
+          <w:numId w:val="19"/>
+        </w:numPr>
+        <w:rPr>
+          <w:szCs w:val="26"/>
+        </w:rPr>
+      </w:pPr>
+      <w:r>
+        <w:rPr>
+          <w:szCs w:val="26"/>
+        </w:rPr>
+        <w:t xml:space="preserve">Tin Thật </w:t>
+      </w:r>
+    </w:p>
+    <w:p>
+      <w:pPr>
+        <w:numPr>
+          <w:ilvl w:val="1"/>
+          <w:numId w:val="19"/>
+        </w:numPr>
+        <w:rPr>
+          <w:szCs w:val="26"/>
+        </w:rPr>
+      </w:pPr>
+      <w:r>
+        <w:rPr>
+          <w:szCs w:val="26"/>
+        </w:rPr>
+        <w:t>Tin Giả</w:t>
+      </w:r>
+    </w:p>
+    <w:p>
+      <w:pPr>
+        <w:rPr>
+          <w:szCs w:val="26"/>
+        </w:rPr>
+      </w:pPr>
+    </w:p>
+    <w:p>
+      <w:pPr>
+        <w:ind w:firstLine="0"/>
+        <w:rPr>
+          <w:szCs w:val="26"/>
+        </w:rPr>
+      </w:pPr>
+    </w:p>
+    <w:p>
+      <w:pPr>
+        <w:ind w:firstLine="0"/>
         <w:rPr>
           <w:szCs w:val="26"/>
         </w:rPr>
@@ -14280,6 +15207,7 @@
           <w:noProof/>
           <w:szCs w:val="26"/>
         </w:rPr>
+        <w:lastRenderedPageBreak/>
         <w:drawing>
           <wp:inline distT="0" distB="0" distL="0" distR="0" wp14:anchorId="7379FDF8" wp14:editId="7B5F2F26">
             <wp:extent cx="5760085" cy="2390140"/>
@@ -14331,14 +15259,83 @@
       <w:pPr>
         <w:ind w:firstLine="0"/>
         <w:rPr>
-          <w:szCs w:val="26"/>
-        </w:rPr>
-      </w:pPr>
-      <w:r>
-        <w:rPr>
-          <w:szCs w:val="26"/>
-        </w:rPr>
-        <w:t>Trang chủ</w:t>
+          <w:b/>
+          <w:bCs/>
+          <w:szCs w:val="26"/>
+        </w:rPr>
+      </w:pPr>
+      <w:r>
+        <w:rPr>
+          <w:b/>
+          <w:bCs/>
+          <w:szCs w:val="26"/>
+        </w:rPr>
+        <w:t>Trang Chủ (/)</w:t>
+      </w:r>
+    </w:p>
+    <w:p>
+      <w:pPr>
+        <w:ind w:firstLine="0"/>
+        <w:rPr>
+          <w:szCs w:val="26"/>
+        </w:rPr>
+      </w:pPr>
+      <w:r>
+        <w:rPr>
+          <w:szCs w:val="26"/>
+        </w:rPr>
+        <w:t>Hiển thị:</w:t>
+      </w:r>
+    </w:p>
+    <w:p>
+      <w:pPr>
+        <w:numPr>
+          <w:ilvl w:val="0"/>
+          <w:numId w:val="20"/>
+        </w:numPr>
+        <w:rPr>
+          <w:szCs w:val="26"/>
+        </w:rPr>
+      </w:pPr>
+      <w:r>
+        <w:rPr>
+          <w:szCs w:val="26"/>
+        </w:rPr>
+        <w:t xml:space="preserve">giới thiệu hệ thống </w:t>
+      </w:r>
+    </w:p>
+    <w:p>
+      <w:pPr>
+        <w:numPr>
+          <w:ilvl w:val="0"/>
+          <w:numId w:val="20"/>
+        </w:numPr>
+        <w:rPr>
+          <w:szCs w:val="26"/>
+        </w:rPr>
+      </w:pPr>
+      <w:r>
+        <w:rPr>
+          <w:szCs w:val="26"/>
+        </w:rPr>
+        <w:t xml:space="preserve">mô tả chức năng </w:t>
+      </w:r>
+    </w:p>
+    <w:p>
+      <w:pPr>
+        <w:numPr>
+          <w:ilvl w:val="0"/>
+          <w:numId w:val="20"/>
+        </w:numPr>
+        <w:rPr>
+          <w:szCs w:val="26"/>
+        </w:rPr>
+      </w:pPr>
+      <w:r>
+        <w:rPr>
+          <w:szCs w:val="26"/>
+        </w:rPr>
+        <w:t xml:space="preserve">điều hướng tới trang dự đoán </w:t>
       </w:r>
     </w:p>
     <w:p>
@@ -14402,6 +15399,8 @@
       <w:pPr>
         <w:ind w:firstLine="0"/>
         <w:rPr>
+          <w:b/>
+          <w:bCs/>
           <w:szCs w:val="26"/>
         </w:rPr>
       </w:pPr>
@@ -14410,6 +15409,8 @@
       <w:pPr>
         <w:ind w:firstLine="0"/>
         <w:rPr>
+          <w:b/>
+          <w:bCs/>
           <w:szCs w:val="26"/>
         </w:rPr>
       </w:pPr>
@@ -14418,6 +15419,8 @@
       <w:pPr>
         <w:ind w:firstLine="0"/>
         <w:rPr>
+          <w:b/>
+          <w:bCs/>
           <w:szCs w:val="26"/>
         </w:rPr>
       </w:pPr>
@@ -14426,9 +15429,20 @@
       <w:pPr>
         <w:ind w:firstLine="0"/>
         <w:rPr>
-          <w:szCs w:val="26"/>
-        </w:rPr>
-      </w:pPr>
+          <w:b/>
+          <w:bCs/>
+          <w:szCs w:val="26"/>
+        </w:rPr>
+      </w:pPr>
+      <w:r>
+        <w:rPr>
+          <w:b/>
+          <w:bCs/>
+          <w:szCs w:val="26"/>
+        </w:rPr>
+        <w:lastRenderedPageBreak/>
+        <w:t>Trang About (/about)</w:t>
+      </w:r>
     </w:p>
     <w:p>
       <w:pPr>
@@ -14437,20 +15451,79 @@
           <w:szCs w:val="26"/>
         </w:rPr>
       </w:pPr>
-    </w:p>
-    <w:p>
-      <w:pPr>
-        <w:ind w:firstLine="0"/>
-        <w:rPr>
-          <w:szCs w:val="26"/>
-        </w:rPr>
-      </w:pPr>
-      <w:r>
-        <w:rPr>
-          <w:szCs w:val="26"/>
-        </w:rPr>
-        <w:lastRenderedPageBreak/>
-        <w:t>Trang About</w:t>
+      <w:r>
+        <w:rPr>
+          <w:szCs w:val="26"/>
+        </w:rPr>
+        <w:t>Hiển thị:</w:t>
+      </w:r>
+    </w:p>
+    <w:p>
+      <w:pPr>
+        <w:numPr>
+          <w:ilvl w:val="0"/>
+          <w:numId w:val="21"/>
+        </w:numPr>
+        <w:rPr>
+          <w:szCs w:val="26"/>
+        </w:rPr>
+      </w:pPr>
+      <w:r>
+        <w:rPr>
+          <w:szCs w:val="26"/>
+        </w:rPr>
+        <w:t xml:space="preserve">thông tin dự án </w:t>
+      </w:r>
+    </w:p>
+    <w:p>
+      <w:pPr>
+        <w:numPr>
+          <w:ilvl w:val="0"/>
+          <w:numId w:val="21"/>
+        </w:numPr>
+        <w:rPr>
+          <w:szCs w:val="26"/>
+        </w:rPr>
+      </w:pPr>
+      <w:r>
+        <w:rPr>
+          <w:szCs w:val="26"/>
+        </w:rPr>
+        <w:t xml:space="preserve">công nghệ sử dụng </w:t>
+      </w:r>
+    </w:p>
+    <w:p>
+      <w:pPr>
+        <w:numPr>
+          <w:ilvl w:val="0"/>
+          <w:numId w:val="21"/>
+        </w:numPr>
+        <w:rPr>
+          <w:szCs w:val="26"/>
+        </w:rPr>
+      </w:pPr>
+      <w:r>
+        <w:rPr>
+          <w:szCs w:val="26"/>
+        </w:rPr>
+        <w:t>thông số mô hình</w:t>
+      </w:r>
+    </w:p>
+    <w:p>
+      <w:pPr>
+        <w:numPr>
+          <w:ilvl w:val="0"/>
+          <w:numId w:val="21"/>
+        </w:numPr>
+        <w:rPr>
+          <w:szCs w:val="26"/>
+        </w:rPr>
+      </w:pPr>
+      <w:r>
+        <w:rPr>
+          <w:szCs w:val="26"/>
+        </w:rPr>
+        <w:t>pipeline xử lý</w:t>
       </w:r>
     </w:p>
     <w:p>
@@ -14515,14 +15588,58 @@
       <w:pPr>
         <w:ind w:firstLine="0"/>
         <w:rPr>
-          <w:szCs w:val="26"/>
-        </w:rPr>
-      </w:pPr>
-      <w:r>
-        <w:rPr>
+          <w:b/>
+          <w:bCs/>
+          <w:szCs w:val="26"/>
+        </w:rPr>
+      </w:pPr>
+      <w:r>
+        <w:rPr>
+          <w:b/>
+          <w:bCs/>
           <w:szCs w:val="26"/>
         </w:rPr>
         <w:t>Lịch sử kiểm tra</w:t>
+      </w:r>
+      <w:r>
+        <w:rPr>
+          <w:b/>
+          <w:bCs/>
+          <w:szCs w:val="26"/>
+        </w:rPr>
+        <w:t xml:space="preserve"> (/history)</w:t>
+      </w:r>
+    </w:p>
+    <w:p>
+      <w:pPr>
+        <w:ind w:firstLine="0"/>
+        <w:rPr>
+          <w:szCs w:val="26"/>
+        </w:rPr>
+      </w:pPr>
+      <w:r>
+        <w:rPr>
+          <w:szCs w:val="26"/>
+        </w:rPr>
+        <w:t>Hiển thị:</w:t>
+      </w:r>
+    </w:p>
+    <w:p>
+      <w:pPr>
+        <w:pStyle w:val="oancuaDanhsach"/>
+        <w:numPr>
+          <w:ilvl w:val="0"/>
+          <w:numId w:val="21"/>
+        </w:numPr>
+        <w:rPr>
+          <w:szCs w:val="26"/>
+        </w:rPr>
+      </w:pPr>
+      <w:r>
+        <w:rPr>
+          <w:szCs w:val="26"/>
+        </w:rPr>
+        <w:t>Kết quả của các lần kiểm tra</w:t>
       </w:r>
     </w:p>
     <w:p>
@@ -14576,6 +15693,7 @@
     </w:p>
     <w:p>
       <w:pPr>
+        <w:ind w:firstLine="0"/>
         <w:rPr>
           <w:b/>
           <w:bCs/>
@@ -14585,6 +15703,7 @@
     </w:p>
     <w:p>
       <w:pPr>
+        <w:ind w:firstLine="0"/>
         <w:rPr>
           <w:b/>
           <w:bCs/>
@@ -14594,6 +15713,339 @@
     </w:p>
     <w:p>
       <w:pPr>
+        <w:ind w:firstLine="0"/>
+        <w:rPr>
+          <w:b/>
+          <w:bCs/>
+          <w:szCs w:val="26"/>
+        </w:rPr>
+      </w:pPr>
+      <w:r>
+        <w:rPr>
+          <w:b/>
+          <w:bCs/>
+          <w:szCs w:val="26"/>
+        </w:rPr>
+        <w:lastRenderedPageBreak/>
+        <w:t>9. Quy trình dự đoán của hệ thống</w:t>
+      </w:r>
+    </w:p>
+    <w:p>
+      <w:pPr>
+        <w:ind w:firstLine="0"/>
+        <w:rPr>
+          <w:szCs w:val="26"/>
+        </w:rPr>
+      </w:pPr>
+      <w:r>
+        <w:rPr>
+          <w:szCs w:val="26"/>
+        </w:rPr>
+        <w:t>Khi người dùng nhập nội dung:</w:t>
+      </w:r>
+    </w:p>
+    <w:p>
+      <w:pPr>
+        <w:numPr>
+          <w:ilvl w:val="0"/>
+          <w:numId w:val="22"/>
+        </w:numPr>
+        <w:rPr>
+          <w:szCs w:val="26"/>
+        </w:rPr>
+      </w:pPr>
+      <w:r>
+        <w:rPr>
+          <w:szCs w:val="26"/>
+        </w:rPr>
+        <w:t xml:space="preserve">Văn bản được tiền xử lý </w:t>
+      </w:r>
+    </w:p>
+    <w:p>
+      <w:pPr>
+        <w:numPr>
+          <w:ilvl w:val="0"/>
+          <w:numId w:val="22"/>
+        </w:numPr>
+        <w:rPr>
+          <w:szCs w:val="26"/>
+        </w:rPr>
+      </w:pPr>
+      <w:r>
+        <w:rPr>
+          <w:szCs w:val="26"/>
+        </w:rPr>
+        <w:t xml:space="preserve">Tokenizer PhoBERT chuyển văn bản thành token </w:t>
+      </w:r>
+    </w:p>
+    <w:p>
+      <w:pPr>
+        <w:numPr>
+          <w:ilvl w:val="0"/>
+          <w:numId w:val="22"/>
+        </w:numPr>
+        <w:rPr>
+          <w:szCs w:val="26"/>
+        </w:rPr>
+      </w:pPr>
+      <w:r>
+        <w:rPr>
+          <w:szCs w:val="26"/>
+        </w:rPr>
+        <w:t xml:space="preserve">Mô hình PhoBERT thực hiện suy luận </w:t>
+      </w:r>
+    </w:p>
+    <w:p>
+      <w:pPr>
+        <w:numPr>
+          <w:ilvl w:val="0"/>
+          <w:numId w:val="22"/>
+        </w:numPr>
+        <w:rPr>
+          <w:szCs w:val="26"/>
+        </w:rPr>
+      </w:pPr>
+      <w:r>
+        <w:rPr>
+          <w:szCs w:val="26"/>
+        </w:rPr>
+        <w:t>Hệ thống trả về nhãn dự đoán</w:t>
+      </w:r>
+    </w:p>
+    <w:p>
+      <w:pPr>
+        <w:tabs>
+          <w:tab w:val="left" w:pos="1188"/>
+        </w:tabs>
+        <w:ind w:firstLine="0"/>
+        <w:rPr>
+          <w:b/>
+          <w:bCs/>
+          <w:szCs w:val="26"/>
+        </w:rPr>
+      </w:pPr>
+      <w:r>
+        <w:rPr>
+          <w:b/>
+          <w:bCs/>
+          <w:szCs w:val="26"/>
+        </w:rPr>
+        <w:tab/>
+      </w:r>
+    </w:p>
+    <w:p>
+      <w:pPr>
+        <w:tabs>
+          <w:tab w:val="left" w:pos="1188"/>
+        </w:tabs>
+        <w:ind w:firstLine="0"/>
+        <w:rPr>
+          <w:b/>
+          <w:bCs/>
+          <w:szCs w:val="26"/>
+        </w:rPr>
+      </w:pPr>
+    </w:p>
+    <w:p>
+      <w:pPr>
+        <w:tabs>
+          <w:tab w:val="left" w:pos="1188"/>
+        </w:tabs>
+        <w:ind w:firstLine="0"/>
+        <w:rPr>
+          <w:b/>
+          <w:bCs/>
+          <w:szCs w:val="26"/>
+        </w:rPr>
+      </w:pPr>
+    </w:p>
+    <w:p>
+      <w:pPr>
+        <w:tabs>
+          <w:tab w:val="left" w:pos="1188"/>
+        </w:tabs>
+        <w:ind w:firstLine="0"/>
+        <w:rPr>
+          <w:b/>
+          <w:bCs/>
+          <w:szCs w:val="26"/>
+        </w:rPr>
+      </w:pPr>
+    </w:p>
+    <w:p>
+      <w:pPr>
+        <w:tabs>
+          <w:tab w:val="left" w:pos="1188"/>
+        </w:tabs>
+        <w:ind w:firstLine="0"/>
+        <w:rPr>
+          <w:b/>
+          <w:bCs/>
+          <w:szCs w:val="26"/>
+        </w:rPr>
+      </w:pPr>
+    </w:p>
+    <w:p>
+      <w:pPr>
+        <w:tabs>
+          <w:tab w:val="left" w:pos="1188"/>
+        </w:tabs>
+        <w:ind w:firstLine="0"/>
+        <w:rPr>
+          <w:b/>
+          <w:bCs/>
+          <w:szCs w:val="26"/>
+        </w:rPr>
+      </w:pPr>
+    </w:p>
+    <w:p>
+      <w:pPr>
+        <w:tabs>
+          <w:tab w:val="left" w:pos="1188"/>
+        </w:tabs>
+        <w:ind w:firstLine="0"/>
+        <w:rPr>
+          <w:b/>
+          <w:bCs/>
+          <w:szCs w:val="26"/>
+        </w:rPr>
+      </w:pPr>
+    </w:p>
+    <w:p>
+      <w:pPr>
+        <w:tabs>
+          <w:tab w:val="left" w:pos="1188"/>
+        </w:tabs>
+        <w:ind w:firstLine="0"/>
+        <w:rPr>
+          <w:b/>
+          <w:bCs/>
+          <w:szCs w:val="26"/>
+        </w:rPr>
+      </w:pPr>
+    </w:p>
+    <w:p>
+      <w:pPr>
+        <w:tabs>
+          <w:tab w:val="left" w:pos="1188"/>
+        </w:tabs>
+        <w:ind w:firstLine="0"/>
+        <w:rPr>
+          <w:b/>
+          <w:bCs/>
+          <w:szCs w:val="26"/>
+        </w:rPr>
+      </w:pPr>
+    </w:p>
+    <w:p>
+      <w:pPr>
+        <w:tabs>
+          <w:tab w:val="left" w:pos="1188"/>
+        </w:tabs>
+        <w:ind w:firstLine="0"/>
+        <w:rPr>
+          <w:b/>
+          <w:bCs/>
+          <w:szCs w:val="26"/>
+        </w:rPr>
+      </w:pPr>
+    </w:p>
+    <w:p>
+      <w:pPr>
+        <w:tabs>
+          <w:tab w:val="left" w:pos="1188"/>
+        </w:tabs>
+        <w:ind w:firstLine="0"/>
+        <w:rPr>
+          <w:b/>
+          <w:bCs/>
+          <w:szCs w:val="26"/>
+        </w:rPr>
+      </w:pPr>
+    </w:p>
+    <w:p>
+      <w:pPr>
+        <w:tabs>
+          <w:tab w:val="left" w:pos="1188"/>
+        </w:tabs>
+        <w:ind w:firstLine="0"/>
+        <w:rPr>
+          <w:b/>
+          <w:bCs/>
+          <w:szCs w:val="26"/>
+        </w:rPr>
+      </w:pPr>
+    </w:p>
+    <w:p>
+      <w:pPr>
+        <w:tabs>
+          <w:tab w:val="left" w:pos="1188"/>
+        </w:tabs>
+        <w:ind w:firstLine="0"/>
+        <w:rPr>
+          <w:b/>
+          <w:bCs/>
+          <w:szCs w:val="26"/>
+        </w:rPr>
+      </w:pPr>
+    </w:p>
+    <w:p>
+      <w:pPr>
+        <w:tabs>
+          <w:tab w:val="left" w:pos="1188"/>
+        </w:tabs>
+        <w:ind w:firstLine="0"/>
+        <w:rPr>
+          <w:b/>
+          <w:bCs/>
+          <w:szCs w:val="26"/>
+        </w:rPr>
+      </w:pPr>
+    </w:p>
+    <w:p>
+      <w:pPr>
+        <w:tabs>
+          <w:tab w:val="left" w:pos="1188"/>
+        </w:tabs>
+        <w:ind w:firstLine="0"/>
+        <w:rPr>
+          <w:b/>
+          <w:bCs/>
+          <w:szCs w:val="26"/>
+        </w:rPr>
+      </w:pPr>
+    </w:p>
+    <w:p>
+      <w:pPr>
+        <w:tabs>
+          <w:tab w:val="left" w:pos="1188"/>
+        </w:tabs>
+        <w:ind w:firstLine="0"/>
+        <w:rPr>
+          <w:b/>
+          <w:bCs/>
+          <w:szCs w:val="26"/>
+        </w:rPr>
+      </w:pPr>
+    </w:p>
+    <w:p>
+      <w:pPr>
+        <w:tabs>
+          <w:tab w:val="left" w:pos="1188"/>
+        </w:tabs>
+        <w:ind w:firstLine="0"/>
+        <w:rPr>
+          <w:b/>
+          <w:bCs/>
+          <w:szCs w:val="26"/>
+        </w:rPr>
+      </w:pPr>
+    </w:p>
+    <w:p>
+      <w:pPr>
+        <w:tabs>
+          <w:tab w:val="left" w:pos="1188"/>
+        </w:tabs>
         <w:ind w:firstLine="0"/>
         <w:rPr>
           <w:b/>
@@ -14607,105 +16059,6 @@
         <w:ind w:firstLine="0"/>
         <w:jc w:val="center"/>
         <w:rPr>
-          <w:b/>
-          <w:bCs/>
-          <w:szCs w:val="26"/>
-        </w:rPr>
-      </w:pPr>
-    </w:p>
-    <w:p>
-      <w:pPr>
-        <w:tabs>
-          <w:tab w:val="left" w:pos="564"/>
-          <w:tab w:val="center" w:pos="4535"/>
-        </w:tabs>
-        <w:ind w:firstLine="0"/>
-        <w:jc w:val="left"/>
-        <w:rPr>
-          <w:b/>
-          <w:bCs/>
-          <w:szCs w:val="26"/>
-        </w:rPr>
-      </w:pPr>
-    </w:p>
-    <w:p>
-      <w:pPr>
-        <w:tabs>
-          <w:tab w:val="left" w:pos="564"/>
-          <w:tab w:val="center" w:pos="4535"/>
-        </w:tabs>
-        <w:ind w:firstLine="0"/>
-        <w:jc w:val="left"/>
-        <w:rPr>
-          <w:b/>
-          <w:bCs/>
-          <w:szCs w:val="26"/>
-        </w:rPr>
-      </w:pPr>
-      <w:r>
-        <w:rPr>
-          <w:b/>
-          <w:bCs/>
-          <w:szCs w:val="26"/>
-        </w:rPr>
-        <w:tab/>
-      </w:r>
-    </w:p>
-    <w:p>
-      <w:pPr>
-        <w:tabs>
-          <w:tab w:val="left" w:pos="564"/>
-          <w:tab w:val="center" w:pos="4535"/>
-        </w:tabs>
-        <w:ind w:firstLine="0"/>
-        <w:jc w:val="left"/>
-        <w:rPr>
-          <w:b/>
-          <w:bCs/>
-          <w:szCs w:val="26"/>
-        </w:rPr>
-      </w:pPr>
-    </w:p>
-    <w:p>
-      <w:pPr>
-        <w:tabs>
-          <w:tab w:val="left" w:pos="564"/>
-          <w:tab w:val="center" w:pos="4535"/>
-        </w:tabs>
-        <w:ind w:firstLine="0"/>
-        <w:jc w:val="left"/>
-        <w:rPr>
-          <w:b/>
-          <w:bCs/>
-          <w:szCs w:val="26"/>
-        </w:rPr>
-      </w:pPr>
-    </w:p>
-    <w:p>
-      <w:pPr>
-        <w:tabs>
-          <w:tab w:val="left" w:pos="564"/>
-          <w:tab w:val="center" w:pos="4535"/>
-        </w:tabs>
-        <w:ind w:firstLine="0"/>
-        <w:rPr>
-          <w:b/>
-          <w:bCs/>
-          <w:szCs w:val="26"/>
-        </w:rPr>
-      </w:pPr>
-    </w:p>
-    <w:p>
-      <w:pPr>
-        <w:tabs>
-          <w:tab w:val="left" w:pos="564"/>
-          <w:tab w:val="center" w:pos="4535"/>
-        </w:tabs>
-        <w:ind w:firstLine="0"/>
-        <w:jc w:val="center"/>
-        <w:rPr>
-          <w:b/>
-          <w:bCs/>
           <w:szCs w:val="26"/>
         </w:rPr>
       </w:pPr>
@@ -14784,7 +16137,374 @@
         <w:rPr>
           <w:szCs w:val="26"/>
         </w:rPr>
-        <w:t>Đề tài đã xây dựng thành công hệ thống nhận diện tin giả với độ chính xác cao. Mô hình PhoBERT là lựa chọn tối ưu cho bài toán này.</w:t>
+        <w:t>Trong bối cảnh thông tin sai lệch và tin giả ngày càng xuất hiện phổ biến trên Internet và mạng xã hội, đặc biệt đối với các nội dung tiếng Việt, việc xây dựng một hệ thống hỗ trợ phát hiện tin giả tự động là cần thiết và có ý nghĩa thực tiễn cao. Đề tài “</w:t>
+      </w:r>
+      <w:r>
+        <w:rPr>
+          <w:szCs w:val="26"/>
+        </w:rPr>
+        <w:t xml:space="preserve">XÂY DỰNG HỆ THỐNG NHẬN DIỆN TIN GIẢ TIẾNG VIỆT SỬ DỤNG </w:t>
+      </w:r>
+      <w:r>
+        <w:rPr>
+          <w:szCs w:val="26"/>
+        </w:rPr>
+        <w:t>NỀN TẢNG FLASK VÀ MÔ HÌNH NGÔN NGỮ LỚN</w:t>
+      </w:r>
+      <w:r>
+        <w:rPr>
+          <w:szCs w:val="26"/>
+        </w:rPr>
+        <w:t>” đã tập trung nghiên cứu, xây dựng và đánh giá một mô hình học sâu dành cho bài toán phân loại tin tức tiếng Việt thành hai nhóm: tin thật và tin giả.</w:t>
+      </w:r>
+    </w:p>
+    <w:p>
+      <w:pPr>
+        <w:rPr>
+          <w:szCs w:val="26"/>
+        </w:rPr>
+      </w:pPr>
+      <w:r>
+        <w:rPr>
+          <w:szCs w:val="26"/>
+        </w:rPr>
+        <w:t>Trong quá trình thực hiện, đề tài đã tiến hành thu thập và xử lý dữ liệu từ nhiều nguồn khác nhau, xây dựng tập dữ liệu tiếng Việt với gần 45.000 mẫu tin tức phục vụ cho quá trình huấn luyện và đánh giá mô hình. Dữ liệu sau đó được thực hiện các bước tiền xử lý như chuẩn hóa văn bản, loại bỏ ký tự không cần thiết, xử lý stopwords và chuẩn hóa nhãn dữ liệu nhằm nâng cao chất lượng đầu vào cho mô hình.</w:t>
+      </w:r>
+    </w:p>
+    <w:p>
+      <w:pPr>
+        <w:rPr>
+          <w:szCs w:val="26"/>
+        </w:rPr>
+      </w:pPr>
+      <w:r>
+        <w:rPr>
+          <w:szCs w:val="26"/>
+        </w:rPr>
+        <w:t>Đề tài đã nghiên cứu và thử nghiệm nhiều hướng tiếp cận khác nhau, bao gồm:</w:t>
+      </w:r>
+    </w:p>
+    <w:p>
+      <w:pPr>
+        <w:numPr>
+          <w:ilvl w:val="0"/>
+          <w:numId w:val="23"/>
+        </w:numPr>
+        <w:rPr>
+          <w:szCs w:val="26"/>
+        </w:rPr>
+      </w:pPr>
+      <w:r>
+        <w:rPr>
+          <w:szCs w:val="26"/>
+        </w:rPr>
+        <w:t xml:space="preserve">Các phương pháp Machine Learning truyền thống kết hợp TF-IDF như: </w:t>
+      </w:r>
+    </w:p>
+    <w:p>
+      <w:pPr>
+        <w:numPr>
+          <w:ilvl w:val="1"/>
+          <w:numId w:val="23"/>
+        </w:numPr>
+        <w:rPr>
+          <w:szCs w:val="26"/>
+        </w:rPr>
+      </w:pPr>
+      <w:r>
+        <w:rPr>
+          <w:szCs w:val="26"/>
+        </w:rPr>
+        <w:t xml:space="preserve">Naive Bayes </w:t>
+      </w:r>
+    </w:p>
+    <w:p>
+      <w:pPr>
+        <w:numPr>
+          <w:ilvl w:val="1"/>
+          <w:numId w:val="23"/>
+        </w:numPr>
+        <w:rPr>
+          <w:szCs w:val="26"/>
+        </w:rPr>
+      </w:pPr>
+      <w:r>
+        <w:rPr>
+          <w:szCs w:val="26"/>
+        </w:rPr>
+        <w:t xml:space="preserve">Logistic Regression </w:t>
+      </w:r>
+    </w:p>
+    <w:p>
+      <w:pPr>
+        <w:numPr>
+          <w:ilvl w:val="1"/>
+          <w:numId w:val="23"/>
+        </w:numPr>
+        <w:rPr>
+          <w:szCs w:val="26"/>
+        </w:rPr>
+      </w:pPr>
+      <w:r>
+        <w:rPr>
+          <w:szCs w:val="26"/>
+        </w:rPr>
+        <w:t xml:space="preserve">Random Forest </w:t>
+      </w:r>
+    </w:p>
+    <w:p>
+      <w:pPr>
+        <w:numPr>
+          <w:ilvl w:val="1"/>
+          <w:numId w:val="23"/>
+        </w:numPr>
+        <w:rPr>
+          <w:szCs w:val="26"/>
+        </w:rPr>
+      </w:pPr>
+      <w:r>
+        <w:rPr>
+          <w:szCs w:val="26"/>
+        </w:rPr>
+        <w:t xml:space="preserve">SVM </w:t>
+      </w:r>
+    </w:p>
+    <w:p>
+      <w:pPr>
+        <w:numPr>
+          <w:ilvl w:val="0"/>
+          <w:numId w:val="23"/>
+        </w:numPr>
+        <w:rPr>
+          <w:szCs w:val="26"/>
+        </w:rPr>
+      </w:pPr>
+      <w:r>
+        <w:rPr>
+          <w:szCs w:val="26"/>
+        </w:rPr>
+        <w:t xml:space="preserve">Các phương pháp Deep Learning hiện đại sử dụng Word Embedding và Transformer. </w:t>
+      </w:r>
+    </w:p>
+    <w:p>
+      <w:pPr>
+        <w:rPr>
+          <w:szCs w:val="26"/>
+        </w:rPr>
+      </w:pPr>
+      <w:r>
+        <w:rPr>
+          <w:szCs w:val="26"/>
+        </w:rPr>
+        <w:t xml:space="preserve">Kết quả thực nghiệm cho thấy mô hình PhoBERT đạt hiệu quả vượt trội so với các phương pháp truyền thống trong bài toán nhận diện tin giả tiếng Việt. Nhờ được huấn </w:t>
+      </w:r>
+      <w:r>
+        <w:rPr>
+          <w:szCs w:val="26"/>
+        </w:rPr>
+        <w:lastRenderedPageBreak/>
+        <w:t>luyện trước trên lượng lớn dữ liệu tiếng Việt, PhoBERT có khả năng hiểu ngữ nghĩa, ngữ cảnh và đặc trưng ngôn ngữ tiếng Việt tốt hơn đáng kể so với các phương pháp dựa trên bag-of-words hoặc TF-IDF thông thường.</w:t>
+      </w:r>
+    </w:p>
+    <w:p>
+      <w:pPr>
+        <w:rPr>
+          <w:szCs w:val="26"/>
+        </w:rPr>
+      </w:pPr>
+      <w:r>
+        <w:rPr>
+          <w:szCs w:val="26"/>
+        </w:rPr>
+        <w:t>Thông qua quá trình huấn luyện và đánh giá, mô hình đạt độ chính xác cao, khả năng tổng quát hóa tốt và cho kết quả ổn định trên tập kiểm thử. Ngoài ra, đề tài cũng xây dựng thành công hệ thống web sử dụng Flask nhằm hỗ trợ người dùng nhập nội dung tin tức và nhận kết quả dự đoán trực tiếp thông qua giao diện trực quan. Điều này cho thấy mô hình không chỉ có giá trị nghiên cứu mà còn có khả năng ứng dụng thực tế.</w:t>
+      </w:r>
+    </w:p>
+    <w:p>
+      <w:pPr>
+        <w:rPr>
+          <w:szCs w:val="26"/>
+        </w:rPr>
+      </w:pPr>
+      <w:r>
+        <w:rPr>
+          <w:szCs w:val="26"/>
+        </w:rPr>
+        <w:t>Bên cạnh đó, quá trình thực hiện đề tài cũng giúp làm rõ vai trò quan trọng của:</w:t>
+      </w:r>
+    </w:p>
+    <w:p>
+      <w:pPr>
+        <w:numPr>
+          <w:ilvl w:val="0"/>
+          <w:numId w:val="24"/>
+        </w:numPr>
+        <w:rPr>
+          <w:szCs w:val="26"/>
+        </w:rPr>
+      </w:pPr>
+      <w:r>
+        <w:rPr>
+          <w:szCs w:val="26"/>
+        </w:rPr>
+        <w:t xml:space="preserve">chất lượng dữ liệu, </w:t>
+      </w:r>
+    </w:p>
+    <w:p>
+      <w:pPr>
+        <w:numPr>
+          <w:ilvl w:val="0"/>
+          <w:numId w:val="24"/>
+        </w:numPr>
+        <w:rPr>
+          <w:szCs w:val="26"/>
+        </w:rPr>
+      </w:pPr>
+      <w:r>
+        <w:rPr>
+          <w:szCs w:val="26"/>
+        </w:rPr>
+        <w:t xml:space="preserve">quy trình tiền xử lý, </w:t>
+      </w:r>
+    </w:p>
+    <w:p>
+      <w:pPr>
+        <w:numPr>
+          <w:ilvl w:val="0"/>
+          <w:numId w:val="24"/>
+        </w:numPr>
+        <w:rPr>
+          <w:szCs w:val="26"/>
+        </w:rPr>
+      </w:pPr>
+      <w:r>
+        <w:rPr>
+          <w:szCs w:val="26"/>
+        </w:rPr>
+        <w:t xml:space="preserve">lựa chọn phương pháp trích đặc trưng, </w:t>
+      </w:r>
+    </w:p>
+    <w:p>
+      <w:pPr>
+        <w:numPr>
+          <w:ilvl w:val="0"/>
+          <w:numId w:val="24"/>
+        </w:numPr>
+        <w:rPr>
+          <w:szCs w:val="26"/>
+        </w:rPr>
+      </w:pPr>
+      <w:r>
+        <w:rPr>
+          <w:szCs w:val="26"/>
+        </w:rPr>
+        <w:t xml:space="preserve">và mô hình học sâu </w:t>
+      </w:r>
+    </w:p>
+    <w:p>
+      <w:pPr>
+        <w:rPr>
+          <w:szCs w:val="26"/>
+        </w:rPr>
+      </w:pPr>
+      <w:r>
+        <w:rPr>
+          <w:szCs w:val="26"/>
+        </w:rPr>
+        <w:t>đối với hiệu quả của bài toán xử lý ngôn ngữ tự nhiên tiếng Việt.</w:t>
+      </w:r>
+    </w:p>
+    <w:p>
+      <w:pPr>
+        <w:rPr>
+          <w:szCs w:val="26"/>
+        </w:rPr>
+      </w:pPr>
+      <w:r>
+        <w:rPr>
+          <w:szCs w:val="26"/>
+        </w:rPr>
+        <w:t>Nhìn chung, đề tài đã hoàn thành các mục tiêu đề ra:</w:t>
+      </w:r>
+    </w:p>
+    <w:p>
+      <w:pPr>
+        <w:numPr>
+          <w:ilvl w:val="0"/>
+          <w:numId w:val="25"/>
+        </w:numPr>
+        <w:rPr>
+          <w:szCs w:val="26"/>
+        </w:rPr>
+      </w:pPr>
+      <w:r>
+        <w:rPr>
+          <w:szCs w:val="26"/>
+        </w:rPr>
+        <w:t xml:space="preserve">xây dựng được pipeline xử lý dữ liệu hoàn chỉnh, </w:t>
+      </w:r>
+    </w:p>
+    <w:p>
+      <w:pPr>
+        <w:numPr>
+          <w:ilvl w:val="0"/>
+          <w:numId w:val="25"/>
+        </w:numPr>
+        <w:rPr>
+          <w:szCs w:val="26"/>
+        </w:rPr>
+      </w:pPr>
+      <w:r>
+        <w:rPr>
+          <w:szCs w:val="26"/>
+        </w:rPr>
+        <w:t xml:space="preserve">huấn luyện thành công mô hình nhận diện tin giả, </w:t>
+      </w:r>
+    </w:p>
+    <w:p>
+      <w:pPr>
+        <w:numPr>
+          <w:ilvl w:val="0"/>
+          <w:numId w:val="25"/>
+        </w:numPr>
+        <w:rPr>
+          <w:szCs w:val="26"/>
+        </w:rPr>
+      </w:pPr>
+      <w:r>
+        <w:rPr>
+          <w:szCs w:val="26"/>
+        </w:rPr>
+        <w:t xml:space="preserve">đánh giá hiệu quả mô hình, </w:t>
+      </w:r>
+    </w:p>
+    <w:p>
+      <w:pPr>
+        <w:numPr>
+          <w:ilvl w:val="0"/>
+          <w:numId w:val="25"/>
+        </w:numPr>
+        <w:rPr>
+          <w:szCs w:val="26"/>
+        </w:rPr>
+      </w:pPr>
+      <w:r>
+        <w:rPr>
+          <w:szCs w:val="26"/>
+        </w:rPr>
+        <w:t xml:space="preserve">và triển khai demo hệ thống thực tế. </w:t>
+      </w:r>
+    </w:p>
+    <w:p>
+      <w:pPr>
+        <w:rPr>
+          <w:szCs w:val="26"/>
+        </w:rPr>
+      </w:pPr>
+      <w:r>
+        <w:rPr>
+          <w:szCs w:val="26"/>
+        </w:rPr>
+        <w:t>Kết quả của đề tài cho thấy PhoBERT là một hướng tiếp cận phù hợp và hiệu quả cho các bài toán xử lý ngôn ngữ tự nhiên tiếng Việt nói chung và bài toán nhận diện tin giả nói riêng. Đây cũng là nền tảng quan trọng để tiếp tục mở rộng và phát triển các hệ thống phát hiện thông tin sai lệch trong tương lai.</w:t>
       </w:r>
     </w:p>
     <w:p>
@@ -14869,6 +16589,7 @@
           <w:bCs/>
           <w:szCs w:val="26"/>
         </w:rPr>
+        <w:lastRenderedPageBreak/>
         <w:t>5.4 Hướng phát triển</w:t>
       </w:r>
     </w:p>
@@ -15042,6 +16763,155 @@
 <file path=word/numbering.xml><?xml version="1.0" encoding="utf-8"?>
 <w:numbering xmlns:wpc="http://schemas.microsoft.com/office/word/2010/wordprocessingCanvas" xmlns:cx="http://schemas.microsoft.com/office/drawing/2014/chartex" xmlns:cx1="http://schemas.microsoft.com/office/drawing/2015/9/8/chartex" xmlns:cx2="http://schemas.microsoft.com/office/drawing/2015/10/21/chartex" xmlns:cx3="http://schemas.microsoft.com/office/drawing/2016/5/9/chartex" xmlns:cx4="http://schemas.microsoft.com/office/drawing/2016/5/10/chartex" xmlns:cx5="http://schemas.microsoft.com/office/drawing/2016/5/11/chartex" xmlns:cx6="http://schemas.microsoft.com/office/drawing/2016/5/12/chartex" xmlns:cx7="http://schemas.microsoft.com/office/drawing/2016/5/13/chartex" xmlns:cx8="http://schemas.microsoft.com/office/drawing/2016/5/14/chartex" xmlns:mc="http://schemas.openxmlformats.org/markup-compatibility/2006" xmlns:aink="http://schemas.microsoft.com/office/drawing/2016/ink" xmlns:am3d="http://schemas.microsoft.com/office/drawing/2017/model3d" xmlns:o="urn:schemas-microsoft-com:office:office" xmlns:oel="http://schemas.microsoft.com/office/2019/extlst" xmlns:r="http://schemas.openxmlformats.org/officeDocument/2006/relationships" xmlns:m="http://schemas.openxmlformats.org/officeDocument/2006/math" xmlns:v="urn:schemas-microsoft-com:vml" xmlns:wp14="http://schemas.microsoft.com/office/word/2010/wordprocessingDrawing" xmlns:wp="http://schemas.openxmlformats.org/drawingml/2006/wordprocessingDrawing" xmlns:w10="urn:schemas-microsoft-com:office:word" xmlns:w="http://schemas.openxmlformats.org/wordprocessingml/2006/main" xmlns:w14="http://schemas.microsoft.com/office/word/2010/wordml" xmlns:w15="http://schemas.microsoft.com/office/word/2012/wordml" xmlns:w16cex="http://schemas.microsoft.com/office/word/2018/wordml/cex" xmlns:w16cid="http://schemas.microsoft.com/office/word/2016/wordml/cid" xmlns:w16="http://schemas.microsoft.com/office/word/2018/wordml" xmlns:w16du="http://schemas.microsoft.com/office/word/2023/wordml/word16du" xmlns:w16sdtdh="http://schemas.microsoft.com/office/word/2020/wordml/sdtdatahash" xmlns:w16sdtfl="http://schemas.microsoft.com/office/word/2024/wordml/sdtformatlock" xmlns:w16se="http://schemas.microsoft.com/office/word/2015/wordml/symex" xmlns:wpg="http://schemas.microsoft.com/office/word/2010/wordprocessingGroup" xmlns:wpi="http://schemas.microsoft.com/office/word/2010/wordprocessingInk" xmlns:wne="http://schemas.microsoft.com/office/word/2006/wordml" xmlns:wps="http://schemas.microsoft.com/office/word/2010/wordprocessingShape" mc:Ignorable="w14 w15 w16se w16cid w16 w16cex w16sdtdh w16sdtfl w16du wp14">
   <w:abstractNum w:abstractNumId="0" w15:restartNumberingAfterBreak="0">
+    <w:nsid w:val="06D82C20"/>
+    <w:multiLevelType w:val="multilevel"/>
+    <w:tmpl w:val="0666F61C"/>
+    <w:lvl w:ilvl="0">
+      <w:start w:val="1"/>
+      <w:numFmt w:val="bullet"/>
+      <w:lvlText w:val=""/>
+      <w:lvlJc w:val="left"/>
+      <w:pPr>
+        <w:tabs>
+          <w:tab w:val="num" w:pos="720"/>
+        </w:tabs>
+        <w:ind w:left="720" w:hanging="360"/>
+      </w:pPr>
+      <w:rPr>
+        <w:rFonts w:ascii="Symbol" w:hAnsi="Symbol" w:hint="default"/>
+        <w:sz w:val="20"/>
+      </w:rPr>
+    </w:lvl>
+    <w:lvl w:ilvl="1" w:tentative="1">
+      <w:start w:val="1"/>
+      <w:numFmt w:val="bullet"/>
+      <w:lvlText w:val="o"/>
+      <w:lvlJc w:val="left"/>
+      <w:pPr>
+        <w:tabs>
+          <w:tab w:val="num" w:pos="1440"/>
+        </w:tabs>
+        <w:ind w:left="1440" w:hanging="360"/>
+      </w:pPr>
+      <w:rPr>
+        <w:rFonts w:ascii="Courier New" w:hAnsi="Courier New" w:hint="default"/>
+        <w:sz w:val="20"/>
+      </w:rPr>
+    </w:lvl>
+    <w:lvl w:ilvl="2" w:tentative="1">
+      <w:start w:val="1"/>
+      <w:numFmt w:val="bullet"/>
+      <w:lvlText w:val=""/>
+      <w:lvlJc w:val="left"/>
+      <w:pPr>
+        <w:tabs>
+          <w:tab w:val="num" w:pos="2160"/>
+        </w:tabs>
+        <w:ind w:left="2160" w:hanging="360"/>
+      </w:pPr>
+      <w:rPr>
+        <w:rFonts w:ascii="Wingdings" w:hAnsi="Wingdings" w:hint="default"/>
+        <w:sz w:val="20"/>
+      </w:rPr>
+    </w:lvl>
+    <w:lvl w:ilvl="3" w:tentative="1">
+      <w:start w:val="1"/>
+      <w:numFmt w:val="bullet"/>
+      <w:lvlText w:val=""/>
+      <w:lvlJc w:val="left"/>
+      <w:pPr>
+        <w:tabs>
+          <w:tab w:val="num" w:pos="2880"/>
+        </w:tabs>
+        <w:ind w:left="2880" w:hanging="360"/>
+      </w:pPr>
+      <w:rPr>
+        <w:rFonts w:ascii="Wingdings" w:hAnsi="Wingdings" w:hint="default"/>
+        <w:sz w:val="20"/>
+      </w:rPr>
+    </w:lvl>
+    <w:lvl w:ilvl="4" w:tentative="1">
+      <w:start w:val="1"/>
+      <w:numFmt w:val="bullet"/>
+      <w:lvlText w:val=""/>
+      <w:lvlJc w:val="left"/>
+      <w:pPr>
+        <w:tabs>
+          <w:tab w:val="num" w:pos="3600"/>
+        </w:tabs>
+        <w:ind w:left="3600" w:hanging="360"/>
+      </w:pPr>
+      <w:rPr>
+        <w:rFonts w:ascii="Wingdings" w:hAnsi="Wingdings" w:hint="default"/>
+        <w:sz w:val="20"/>
+      </w:rPr>
+    </w:lvl>
+    <w:lvl w:ilvl="5" w:tentative="1">
+      <w:start w:val="1"/>
+      <w:numFmt w:val="bullet"/>
+      <w:lvlText w:val=""/>
+      <w:lvlJc w:val="left"/>
+      <w:pPr>
+        <w:tabs>
+          <w:tab w:val="num" w:pos="4320"/>
+        </w:tabs>
+        <w:ind w:left="4320" w:hanging="360"/>
+      </w:pPr>
+      <w:rPr>
+        <w:rFonts w:ascii="Wingdings" w:hAnsi="Wingdings" w:hint="default"/>
+        <w:sz w:val="20"/>
+      </w:rPr>
+    </w:lvl>
+    <w:lvl w:ilvl="6" w:tentative="1">
+      <w:start w:val="1"/>
+      <w:numFmt w:val="bullet"/>
+      <w:lvlText w:val=""/>
+      <w:lvlJc w:val="left"/>
+      <w:pPr>
+        <w:tabs>
+          <w:tab w:val="num" w:pos="5040"/>
+        </w:tabs>
+        <w:ind w:left="5040" w:hanging="360"/>
+      </w:pPr>
+      <w:rPr>
+        <w:rFonts w:ascii="Wingdings" w:hAnsi="Wingdings" w:hint="default"/>
+        <w:sz w:val="20"/>
+      </w:rPr>
+    </w:lvl>
+    <w:lvl w:ilvl="7" w:tentative="1">
+      <w:start w:val="1"/>
+      <w:numFmt w:val="bullet"/>
+      <w:lvlText w:val=""/>
+      <w:lvlJc w:val="left"/>
+      <w:pPr>
+        <w:tabs>
+          <w:tab w:val="num" w:pos="5760"/>
+        </w:tabs>
+        <w:ind w:left="5760" w:hanging="360"/>
+      </w:pPr>
+      <w:rPr>
+        <w:rFonts w:ascii="Wingdings" w:hAnsi="Wingdings" w:hint="default"/>
+        <w:sz w:val="20"/>
+      </w:rPr>
+    </w:lvl>
+    <w:lvl w:ilvl="8" w:tentative="1">
+      <w:start w:val="1"/>
+      <w:numFmt w:val="bullet"/>
+      <w:lvlText w:val=""/>
+      <w:lvlJc w:val="left"/>
+      <w:pPr>
+        <w:tabs>
+          <w:tab w:val="num" w:pos="6480"/>
+        </w:tabs>
+        <w:ind w:left="6480" w:hanging="360"/>
+      </w:pPr>
+      <w:rPr>
+        <w:rFonts w:ascii="Wingdings" w:hAnsi="Wingdings" w:hint="default"/>
+        <w:sz w:val="20"/>
+      </w:rPr>
+    </w:lvl>
+  </w:abstractNum>
+  <w:abstractNum w:abstractNumId="1" w15:restartNumberingAfterBreak="0">
     <w:nsid w:val="09D572B2"/>
     <w:multiLevelType w:val="multilevel"/>
     <w:tmpl w:val="B30E98AC"/>
@@ -15190,7 +17060,120 @@
       </w:rPr>
     </w:lvl>
   </w:abstractNum>
-  <w:abstractNum w:abstractNumId="1" w15:restartNumberingAfterBreak="0">
+  <w:abstractNum w:abstractNumId="2" w15:restartNumberingAfterBreak="0">
+    <w:nsid w:val="195E4FF9"/>
+    <w:multiLevelType w:val="multilevel"/>
+    <w:tmpl w:val="6D142216"/>
+    <w:lvl w:ilvl="0">
+      <w:start w:val="1"/>
+      <w:numFmt w:val="decimal"/>
+      <w:lvlText w:val="%1."/>
+      <w:lvlJc w:val="left"/>
+      <w:pPr>
+        <w:tabs>
+          <w:tab w:val="num" w:pos="720"/>
+        </w:tabs>
+        <w:ind w:left="720" w:hanging="360"/>
+      </w:pPr>
+    </w:lvl>
+    <w:lvl w:ilvl="1" w:tentative="1">
+      <w:start w:val="1"/>
+      <w:numFmt w:val="decimal"/>
+      <w:lvlText w:val="%2."/>
+      <w:lvlJc w:val="left"/>
+      <w:pPr>
+        <w:tabs>
+          <w:tab w:val="num" w:pos="1440"/>
+        </w:tabs>
+        <w:ind w:left="1440" w:hanging="360"/>
+      </w:pPr>
+    </w:lvl>
+    <w:lvl w:ilvl="2" w:tentative="1">
+      <w:start w:val="1"/>
+      <w:numFmt w:val="decimal"/>
+      <w:lvlText w:val="%3."/>
+      <w:lvlJc w:val="left"/>
+      <w:pPr>
+        <w:tabs>
+          <w:tab w:val="num" w:pos="2160"/>
+        </w:tabs>
+        <w:ind w:left="2160" w:hanging="360"/>
+      </w:pPr>
+    </w:lvl>
+    <w:lvl w:ilvl="3" w:tentative="1">
+      <w:start w:val="1"/>
+      <w:numFmt w:val="decimal"/>
+      <w:lvlText w:val="%4."/>
+      <w:lvlJc w:val="left"/>
+      <w:pPr>
+        <w:tabs>
+          <w:tab w:val="num" w:pos="2880"/>
+        </w:tabs>
+        <w:ind w:left="2880" w:hanging="360"/>
+      </w:pPr>
+    </w:lvl>
+    <w:lvl w:ilvl="4" w:tentative="1">
+      <w:start w:val="1"/>
+      <w:numFmt w:val="decimal"/>
+      <w:lvlText w:val="%5."/>
+      <w:lvlJc w:val="left"/>
+      <w:pPr>
+        <w:tabs>
+          <w:tab w:val="num" w:pos="3600"/>
+        </w:tabs>
+        <w:ind w:left="3600" w:hanging="360"/>
+      </w:pPr>
+    </w:lvl>
+    <w:lvl w:ilvl="5" w:tentative="1">
+      <w:start w:val="1"/>
+      <w:numFmt w:val="decimal"/>
+      <w:lvlText w:val="%6."/>
+      <w:lvlJc w:val="left"/>
+      <w:pPr>
+        <w:tabs>
+          <w:tab w:val="num" w:pos="4320"/>
+        </w:tabs>
+        <w:ind w:left="4320" w:hanging="360"/>
+      </w:pPr>
+    </w:lvl>
+    <w:lvl w:ilvl="6" w:tentative="1">
+      <w:start w:val="1"/>
+      <w:numFmt w:val="decimal"/>
+      <w:lvlText w:val="%7."/>
+      <w:lvlJc w:val="left"/>
+      <w:pPr>
+        <w:tabs>
+          <w:tab w:val="num" w:pos="5040"/>
+        </w:tabs>
+        <w:ind w:left="5040" w:hanging="360"/>
+      </w:pPr>
+    </w:lvl>
+    <w:lvl w:ilvl="7" w:tentative="1">
+      <w:start w:val="1"/>
+      <w:numFmt w:val="decimal"/>
+      <w:lvlText w:val="%8."/>
+      <w:lvlJc w:val="left"/>
+      <w:pPr>
+        <w:tabs>
+          <w:tab w:val="num" w:pos="5760"/>
+        </w:tabs>
+        <w:ind w:left="5760" w:hanging="360"/>
+      </w:pPr>
+    </w:lvl>
+    <w:lvl w:ilvl="8" w:tentative="1">
+      <w:start w:val="1"/>
+      <w:numFmt w:val="decimal"/>
+      <w:lvlText w:val="%9."/>
+      <w:lvlJc w:val="left"/>
+      <w:pPr>
+        <w:tabs>
+          <w:tab w:val="num" w:pos="6480"/>
+        </w:tabs>
+        <w:ind w:left="6480" w:hanging="360"/>
+      </w:pPr>
+    </w:lvl>
+  </w:abstractNum>
+  <w:abstractNum w:abstractNumId="3" w15:restartNumberingAfterBreak="0">
     <w:nsid w:val="1E740882"/>
     <w:multiLevelType w:val="multilevel"/>
     <w:tmpl w:val="01D219AC"/>
@@ -15339,7 +17322,7 @@
       </w:rPr>
     </w:lvl>
   </w:abstractNum>
-  <w:abstractNum w:abstractNumId="2" w15:restartNumberingAfterBreak="0">
+  <w:abstractNum w:abstractNumId="4" w15:restartNumberingAfterBreak="0">
     <w:nsid w:val="1FEE2251"/>
     <w:multiLevelType w:val="multilevel"/>
     <w:tmpl w:val="1FEE2251"/>
@@ -15485,7 +17468,7 @@
       </w:rPr>
     </w:lvl>
   </w:abstractNum>
-  <w:abstractNum w:abstractNumId="3" w15:restartNumberingAfterBreak="0">
+  <w:abstractNum w:abstractNumId="5" w15:restartNumberingAfterBreak="0">
     <w:nsid w:val="20A05546"/>
     <w:multiLevelType w:val="multilevel"/>
     <w:tmpl w:val="6E58B8CC"/>
@@ -15634,7 +17617,156 @@
       </w:rPr>
     </w:lvl>
   </w:abstractNum>
-  <w:abstractNum w:abstractNumId="4" w15:restartNumberingAfterBreak="0">
+  <w:abstractNum w:abstractNumId="6" w15:restartNumberingAfterBreak="0">
+    <w:nsid w:val="24273153"/>
+    <w:multiLevelType w:val="multilevel"/>
+    <w:tmpl w:val="EB4A1822"/>
+    <w:lvl w:ilvl="0">
+      <w:start w:val="1"/>
+      <w:numFmt w:val="bullet"/>
+      <w:lvlText w:val=""/>
+      <w:lvlJc w:val="left"/>
+      <w:pPr>
+        <w:tabs>
+          <w:tab w:val="num" w:pos="720"/>
+        </w:tabs>
+        <w:ind w:left="720" w:hanging="360"/>
+      </w:pPr>
+      <w:rPr>
+        <w:rFonts w:ascii="Symbol" w:hAnsi="Symbol" w:hint="default"/>
+        <w:sz w:val="20"/>
+      </w:rPr>
+    </w:lvl>
+    <w:lvl w:ilvl="1" w:tentative="1">
+      <w:start w:val="1"/>
+      <w:numFmt w:val="bullet"/>
+      <w:lvlText w:val="o"/>
+      <w:lvlJc w:val="left"/>
+      <w:pPr>
+        <w:tabs>
+          <w:tab w:val="num" w:pos="1440"/>
+        </w:tabs>
+        <w:ind w:left="1440" w:hanging="360"/>
+      </w:pPr>
+      <w:rPr>
+        <w:rFonts w:ascii="Courier New" w:hAnsi="Courier New" w:hint="default"/>
+        <w:sz w:val="20"/>
+      </w:rPr>
+    </w:lvl>
+    <w:lvl w:ilvl="2" w:tentative="1">
+      <w:start w:val="1"/>
+      <w:numFmt w:val="bullet"/>
+      <w:lvlText w:val=""/>
+      <w:lvlJc w:val="left"/>
+      <w:pPr>
+        <w:tabs>
+          <w:tab w:val="num" w:pos="2160"/>
+        </w:tabs>
+        <w:ind w:left="2160" w:hanging="360"/>
+      </w:pPr>
+      <w:rPr>
+        <w:rFonts w:ascii="Wingdings" w:hAnsi="Wingdings" w:hint="default"/>
+        <w:sz w:val="20"/>
+      </w:rPr>
+    </w:lvl>
+    <w:lvl w:ilvl="3" w:tentative="1">
+      <w:start w:val="1"/>
+      <w:numFmt w:val="bullet"/>
+      <w:lvlText w:val=""/>
+      <w:lvlJc w:val="left"/>
+      <w:pPr>
+        <w:tabs>
+          <w:tab w:val="num" w:pos="2880"/>
+        </w:tabs>
+        <w:ind w:left="2880" w:hanging="360"/>
+      </w:pPr>
+      <w:rPr>
+        <w:rFonts w:ascii="Wingdings" w:hAnsi="Wingdings" w:hint="default"/>
+        <w:sz w:val="20"/>
+      </w:rPr>
+    </w:lvl>
+    <w:lvl w:ilvl="4" w:tentative="1">
+      <w:start w:val="1"/>
+      <w:numFmt w:val="bullet"/>
+      <w:lvlText w:val=""/>
+      <w:lvlJc w:val="left"/>
+      <w:pPr>
+        <w:tabs>
+          <w:tab w:val="num" w:pos="3600"/>
+        </w:tabs>
+        <w:ind w:left="3600" w:hanging="360"/>
+      </w:pPr>
+      <w:rPr>
+        <w:rFonts w:ascii="Wingdings" w:hAnsi="Wingdings" w:hint="default"/>
+        <w:sz w:val="20"/>
+      </w:rPr>
+    </w:lvl>
+    <w:lvl w:ilvl="5" w:tentative="1">
+      <w:start w:val="1"/>
+      <w:numFmt w:val="bullet"/>
+      <w:lvlText w:val=""/>
+      <w:lvlJc w:val="left"/>
+      <w:pPr>
+        <w:tabs>
+          <w:tab w:val="num" w:pos="4320"/>
+        </w:tabs>
+        <w:ind w:left="4320" w:hanging="360"/>
+      </w:pPr>
+      <w:rPr>
+        <w:rFonts w:ascii="Wingdings" w:hAnsi="Wingdings" w:hint="default"/>
+        <w:sz w:val="20"/>
+      </w:rPr>
+    </w:lvl>
+    <w:lvl w:ilvl="6" w:tentative="1">
+      <w:start w:val="1"/>
+      <w:numFmt w:val="bullet"/>
+      <w:lvlText w:val=""/>
+      <w:lvlJc w:val="left"/>
+      <w:pPr>
+        <w:tabs>
+          <w:tab w:val="num" w:pos="5040"/>
+        </w:tabs>
+        <w:ind w:left="5040" w:hanging="360"/>
+      </w:pPr>
+      <w:rPr>
+        <w:rFonts w:ascii="Wingdings" w:hAnsi="Wingdings" w:hint="default"/>
+        <w:sz w:val="20"/>
+      </w:rPr>
+    </w:lvl>
+    <w:lvl w:ilvl="7" w:tentative="1">
+      <w:start w:val="1"/>
+      <w:numFmt w:val="bullet"/>
+      <w:lvlText w:val=""/>
+      <w:lvlJc w:val="left"/>
+      <w:pPr>
+        <w:tabs>
+          <w:tab w:val="num" w:pos="5760"/>
+        </w:tabs>
+        <w:ind w:left="5760" w:hanging="360"/>
+      </w:pPr>
+      <w:rPr>
+        <w:rFonts w:ascii="Wingdings" w:hAnsi="Wingdings" w:hint="default"/>
+        <w:sz w:val="20"/>
+      </w:rPr>
+    </w:lvl>
+    <w:lvl w:ilvl="8" w:tentative="1">
+      <w:start w:val="1"/>
+      <w:numFmt w:val="bullet"/>
+      <w:lvlText w:val=""/>
+      <w:lvlJc w:val="left"/>
+      <w:pPr>
+        <w:tabs>
+          <w:tab w:val="num" w:pos="6480"/>
+        </w:tabs>
+        <w:ind w:left="6480" w:hanging="360"/>
+      </w:pPr>
+      <w:rPr>
+        <w:rFonts w:ascii="Wingdings" w:hAnsi="Wingdings" w:hint="default"/>
+        <w:sz w:val="20"/>
+      </w:rPr>
+    </w:lvl>
+  </w:abstractNum>
+  <w:abstractNum w:abstractNumId="7" w15:restartNumberingAfterBreak="0">
     <w:nsid w:val="27F21B05"/>
     <w:multiLevelType w:val="multilevel"/>
     <w:tmpl w:val="77160994"/>
@@ -15783,7 +17915,7 @@
       </w:rPr>
     </w:lvl>
   </w:abstractNum>
-  <w:abstractNum w:abstractNumId="5" w15:restartNumberingAfterBreak="0">
+  <w:abstractNum w:abstractNumId="8" w15:restartNumberingAfterBreak="0">
     <w:nsid w:val="293765AF"/>
     <w:multiLevelType w:val="multilevel"/>
     <w:tmpl w:val="4976ADDA"/>
@@ -15932,7 +18064,305 @@
       </w:rPr>
     </w:lvl>
   </w:abstractNum>
-  <w:abstractNum w:abstractNumId="6" w15:restartNumberingAfterBreak="0">
+  <w:abstractNum w:abstractNumId="9" w15:restartNumberingAfterBreak="0">
+    <w:nsid w:val="2D0F54BF"/>
+    <w:multiLevelType w:val="multilevel"/>
+    <w:tmpl w:val="EC96FEA0"/>
+    <w:lvl w:ilvl="0">
+      <w:start w:val="1"/>
+      <w:numFmt w:val="bullet"/>
+      <w:lvlText w:val=""/>
+      <w:lvlJc w:val="left"/>
+      <w:pPr>
+        <w:tabs>
+          <w:tab w:val="num" w:pos="720"/>
+        </w:tabs>
+        <w:ind w:left="720" w:hanging="360"/>
+      </w:pPr>
+      <w:rPr>
+        <w:rFonts w:ascii="Symbol" w:hAnsi="Symbol" w:hint="default"/>
+        <w:sz w:val="20"/>
+      </w:rPr>
+    </w:lvl>
+    <w:lvl w:ilvl="1">
+      <w:start w:val="1"/>
+      <w:numFmt w:val="bullet"/>
+      <w:lvlText w:val="o"/>
+      <w:lvlJc w:val="left"/>
+      <w:pPr>
+        <w:tabs>
+          <w:tab w:val="num" w:pos="1440"/>
+        </w:tabs>
+        <w:ind w:left="1440" w:hanging="360"/>
+      </w:pPr>
+      <w:rPr>
+        <w:rFonts w:ascii="Courier New" w:hAnsi="Courier New" w:hint="default"/>
+        <w:sz w:val="20"/>
+      </w:rPr>
+    </w:lvl>
+    <w:lvl w:ilvl="2" w:tentative="1">
+      <w:start w:val="1"/>
+      <w:numFmt w:val="bullet"/>
+      <w:lvlText w:val=""/>
+      <w:lvlJc w:val="left"/>
+      <w:pPr>
+        <w:tabs>
+          <w:tab w:val="num" w:pos="2160"/>
+        </w:tabs>
+        <w:ind w:left="2160" w:hanging="360"/>
+      </w:pPr>
+      <w:rPr>
+        <w:rFonts w:ascii="Wingdings" w:hAnsi="Wingdings" w:hint="default"/>
+        <w:sz w:val="20"/>
+      </w:rPr>
+    </w:lvl>
+    <w:lvl w:ilvl="3" w:tentative="1">
+      <w:start w:val="1"/>
+      <w:numFmt w:val="bullet"/>
+      <w:lvlText w:val=""/>
+      <w:lvlJc w:val="left"/>
+      <w:pPr>
+        <w:tabs>
+          <w:tab w:val="num" w:pos="2880"/>
+        </w:tabs>
+        <w:ind w:left="2880" w:hanging="360"/>
+      </w:pPr>
+      <w:rPr>
+        <w:rFonts w:ascii="Wingdings" w:hAnsi="Wingdings" w:hint="default"/>
+        <w:sz w:val="20"/>
+      </w:rPr>
+    </w:lvl>
+    <w:lvl w:ilvl="4" w:tentative="1">
+      <w:start w:val="1"/>
+      <w:numFmt w:val="bullet"/>
+      <w:lvlText w:val=""/>
+      <w:lvlJc w:val="left"/>
+      <w:pPr>
+        <w:tabs>
+          <w:tab w:val="num" w:pos="3600"/>
+        </w:tabs>
+        <w:ind w:left="3600" w:hanging="360"/>
+      </w:pPr>
+      <w:rPr>
+        <w:rFonts w:ascii="Wingdings" w:hAnsi="Wingdings" w:hint="default"/>
+        <w:sz w:val="20"/>
+      </w:rPr>
+    </w:lvl>
+    <w:lvl w:ilvl="5" w:tentative="1">
+      <w:start w:val="1"/>
+      <w:numFmt w:val="bullet"/>
+      <w:lvlText w:val=""/>
+      <w:lvlJc w:val="left"/>
+      <w:pPr>
+        <w:tabs>
+          <w:tab w:val="num" w:pos="4320"/>
+        </w:tabs>
+        <w:ind w:left="4320" w:hanging="360"/>
+      </w:pPr>
+      <w:rPr>
+        <w:rFonts w:ascii="Wingdings" w:hAnsi="Wingdings" w:hint="default"/>
+        <w:sz w:val="20"/>
+      </w:rPr>
+    </w:lvl>
+    <w:lvl w:ilvl="6" w:tentative="1">
+      <w:start w:val="1"/>
+      <w:numFmt w:val="bullet"/>
+      <w:lvlText w:val=""/>
+      <w:lvlJc w:val="left"/>
+      <w:pPr>
+        <w:tabs>
+          <w:tab w:val="num" w:pos="5040"/>
+        </w:tabs>
+        <w:ind w:left="5040" w:hanging="360"/>
+      </w:pPr>
+      <w:rPr>
+        <w:rFonts w:ascii="Wingdings" w:hAnsi="Wingdings" w:hint="default"/>
+        <w:sz w:val="20"/>
+      </w:rPr>
+    </w:lvl>
+    <w:lvl w:ilvl="7" w:tentative="1">
+      <w:start w:val="1"/>
+      <w:numFmt w:val="bullet"/>
+      <w:lvlText w:val=""/>
+      <w:lvlJc w:val="left"/>
+      <w:pPr>
+        <w:tabs>
+          <w:tab w:val="num" w:pos="5760"/>
+        </w:tabs>
+        <w:ind w:left="5760" w:hanging="360"/>
+      </w:pPr>
+      <w:rPr>
+        <w:rFonts w:ascii="Wingdings" w:hAnsi="Wingdings" w:hint="default"/>
+        <w:sz w:val="20"/>
+      </w:rPr>
+    </w:lvl>
+    <w:lvl w:ilvl="8" w:tentative="1">
+      <w:start w:val="1"/>
+      <w:numFmt w:val="bullet"/>
+      <w:lvlText w:val=""/>
+      <w:lvlJc w:val="left"/>
+      <w:pPr>
+        <w:tabs>
+          <w:tab w:val="num" w:pos="6480"/>
+        </w:tabs>
+        <w:ind w:left="6480" w:hanging="360"/>
+      </w:pPr>
+      <w:rPr>
+        <w:rFonts w:ascii="Wingdings" w:hAnsi="Wingdings" w:hint="default"/>
+        <w:sz w:val="20"/>
+      </w:rPr>
+    </w:lvl>
+  </w:abstractNum>
+  <w:abstractNum w:abstractNumId="10" w15:restartNumberingAfterBreak="0">
+    <w:nsid w:val="32EF2F6F"/>
+    <w:multiLevelType w:val="multilevel"/>
+    <w:tmpl w:val="EBDE687C"/>
+    <w:lvl w:ilvl="0">
+      <w:start w:val="1"/>
+      <w:numFmt w:val="bullet"/>
+      <w:lvlText w:val=""/>
+      <w:lvlJc w:val="left"/>
+      <w:pPr>
+        <w:tabs>
+          <w:tab w:val="num" w:pos="720"/>
+        </w:tabs>
+        <w:ind w:left="720" w:hanging="360"/>
+      </w:pPr>
+      <w:rPr>
+        <w:rFonts w:ascii="Symbol" w:hAnsi="Symbol" w:hint="default"/>
+        <w:sz w:val="20"/>
+      </w:rPr>
+    </w:lvl>
+    <w:lvl w:ilvl="1" w:tentative="1">
+      <w:start w:val="1"/>
+      <w:numFmt w:val="bullet"/>
+      <w:lvlText w:val="o"/>
+      <w:lvlJc w:val="left"/>
+      <w:pPr>
+        <w:tabs>
+          <w:tab w:val="num" w:pos="1440"/>
+        </w:tabs>
+        <w:ind w:left="1440" w:hanging="360"/>
+      </w:pPr>
+      <w:rPr>
+        <w:rFonts w:ascii="Courier New" w:hAnsi="Courier New" w:hint="default"/>
+        <w:sz w:val="20"/>
+      </w:rPr>
+    </w:lvl>
+    <w:lvl w:ilvl="2" w:tentative="1">
+      <w:start w:val="1"/>
+      <w:numFmt w:val="bullet"/>
+      <w:lvlText w:val=""/>
+      <w:lvlJc w:val="left"/>
+      <w:pPr>
+        <w:tabs>
+          <w:tab w:val="num" w:pos="2160"/>
+        </w:tabs>
+        <w:ind w:left="2160" w:hanging="360"/>
+      </w:pPr>
+      <w:rPr>
+        <w:rFonts w:ascii="Wingdings" w:hAnsi="Wingdings" w:hint="default"/>
+        <w:sz w:val="20"/>
+      </w:rPr>
+    </w:lvl>
+    <w:lvl w:ilvl="3" w:tentative="1">
+      <w:start w:val="1"/>
+      <w:numFmt w:val="bullet"/>
+      <w:lvlText w:val=""/>
+      <w:lvlJc w:val="left"/>
+      <w:pPr>
+        <w:tabs>
+          <w:tab w:val="num" w:pos="2880"/>
+        </w:tabs>
+        <w:ind w:left="2880" w:hanging="360"/>
+      </w:pPr>
+      <w:rPr>
+        <w:rFonts w:ascii="Wingdings" w:hAnsi="Wingdings" w:hint="default"/>
+        <w:sz w:val="20"/>
+      </w:rPr>
+    </w:lvl>
+    <w:lvl w:ilvl="4" w:tentative="1">
+      <w:start w:val="1"/>
+      <w:numFmt w:val="bullet"/>
+      <w:lvlText w:val=""/>
+      <w:lvlJc w:val="left"/>
+      <w:pPr>
+        <w:tabs>
+          <w:tab w:val="num" w:pos="3600"/>
+        </w:tabs>
+        <w:ind w:left="3600" w:hanging="360"/>
+      </w:pPr>
+      <w:rPr>
+        <w:rFonts w:ascii="Wingdings" w:hAnsi="Wingdings" w:hint="default"/>
+        <w:sz w:val="20"/>
+      </w:rPr>
+    </w:lvl>
+    <w:lvl w:ilvl="5" w:tentative="1">
+      <w:start w:val="1"/>
+      <w:numFmt w:val="bullet"/>
+      <w:lvlText w:val=""/>
+      <w:lvlJc w:val="left"/>
+      <w:pPr>
+        <w:tabs>
+          <w:tab w:val="num" w:pos="4320"/>
+        </w:tabs>
+        <w:ind w:left="4320" w:hanging="360"/>
+      </w:pPr>
+      <w:rPr>
+        <w:rFonts w:ascii="Wingdings" w:hAnsi="Wingdings" w:hint="default"/>
+        <w:sz w:val="20"/>
+      </w:rPr>
+    </w:lvl>
+    <w:lvl w:ilvl="6" w:tentative="1">
+      <w:start w:val="1"/>
+      <w:numFmt w:val="bullet"/>
+      <w:lvlText w:val=""/>
+      <w:lvlJc w:val="left"/>
+      <w:pPr>
+        <w:tabs>
+          <w:tab w:val="num" w:pos="5040"/>
+        </w:tabs>
+        <w:ind w:left="5040" w:hanging="360"/>
+      </w:pPr>
+      <w:rPr>
+        <w:rFonts w:ascii="Wingdings" w:hAnsi="Wingdings" w:hint="default"/>
+        <w:sz w:val="20"/>
+      </w:rPr>
+    </w:lvl>
+    <w:lvl w:ilvl="7" w:tentative="1">
+      <w:start w:val="1"/>
+      <w:numFmt w:val="bullet"/>
+      <w:lvlText w:val=""/>
+      <w:lvlJc w:val="left"/>
+      <w:pPr>
+        <w:tabs>
+          <w:tab w:val="num" w:pos="5760"/>
+        </w:tabs>
+        <w:ind w:left="5760" w:hanging="360"/>
+      </w:pPr>
+      <w:rPr>
+        <w:rFonts w:ascii="Wingdings" w:hAnsi="Wingdings" w:hint="default"/>
+        <w:sz w:val="20"/>
+      </w:rPr>
+    </w:lvl>
+    <w:lvl w:ilvl="8" w:tentative="1">
+      <w:start w:val="1"/>
+      <w:numFmt w:val="bullet"/>
+      <w:lvlText w:val=""/>
+      <w:lvlJc w:val="left"/>
+      <w:pPr>
+        <w:tabs>
+          <w:tab w:val="num" w:pos="6480"/>
+        </w:tabs>
+        <w:ind w:left="6480" w:hanging="360"/>
+      </w:pPr>
+      <w:rPr>
+        <w:rFonts w:ascii="Wingdings" w:hAnsi="Wingdings" w:hint="default"/>
+        <w:sz w:val="20"/>
+      </w:rPr>
+    </w:lvl>
+  </w:abstractNum>
+  <w:abstractNum w:abstractNumId="11" w15:restartNumberingAfterBreak="0">
     <w:nsid w:val="3D4F4FD1"/>
     <w:multiLevelType w:val="multilevel"/>
     <w:tmpl w:val="A17A36B2"/>
@@ -16081,7 +18511,7 @@
       </w:rPr>
     </w:lvl>
   </w:abstractNum>
-  <w:abstractNum w:abstractNumId="7" w15:restartNumberingAfterBreak="0">
+  <w:abstractNum w:abstractNumId="12" w15:restartNumberingAfterBreak="0">
     <w:nsid w:val="45A51F7C"/>
     <w:multiLevelType w:val="multilevel"/>
     <w:tmpl w:val="18C80F18"/>
@@ -16230,7 +18660,7 @@
       </w:rPr>
     </w:lvl>
   </w:abstractNum>
-  <w:abstractNum w:abstractNumId="8" w15:restartNumberingAfterBreak="0">
+  <w:abstractNum w:abstractNumId="13" w15:restartNumberingAfterBreak="0">
     <w:nsid w:val="4E2D5052"/>
     <w:multiLevelType w:val="multilevel"/>
     <w:tmpl w:val="5B60C41A"/>
@@ -16343,7 +18773,454 @@
       </w:rPr>
     </w:lvl>
   </w:abstractNum>
-  <w:abstractNum w:abstractNumId="9" w15:restartNumberingAfterBreak="0">
+  <w:abstractNum w:abstractNumId="14" w15:restartNumberingAfterBreak="0">
+    <w:nsid w:val="4EE573FA"/>
+    <w:multiLevelType w:val="multilevel"/>
+    <w:tmpl w:val="FAE000AE"/>
+    <w:lvl w:ilvl="0">
+      <w:start w:val="1"/>
+      <w:numFmt w:val="bullet"/>
+      <w:lvlText w:val=""/>
+      <w:lvlJc w:val="left"/>
+      <w:pPr>
+        <w:tabs>
+          <w:tab w:val="num" w:pos="720"/>
+        </w:tabs>
+        <w:ind w:left="720" w:hanging="360"/>
+      </w:pPr>
+      <w:rPr>
+        <w:rFonts w:ascii="Symbol" w:hAnsi="Symbol" w:hint="default"/>
+        <w:sz w:val="20"/>
+      </w:rPr>
+    </w:lvl>
+    <w:lvl w:ilvl="1" w:tentative="1">
+      <w:start w:val="1"/>
+      <w:numFmt w:val="bullet"/>
+      <w:lvlText w:val="o"/>
+      <w:lvlJc w:val="left"/>
+      <w:pPr>
+        <w:tabs>
+          <w:tab w:val="num" w:pos="1440"/>
+        </w:tabs>
+        <w:ind w:left="1440" w:hanging="360"/>
+      </w:pPr>
+      <w:rPr>
+        <w:rFonts w:ascii="Courier New" w:hAnsi="Courier New" w:hint="default"/>
+        <w:sz w:val="20"/>
+      </w:rPr>
+    </w:lvl>
+    <w:lvl w:ilvl="2" w:tentative="1">
+      <w:start w:val="1"/>
+      <w:numFmt w:val="bullet"/>
+      <w:lvlText w:val=""/>
+      <w:lvlJc w:val="left"/>
+      <w:pPr>
+        <w:tabs>
+          <w:tab w:val="num" w:pos="2160"/>
+        </w:tabs>
+        <w:ind w:left="2160" w:hanging="360"/>
+      </w:pPr>
+      <w:rPr>
+        <w:rFonts w:ascii="Wingdings" w:hAnsi="Wingdings" w:hint="default"/>
+        <w:sz w:val="20"/>
+      </w:rPr>
+    </w:lvl>
+    <w:lvl w:ilvl="3" w:tentative="1">
+      <w:start w:val="1"/>
+      <w:numFmt w:val="bullet"/>
+      <w:lvlText w:val=""/>
+      <w:lvlJc w:val="left"/>
+      <w:pPr>
+        <w:tabs>
+          <w:tab w:val="num" w:pos="2880"/>
+        </w:tabs>
+        <w:ind w:left="2880" w:hanging="360"/>
+      </w:pPr>
+      <w:rPr>
+        <w:rFonts w:ascii="Wingdings" w:hAnsi="Wingdings" w:hint="default"/>
+        <w:sz w:val="20"/>
+      </w:rPr>
+    </w:lvl>
+    <w:lvl w:ilvl="4" w:tentative="1">
+      <w:start w:val="1"/>
+      <w:numFmt w:val="bullet"/>
+      <w:lvlText w:val=""/>
+      <w:lvlJc w:val="left"/>
+      <w:pPr>
+        <w:tabs>
+          <w:tab w:val="num" w:pos="3600"/>
+        </w:tabs>
+        <w:ind w:left="3600" w:hanging="360"/>
+      </w:pPr>
+      <w:rPr>
+        <w:rFonts w:ascii="Wingdings" w:hAnsi="Wingdings" w:hint="default"/>
+        <w:sz w:val="20"/>
+      </w:rPr>
+    </w:lvl>
+    <w:lvl w:ilvl="5" w:tentative="1">
+      <w:start w:val="1"/>
+      <w:numFmt w:val="bullet"/>
+      <w:lvlText w:val=""/>
+      <w:lvlJc w:val="left"/>
+      <w:pPr>
+        <w:tabs>
+          <w:tab w:val="num" w:pos="4320"/>
+        </w:tabs>
+        <w:ind w:left="4320" w:hanging="360"/>
+      </w:pPr>
+      <w:rPr>
+        <w:rFonts w:ascii="Wingdings" w:hAnsi="Wingdings" w:hint="default"/>
+        <w:sz w:val="20"/>
+      </w:rPr>
+    </w:lvl>
+    <w:lvl w:ilvl="6" w:tentative="1">
+      <w:start w:val="1"/>
+      <w:numFmt w:val="bullet"/>
+      <w:lvlText w:val=""/>
+      <w:lvlJc w:val="left"/>
+      <w:pPr>
+        <w:tabs>
+          <w:tab w:val="num" w:pos="5040"/>
+        </w:tabs>
+        <w:ind w:left="5040" w:hanging="360"/>
+      </w:pPr>
+      <w:rPr>
+        <w:rFonts w:ascii="Wingdings" w:hAnsi="Wingdings" w:hint="default"/>
+        <w:sz w:val="20"/>
+      </w:rPr>
+    </w:lvl>
+    <w:lvl w:ilvl="7" w:tentative="1">
+      <w:start w:val="1"/>
+      <w:numFmt w:val="bullet"/>
+      <w:lvlText w:val=""/>
+      <w:lvlJc w:val="left"/>
+      <w:pPr>
+        <w:tabs>
+          <w:tab w:val="num" w:pos="5760"/>
+        </w:tabs>
+        <w:ind w:left="5760" w:hanging="360"/>
+      </w:pPr>
+      <w:rPr>
+        <w:rFonts w:ascii="Wingdings" w:hAnsi="Wingdings" w:hint="default"/>
+        <w:sz w:val="20"/>
+      </w:rPr>
+    </w:lvl>
+    <w:lvl w:ilvl="8" w:tentative="1">
+      <w:start w:val="1"/>
+      <w:numFmt w:val="bullet"/>
+      <w:lvlText w:val=""/>
+      <w:lvlJc w:val="left"/>
+      <w:pPr>
+        <w:tabs>
+          <w:tab w:val="num" w:pos="6480"/>
+        </w:tabs>
+        <w:ind w:left="6480" w:hanging="360"/>
+      </w:pPr>
+      <w:rPr>
+        <w:rFonts w:ascii="Wingdings" w:hAnsi="Wingdings" w:hint="default"/>
+        <w:sz w:val="20"/>
+      </w:rPr>
+    </w:lvl>
+  </w:abstractNum>
+  <w:abstractNum w:abstractNumId="15" w15:restartNumberingAfterBreak="0">
+    <w:nsid w:val="50743971"/>
+    <w:multiLevelType w:val="multilevel"/>
+    <w:tmpl w:val="C8AE636C"/>
+    <w:lvl w:ilvl="0">
+      <w:start w:val="1"/>
+      <w:numFmt w:val="bullet"/>
+      <w:lvlText w:val=""/>
+      <w:lvlJc w:val="left"/>
+      <w:pPr>
+        <w:tabs>
+          <w:tab w:val="num" w:pos="720"/>
+        </w:tabs>
+        <w:ind w:left="720" w:hanging="360"/>
+      </w:pPr>
+      <w:rPr>
+        <w:rFonts w:ascii="Symbol" w:hAnsi="Symbol" w:hint="default"/>
+        <w:sz w:val="20"/>
+      </w:rPr>
+    </w:lvl>
+    <w:lvl w:ilvl="1" w:tentative="1">
+      <w:start w:val="1"/>
+      <w:numFmt w:val="bullet"/>
+      <w:lvlText w:val="o"/>
+      <w:lvlJc w:val="left"/>
+      <w:pPr>
+        <w:tabs>
+          <w:tab w:val="num" w:pos="1440"/>
+        </w:tabs>
+        <w:ind w:left="1440" w:hanging="360"/>
+      </w:pPr>
+      <w:rPr>
+        <w:rFonts w:ascii="Courier New" w:hAnsi="Courier New" w:hint="default"/>
+        <w:sz w:val="20"/>
+      </w:rPr>
+    </w:lvl>
+    <w:lvl w:ilvl="2" w:tentative="1">
+      <w:start w:val="1"/>
+      <w:numFmt w:val="bullet"/>
+      <w:lvlText w:val=""/>
+      <w:lvlJc w:val="left"/>
+      <w:pPr>
+        <w:tabs>
+          <w:tab w:val="num" w:pos="2160"/>
+        </w:tabs>
+        <w:ind w:left="2160" w:hanging="360"/>
+      </w:pPr>
+      <w:rPr>
+        <w:rFonts w:ascii="Wingdings" w:hAnsi="Wingdings" w:hint="default"/>
+        <w:sz w:val="20"/>
+      </w:rPr>
+    </w:lvl>
+    <w:lvl w:ilvl="3" w:tentative="1">
+      <w:start w:val="1"/>
+      <w:numFmt w:val="bullet"/>
+      <w:lvlText w:val=""/>
+      <w:lvlJc w:val="left"/>
+      <w:pPr>
+        <w:tabs>
+          <w:tab w:val="num" w:pos="2880"/>
+        </w:tabs>
+        <w:ind w:left="2880" w:hanging="360"/>
+      </w:pPr>
+      <w:rPr>
+        <w:rFonts w:ascii="Wingdings" w:hAnsi="Wingdings" w:hint="default"/>
+        <w:sz w:val="20"/>
+      </w:rPr>
+    </w:lvl>
+    <w:lvl w:ilvl="4" w:tentative="1">
+      <w:start w:val="1"/>
+      <w:numFmt w:val="bullet"/>
+      <w:lvlText w:val=""/>
+      <w:lvlJc w:val="left"/>
+      <w:pPr>
+        <w:tabs>
+          <w:tab w:val="num" w:pos="3600"/>
+        </w:tabs>
+        <w:ind w:left="3600" w:hanging="360"/>
+      </w:pPr>
+      <w:rPr>
+        <w:rFonts w:ascii="Wingdings" w:hAnsi="Wingdings" w:hint="default"/>
+        <w:sz w:val="20"/>
+      </w:rPr>
+    </w:lvl>
+    <w:lvl w:ilvl="5" w:tentative="1">
+      <w:start w:val="1"/>
+      <w:numFmt w:val="bullet"/>
+      <w:lvlText w:val=""/>
+      <w:lvlJc w:val="left"/>
+      <w:pPr>
+        <w:tabs>
+          <w:tab w:val="num" w:pos="4320"/>
+        </w:tabs>
+        <w:ind w:left="4320" w:hanging="360"/>
+      </w:pPr>
+      <w:rPr>
+        <w:rFonts w:ascii="Wingdings" w:hAnsi="Wingdings" w:hint="default"/>
+        <w:sz w:val="20"/>
+      </w:rPr>
+    </w:lvl>
+    <w:lvl w:ilvl="6" w:tentative="1">
+      <w:start w:val="1"/>
+      <w:numFmt w:val="bullet"/>
+      <w:lvlText w:val=""/>
+      <w:lvlJc w:val="left"/>
+      <w:pPr>
+        <w:tabs>
+          <w:tab w:val="num" w:pos="5040"/>
+        </w:tabs>
+        <w:ind w:left="5040" w:hanging="360"/>
+      </w:pPr>
+      <w:rPr>
+        <w:rFonts w:ascii="Wingdings" w:hAnsi="Wingdings" w:hint="default"/>
+        <w:sz w:val="20"/>
+      </w:rPr>
+    </w:lvl>
+    <w:lvl w:ilvl="7" w:tentative="1">
+      <w:start w:val="1"/>
+      <w:numFmt w:val="bullet"/>
+      <w:lvlText w:val=""/>
+      <w:lvlJc w:val="left"/>
+      <w:pPr>
+        <w:tabs>
+          <w:tab w:val="num" w:pos="5760"/>
+        </w:tabs>
+        <w:ind w:left="5760" w:hanging="360"/>
+      </w:pPr>
+      <w:rPr>
+        <w:rFonts w:ascii="Wingdings" w:hAnsi="Wingdings" w:hint="default"/>
+        <w:sz w:val="20"/>
+      </w:rPr>
+    </w:lvl>
+    <w:lvl w:ilvl="8" w:tentative="1">
+      <w:start w:val="1"/>
+      <w:numFmt w:val="bullet"/>
+      <w:lvlText w:val=""/>
+      <w:lvlJc w:val="left"/>
+      <w:pPr>
+        <w:tabs>
+          <w:tab w:val="num" w:pos="6480"/>
+        </w:tabs>
+        <w:ind w:left="6480" w:hanging="360"/>
+      </w:pPr>
+      <w:rPr>
+        <w:rFonts w:ascii="Wingdings" w:hAnsi="Wingdings" w:hint="default"/>
+        <w:sz w:val="20"/>
+      </w:rPr>
+    </w:lvl>
+  </w:abstractNum>
+  <w:abstractNum w:abstractNumId="16" w15:restartNumberingAfterBreak="0">
+    <w:nsid w:val="552E15FD"/>
+    <w:multiLevelType w:val="multilevel"/>
+    <w:tmpl w:val="66265E4A"/>
+    <w:lvl w:ilvl="0">
+      <w:start w:val="1"/>
+      <w:numFmt w:val="bullet"/>
+      <w:lvlText w:val=""/>
+      <w:lvlJc w:val="left"/>
+      <w:pPr>
+        <w:tabs>
+          <w:tab w:val="num" w:pos="720"/>
+        </w:tabs>
+        <w:ind w:left="720" w:hanging="360"/>
+      </w:pPr>
+      <w:rPr>
+        <w:rFonts w:ascii="Symbol" w:hAnsi="Symbol" w:hint="default"/>
+        <w:sz w:val="20"/>
+      </w:rPr>
+    </w:lvl>
+    <w:lvl w:ilvl="1" w:tentative="1">
+      <w:start w:val="1"/>
+      <w:numFmt w:val="bullet"/>
+      <w:lvlText w:val="o"/>
+      <w:lvlJc w:val="left"/>
+      <w:pPr>
+        <w:tabs>
+          <w:tab w:val="num" w:pos="1440"/>
+        </w:tabs>
+        <w:ind w:left="1440" w:hanging="360"/>
+      </w:pPr>
+      <w:rPr>
+        <w:rFonts w:ascii="Courier New" w:hAnsi="Courier New" w:hint="default"/>
+        <w:sz w:val="20"/>
+      </w:rPr>
+    </w:lvl>
+    <w:lvl w:ilvl="2" w:tentative="1">
+      <w:start w:val="1"/>
+      <w:numFmt w:val="bullet"/>
+      <w:lvlText w:val=""/>
+      <w:lvlJc w:val="left"/>
+      <w:pPr>
+        <w:tabs>
+          <w:tab w:val="num" w:pos="2160"/>
+        </w:tabs>
+        <w:ind w:left="2160" w:hanging="360"/>
+      </w:pPr>
+      <w:rPr>
+        <w:rFonts w:ascii="Wingdings" w:hAnsi="Wingdings" w:hint="default"/>
+        <w:sz w:val="20"/>
+      </w:rPr>
+    </w:lvl>
+    <w:lvl w:ilvl="3" w:tentative="1">
+      <w:start w:val="1"/>
+      <w:numFmt w:val="bullet"/>
+      <w:lvlText w:val=""/>
+      <w:lvlJc w:val="left"/>
+      <w:pPr>
+        <w:tabs>
+          <w:tab w:val="num" w:pos="2880"/>
+        </w:tabs>
+        <w:ind w:left="2880" w:hanging="360"/>
+      </w:pPr>
+      <w:rPr>
+        <w:rFonts w:ascii="Wingdings" w:hAnsi="Wingdings" w:hint="default"/>
+        <w:sz w:val="20"/>
+      </w:rPr>
+    </w:lvl>
+    <w:lvl w:ilvl="4" w:tentative="1">
+      <w:start w:val="1"/>
+      <w:numFmt w:val="bullet"/>
+      <w:lvlText w:val=""/>
+      <w:lvlJc w:val="left"/>
+      <w:pPr>
+        <w:tabs>
+          <w:tab w:val="num" w:pos="3600"/>
+        </w:tabs>
+        <w:ind w:left="3600" w:hanging="360"/>
+      </w:pPr>
+      <w:rPr>
+        <w:rFonts w:ascii="Wingdings" w:hAnsi="Wingdings" w:hint="default"/>
+        <w:sz w:val="20"/>
+      </w:rPr>
+    </w:lvl>
+    <w:lvl w:ilvl="5" w:tentative="1">
+      <w:start w:val="1"/>
+      <w:numFmt w:val="bullet"/>
+      <w:lvlText w:val=""/>
+      <w:lvlJc w:val="left"/>
+      <w:pPr>
+        <w:tabs>
+          <w:tab w:val="num" w:pos="4320"/>
+        </w:tabs>
+        <w:ind w:left="4320" w:hanging="360"/>
+      </w:pPr>
+      <w:rPr>
+        <w:rFonts w:ascii="Wingdings" w:hAnsi="Wingdings" w:hint="default"/>
+        <w:sz w:val="20"/>
+      </w:rPr>
+    </w:lvl>
+    <w:lvl w:ilvl="6" w:tentative="1">
+      <w:start w:val="1"/>
+      <w:numFmt w:val="bullet"/>
+      <w:lvlText w:val=""/>
+      <w:lvlJc w:val="left"/>
+      <w:pPr>
+        <w:tabs>
+          <w:tab w:val="num" w:pos="5040"/>
+        </w:tabs>
+        <w:ind w:left="5040" w:hanging="360"/>
+      </w:pPr>
+      <w:rPr>
+        <w:rFonts w:ascii="Wingdings" w:hAnsi="Wingdings" w:hint="default"/>
+        <w:sz w:val="20"/>
+      </w:rPr>
+    </w:lvl>
+    <w:lvl w:ilvl="7" w:tentative="1">
+      <w:start w:val="1"/>
+      <w:numFmt w:val="bullet"/>
+      <w:lvlText w:val=""/>
+      <w:lvlJc w:val="left"/>
+      <w:pPr>
+        <w:tabs>
+          <w:tab w:val="num" w:pos="5760"/>
+        </w:tabs>
+        <w:ind w:left="5760" w:hanging="360"/>
+      </w:pPr>
+      <w:rPr>
+        <w:rFonts w:ascii="Wingdings" w:hAnsi="Wingdings" w:hint="default"/>
+        <w:sz w:val="20"/>
+      </w:rPr>
+    </w:lvl>
+    <w:lvl w:ilvl="8" w:tentative="1">
+      <w:start w:val="1"/>
+      <w:numFmt w:val="bullet"/>
+      <w:lvlText w:val=""/>
+      <w:lvlJc w:val="left"/>
+      <w:pPr>
+        <w:tabs>
+          <w:tab w:val="num" w:pos="6480"/>
+        </w:tabs>
+        <w:ind w:left="6480" w:hanging="360"/>
+      </w:pPr>
+      <w:rPr>
+        <w:rFonts w:ascii="Wingdings" w:hAnsi="Wingdings" w:hint="default"/>
+        <w:sz w:val="20"/>
+      </w:rPr>
+    </w:lvl>
+  </w:abstractNum>
+  <w:abstractNum w:abstractNumId="17" w15:restartNumberingAfterBreak="0">
     <w:nsid w:val="59234EA9"/>
     <w:multiLevelType w:val="multilevel"/>
     <w:tmpl w:val="D848FAAC"/>
@@ -16492,7 +19369,305 @@
       </w:rPr>
     </w:lvl>
   </w:abstractNum>
-  <w:abstractNum w:abstractNumId="10" w15:restartNumberingAfterBreak="0">
+  <w:abstractNum w:abstractNumId="18" w15:restartNumberingAfterBreak="0">
+    <w:nsid w:val="5D5F6161"/>
+    <w:multiLevelType w:val="multilevel"/>
+    <w:tmpl w:val="1572FE04"/>
+    <w:lvl w:ilvl="0">
+      <w:start w:val="1"/>
+      <w:numFmt w:val="bullet"/>
+      <w:lvlText w:val=""/>
+      <w:lvlJc w:val="left"/>
+      <w:pPr>
+        <w:tabs>
+          <w:tab w:val="num" w:pos="720"/>
+        </w:tabs>
+        <w:ind w:left="720" w:hanging="360"/>
+      </w:pPr>
+      <w:rPr>
+        <w:rFonts w:ascii="Symbol" w:hAnsi="Symbol" w:hint="default"/>
+        <w:sz w:val="20"/>
+      </w:rPr>
+    </w:lvl>
+    <w:lvl w:ilvl="1" w:tentative="1">
+      <w:start w:val="1"/>
+      <w:numFmt w:val="bullet"/>
+      <w:lvlText w:val="o"/>
+      <w:lvlJc w:val="left"/>
+      <w:pPr>
+        <w:tabs>
+          <w:tab w:val="num" w:pos="1440"/>
+        </w:tabs>
+        <w:ind w:left="1440" w:hanging="360"/>
+      </w:pPr>
+      <w:rPr>
+        <w:rFonts w:ascii="Courier New" w:hAnsi="Courier New" w:hint="default"/>
+        <w:sz w:val="20"/>
+      </w:rPr>
+    </w:lvl>
+    <w:lvl w:ilvl="2" w:tentative="1">
+      <w:start w:val="1"/>
+      <w:numFmt w:val="bullet"/>
+      <w:lvlText w:val=""/>
+      <w:lvlJc w:val="left"/>
+      <w:pPr>
+        <w:tabs>
+          <w:tab w:val="num" w:pos="2160"/>
+        </w:tabs>
+        <w:ind w:left="2160" w:hanging="360"/>
+      </w:pPr>
+      <w:rPr>
+        <w:rFonts w:ascii="Wingdings" w:hAnsi="Wingdings" w:hint="default"/>
+        <w:sz w:val="20"/>
+      </w:rPr>
+    </w:lvl>
+    <w:lvl w:ilvl="3" w:tentative="1">
+      <w:start w:val="1"/>
+      <w:numFmt w:val="bullet"/>
+      <w:lvlText w:val=""/>
+      <w:lvlJc w:val="left"/>
+      <w:pPr>
+        <w:tabs>
+          <w:tab w:val="num" w:pos="2880"/>
+        </w:tabs>
+        <w:ind w:left="2880" w:hanging="360"/>
+      </w:pPr>
+      <w:rPr>
+        <w:rFonts w:ascii="Wingdings" w:hAnsi="Wingdings" w:hint="default"/>
+        <w:sz w:val="20"/>
+      </w:rPr>
+    </w:lvl>
+    <w:lvl w:ilvl="4" w:tentative="1">
+      <w:start w:val="1"/>
+      <w:numFmt w:val="bullet"/>
+      <w:lvlText w:val=""/>
+      <w:lvlJc w:val="left"/>
+      <w:pPr>
+        <w:tabs>
+          <w:tab w:val="num" w:pos="3600"/>
+        </w:tabs>
+        <w:ind w:left="3600" w:hanging="360"/>
+      </w:pPr>
+      <w:rPr>
+        <w:rFonts w:ascii="Wingdings" w:hAnsi="Wingdings" w:hint="default"/>
+        <w:sz w:val="20"/>
+      </w:rPr>
+    </w:lvl>
+    <w:lvl w:ilvl="5" w:tentative="1">
+      <w:start w:val="1"/>
+      <w:numFmt w:val="bullet"/>
+      <w:lvlText w:val=""/>
+      <w:lvlJc w:val="left"/>
+      <w:pPr>
+        <w:tabs>
+          <w:tab w:val="num" w:pos="4320"/>
+        </w:tabs>
+        <w:ind w:left="4320" w:hanging="360"/>
+      </w:pPr>
+      <w:rPr>
+        <w:rFonts w:ascii="Wingdings" w:hAnsi="Wingdings" w:hint="default"/>
+        <w:sz w:val="20"/>
+      </w:rPr>
+    </w:lvl>
+    <w:lvl w:ilvl="6" w:tentative="1">
+      <w:start w:val="1"/>
+      <w:numFmt w:val="bullet"/>
+      <w:lvlText w:val=""/>
+      <w:lvlJc w:val="left"/>
+      <w:pPr>
+        <w:tabs>
+          <w:tab w:val="num" w:pos="5040"/>
+        </w:tabs>
+        <w:ind w:left="5040" w:hanging="360"/>
+      </w:pPr>
+      <w:rPr>
+        <w:rFonts w:ascii="Wingdings" w:hAnsi="Wingdings" w:hint="default"/>
+        <w:sz w:val="20"/>
+      </w:rPr>
+    </w:lvl>
+    <w:lvl w:ilvl="7" w:tentative="1">
+      <w:start w:val="1"/>
+      <w:numFmt w:val="bullet"/>
+      <w:lvlText w:val=""/>
+      <w:lvlJc w:val="left"/>
+      <w:pPr>
+        <w:tabs>
+          <w:tab w:val="num" w:pos="5760"/>
+        </w:tabs>
+        <w:ind w:left="5760" w:hanging="360"/>
+      </w:pPr>
+      <w:rPr>
+        <w:rFonts w:ascii="Wingdings" w:hAnsi="Wingdings" w:hint="default"/>
+        <w:sz w:val="20"/>
+      </w:rPr>
+    </w:lvl>
+    <w:lvl w:ilvl="8" w:tentative="1">
+      <w:start w:val="1"/>
+      <w:numFmt w:val="bullet"/>
+      <w:lvlText w:val=""/>
+      <w:lvlJc w:val="left"/>
+      <w:pPr>
+        <w:tabs>
+          <w:tab w:val="num" w:pos="6480"/>
+        </w:tabs>
+        <w:ind w:left="6480" w:hanging="360"/>
+      </w:pPr>
+      <w:rPr>
+        <w:rFonts w:ascii="Wingdings" w:hAnsi="Wingdings" w:hint="default"/>
+        <w:sz w:val="20"/>
+      </w:rPr>
+    </w:lvl>
+  </w:abstractNum>
+  <w:abstractNum w:abstractNumId="19" w15:restartNumberingAfterBreak="0">
+    <w:nsid w:val="5F2A0743"/>
+    <w:multiLevelType w:val="multilevel"/>
+    <w:tmpl w:val="9B36E8C4"/>
+    <w:lvl w:ilvl="0">
+      <w:start w:val="1"/>
+      <w:numFmt w:val="bullet"/>
+      <w:lvlText w:val=""/>
+      <w:lvlJc w:val="left"/>
+      <w:pPr>
+        <w:tabs>
+          <w:tab w:val="num" w:pos="720"/>
+        </w:tabs>
+        <w:ind w:left="720" w:hanging="360"/>
+      </w:pPr>
+      <w:rPr>
+        <w:rFonts w:ascii="Symbol" w:hAnsi="Symbol" w:hint="default"/>
+        <w:sz w:val="20"/>
+      </w:rPr>
+    </w:lvl>
+    <w:lvl w:ilvl="1" w:tentative="1">
+      <w:start w:val="1"/>
+      <w:numFmt w:val="bullet"/>
+      <w:lvlText w:val="o"/>
+      <w:lvlJc w:val="left"/>
+      <w:pPr>
+        <w:tabs>
+          <w:tab w:val="num" w:pos="1440"/>
+        </w:tabs>
+        <w:ind w:left="1440" w:hanging="360"/>
+      </w:pPr>
+      <w:rPr>
+        <w:rFonts w:ascii="Courier New" w:hAnsi="Courier New" w:hint="default"/>
+        <w:sz w:val="20"/>
+      </w:rPr>
+    </w:lvl>
+    <w:lvl w:ilvl="2" w:tentative="1">
+      <w:start w:val="1"/>
+      <w:numFmt w:val="bullet"/>
+      <w:lvlText w:val=""/>
+      <w:lvlJc w:val="left"/>
+      <w:pPr>
+        <w:tabs>
+          <w:tab w:val="num" w:pos="2160"/>
+        </w:tabs>
+        <w:ind w:left="2160" w:hanging="360"/>
+      </w:pPr>
+      <w:rPr>
+        <w:rFonts w:ascii="Wingdings" w:hAnsi="Wingdings" w:hint="default"/>
+        <w:sz w:val="20"/>
+      </w:rPr>
+    </w:lvl>
+    <w:lvl w:ilvl="3" w:tentative="1">
+      <w:start w:val="1"/>
+      <w:numFmt w:val="bullet"/>
+      <w:lvlText w:val=""/>
+      <w:lvlJc w:val="left"/>
+      <w:pPr>
+        <w:tabs>
+          <w:tab w:val="num" w:pos="2880"/>
+        </w:tabs>
+        <w:ind w:left="2880" w:hanging="360"/>
+      </w:pPr>
+      <w:rPr>
+        <w:rFonts w:ascii="Wingdings" w:hAnsi="Wingdings" w:hint="default"/>
+        <w:sz w:val="20"/>
+      </w:rPr>
+    </w:lvl>
+    <w:lvl w:ilvl="4" w:tentative="1">
+      <w:start w:val="1"/>
+      <w:numFmt w:val="bullet"/>
+      <w:lvlText w:val=""/>
+      <w:lvlJc w:val="left"/>
+      <w:pPr>
+        <w:tabs>
+          <w:tab w:val="num" w:pos="3600"/>
+        </w:tabs>
+        <w:ind w:left="3600" w:hanging="360"/>
+      </w:pPr>
+      <w:rPr>
+        <w:rFonts w:ascii="Wingdings" w:hAnsi="Wingdings" w:hint="default"/>
+        <w:sz w:val="20"/>
+      </w:rPr>
+    </w:lvl>
+    <w:lvl w:ilvl="5" w:tentative="1">
+      <w:start w:val="1"/>
+      <w:numFmt w:val="bullet"/>
+      <w:lvlText w:val=""/>
+      <w:lvlJc w:val="left"/>
+      <w:pPr>
+        <w:tabs>
+          <w:tab w:val="num" w:pos="4320"/>
+        </w:tabs>
+        <w:ind w:left="4320" w:hanging="360"/>
+      </w:pPr>
+      <w:rPr>
+        <w:rFonts w:ascii="Wingdings" w:hAnsi="Wingdings" w:hint="default"/>
+        <w:sz w:val="20"/>
+      </w:rPr>
+    </w:lvl>
+    <w:lvl w:ilvl="6" w:tentative="1">
+      <w:start w:val="1"/>
+      <w:numFmt w:val="bullet"/>
+      <w:lvlText w:val=""/>
+      <w:lvlJc w:val="left"/>
+      <w:pPr>
+        <w:tabs>
+          <w:tab w:val="num" w:pos="5040"/>
+        </w:tabs>
+        <w:ind w:left="5040" w:hanging="360"/>
+      </w:pPr>
+      <w:rPr>
+        <w:rFonts w:ascii="Wingdings" w:hAnsi="Wingdings" w:hint="default"/>
+        <w:sz w:val="20"/>
+      </w:rPr>
+    </w:lvl>
+    <w:lvl w:ilvl="7" w:tentative="1">
+      <w:start w:val="1"/>
+      <w:numFmt w:val="bullet"/>
+      <w:lvlText w:val=""/>
+      <w:lvlJc w:val="left"/>
+      <w:pPr>
+        <w:tabs>
+          <w:tab w:val="num" w:pos="5760"/>
+        </w:tabs>
+        <w:ind w:left="5760" w:hanging="360"/>
+      </w:pPr>
+      <w:rPr>
+        <w:rFonts w:ascii="Wingdings" w:hAnsi="Wingdings" w:hint="default"/>
+        <w:sz w:val="20"/>
+      </w:rPr>
+    </w:lvl>
+    <w:lvl w:ilvl="8" w:tentative="1">
+      <w:start w:val="1"/>
+      <w:numFmt w:val="bullet"/>
+      <w:lvlText w:val=""/>
+      <w:lvlJc w:val="left"/>
+      <w:pPr>
+        <w:tabs>
+          <w:tab w:val="num" w:pos="6480"/>
+        </w:tabs>
+        <w:ind w:left="6480" w:hanging="360"/>
+      </w:pPr>
+      <w:rPr>
+        <w:rFonts w:ascii="Wingdings" w:hAnsi="Wingdings" w:hint="default"/>
+        <w:sz w:val="20"/>
+      </w:rPr>
+    </w:lvl>
+  </w:abstractNum>
+  <w:abstractNum w:abstractNumId="20" w15:restartNumberingAfterBreak="0">
     <w:nsid w:val="5FF21909"/>
     <w:multiLevelType w:val="multilevel"/>
     <w:tmpl w:val="32E84EF6"/>
@@ -16641,7 +19816,7 @@
       </w:rPr>
     </w:lvl>
   </w:abstractNum>
-  <w:abstractNum w:abstractNumId="11" w15:restartNumberingAfterBreak="0">
+  <w:abstractNum w:abstractNumId="21" w15:restartNumberingAfterBreak="0">
     <w:nsid w:val="6B8F158A"/>
     <w:multiLevelType w:val="multilevel"/>
     <w:tmpl w:val="5B60C41A"/>
@@ -16754,7 +19929,156 @@
       </w:rPr>
     </w:lvl>
   </w:abstractNum>
-  <w:abstractNum w:abstractNumId="12" w15:restartNumberingAfterBreak="0">
+  <w:abstractNum w:abstractNumId="22" w15:restartNumberingAfterBreak="0">
+    <w:nsid w:val="6CD03795"/>
+    <w:multiLevelType w:val="multilevel"/>
+    <w:tmpl w:val="1564F266"/>
+    <w:lvl w:ilvl="0">
+      <w:start w:val="1"/>
+      <w:numFmt w:val="bullet"/>
+      <w:lvlText w:val=""/>
+      <w:lvlJc w:val="left"/>
+      <w:pPr>
+        <w:tabs>
+          <w:tab w:val="num" w:pos="720"/>
+        </w:tabs>
+        <w:ind w:left="720" w:hanging="360"/>
+      </w:pPr>
+      <w:rPr>
+        <w:rFonts w:ascii="Symbol" w:hAnsi="Symbol" w:hint="default"/>
+        <w:sz w:val="20"/>
+      </w:rPr>
+    </w:lvl>
+    <w:lvl w:ilvl="1">
+      <w:start w:val="1"/>
+      <w:numFmt w:val="bullet"/>
+      <w:lvlText w:val="o"/>
+      <w:lvlJc w:val="left"/>
+      <w:pPr>
+        <w:tabs>
+          <w:tab w:val="num" w:pos="1440"/>
+        </w:tabs>
+        <w:ind w:left="1440" w:hanging="360"/>
+      </w:pPr>
+      <w:rPr>
+        <w:rFonts w:ascii="Courier New" w:hAnsi="Courier New" w:hint="default"/>
+        <w:sz w:val="20"/>
+      </w:rPr>
+    </w:lvl>
+    <w:lvl w:ilvl="2" w:tentative="1">
+      <w:start w:val="1"/>
+      <w:numFmt w:val="bullet"/>
+      <w:lvlText w:val=""/>
+      <w:lvlJc w:val="left"/>
+      <w:pPr>
+        <w:tabs>
+          <w:tab w:val="num" w:pos="2160"/>
+        </w:tabs>
+        <w:ind w:left="2160" w:hanging="360"/>
+      </w:pPr>
+      <w:rPr>
+        <w:rFonts w:ascii="Wingdings" w:hAnsi="Wingdings" w:hint="default"/>
+        <w:sz w:val="20"/>
+      </w:rPr>
+    </w:lvl>
+    <w:lvl w:ilvl="3" w:tentative="1">
+      <w:start w:val="1"/>
+      <w:numFmt w:val="bullet"/>
+      <w:lvlText w:val=""/>
+      <w:lvlJc w:val="left"/>
+      <w:pPr>
+        <w:tabs>
+          <w:tab w:val="num" w:pos="2880"/>
+        </w:tabs>
+        <w:ind w:left="2880" w:hanging="360"/>
+      </w:pPr>
+      <w:rPr>
+        <w:rFonts w:ascii="Wingdings" w:hAnsi="Wingdings" w:hint="default"/>
+        <w:sz w:val="20"/>
+      </w:rPr>
+    </w:lvl>
+    <w:lvl w:ilvl="4" w:tentative="1">
+      <w:start w:val="1"/>
+      <w:numFmt w:val="bullet"/>
+      <w:lvlText w:val=""/>
+      <w:lvlJc w:val="left"/>
+      <w:pPr>
+        <w:tabs>
+          <w:tab w:val="num" w:pos="3600"/>
+        </w:tabs>
+        <w:ind w:left="3600" w:hanging="360"/>
+      </w:pPr>
+      <w:rPr>
+        <w:rFonts w:ascii="Wingdings" w:hAnsi="Wingdings" w:hint="default"/>
+        <w:sz w:val="20"/>
+      </w:rPr>
+    </w:lvl>
+    <w:lvl w:ilvl="5" w:tentative="1">
+      <w:start w:val="1"/>
+      <w:numFmt w:val="bullet"/>
+      <w:lvlText w:val=""/>
+      <w:lvlJc w:val="left"/>
+      <w:pPr>
+        <w:tabs>
+          <w:tab w:val="num" w:pos="4320"/>
+        </w:tabs>
+        <w:ind w:left="4320" w:hanging="360"/>
+      </w:pPr>
+      <w:rPr>
+        <w:rFonts w:ascii="Wingdings" w:hAnsi="Wingdings" w:hint="default"/>
+        <w:sz w:val="20"/>
+      </w:rPr>
+    </w:lvl>
+    <w:lvl w:ilvl="6" w:tentative="1">
+      <w:start w:val="1"/>
+      <w:numFmt w:val="bullet"/>
+      <w:lvlText w:val=""/>
+      <w:lvlJc w:val="left"/>
+      <w:pPr>
+        <w:tabs>
+          <w:tab w:val="num" w:pos="5040"/>
+        </w:tabs>
+        <w:ind w:left="5040" w:hanging="360"/>
+      </w:pPr>
+      <w:rPr>
+        <w:rFonts w:ascii="Wingdings" w:hAnsi="Wingdings" w:hint="default"/>
+        <w:sz w:val="20"/>
+      </w:rPr>
+    </w:lvl>
+    <w:lvl w:ilvl="7" w:tentative="1">
+      <w:start w:val="1"/>
+      <w:numFmt w:val="bullet"/>
+      <w:lvlText w:val=""/>
+      <w:lvlJc w:val="left"/>
+      <w:pPr>
+        <w:tabs>
+          <w:tab w:val="num" w:pos="5760"/>
+        </w:tabs>
+        <w:ind w:left="5760" w:hanging="360"/>
+      </w:pPr>
+      <w:rPr>
+        <w:rFonts w:ascii="Wingdings" w:hAnsi="Wingdings" w:hint="default"/>
+        <w:sz w:val="20"/>
+      </w:rPr>
+    </w:lvl>
+    <w:lvl w:ilvl="8" w:tentative="1">
+      <w:start w:val="1"/>
+      <w:numFmt w:val="bullet"/>
+      <w:lvlText w:val=""/>
+      <w:lvlJc w:val="left"/>
+      <w:pPr>
+        <w:tabs>
+          <w:tab w:val="num" w:pos="6480"/>
+        </w:tabs>
+        <w:ind w:left="6480" w:hanging="360"/>
+      </w:pPr>
+      <w:rPr>
+        <w:rFonts w:ascii="Wingdings" w:hAnsi="Wingdings" w:hint="default"/>
+        <w:sz w:val="20"/>
+      </w:rPr>
+    </w:lvl>
+  </w:abstractNum>
+  <w:abstractNum w:abstractNumId="23" w15:restartNumberingAfterBreak="0">
     <w:nsid w:val="7B111B05"/>
     <w:multiLevelType w:val="multilevel"/>
     <w:tmpl w:val="A280B866"/>
@@ -16903,7 +20227,7 @@
       </w:rPr>
     </w:lvl>
   </w:abstractNum>
-  <w:abstractNum w:abstractNumId="13" w15:restartNumberingAfterBreak="0">
+  <w:abstractNum w:abstractNumId="24" w15:restartNumberingAfterBreak="0">
     <w:nsid w:val="7B9F5611"/>
     <w:multiLevelType w:val="multilevel"/>
     <w:tmpl w:val="209EB2C6"/>
@@ -17053,46 +20377,79 @@
     </w:lvl>
   </w:abstractNum>
   <w:num w:numId="1" w16cid:durableId="1436511055">
+    <w:abstractNumId w:val="13"/>
+  </w:num>
+  <w:num w:numId="2" w16cid:durableId="562179288">
+    <w:abstractNumId w:val="4"/>
+  </w:num>
+  <w:num w:numId="3" w16cid:durableId="271018401">
+    <w:abstractNumId w:val="21"/>
+  </w:num>
+  <w:num w:numId="4" w16cid:durableId="785465083">
+    <w:abstractNumId w:val="17"/>
+  </w:num>
+  <w:num w:numId="5" w16cid:durableId="1315452942">
+    <w:abstractNumId w:val="20"/>
+  </w:num>
+  <w:num w:numId="6" w16cid:durableId="1276400014">
+    <w:abstractNumId w:val="11"/>
+  </w:num>
+  <w:num w:numId="7" w16cid:durableId="1463570655">
+    <w:abstractNumId w:val="23"/>
+  </w:num>
+  <w:num w:numId="8" w16cid:durableId="2116174953">
     <w:abstractNumId w:val="8"/>
   </w:num>
-  <w:num w:numId="2" w16cid:durableId="562179288">
+  <w:num w:numId="9" w16cid:durableId="1912042429">
+    <w:abstractNumId w:val="5"/>
+  </w:num>
+  <w:num w:numId="10" w16cid:durableId="1179851820">
+    <w:abstractNumId w:val="1"/>
+  </w:num>
+  <w:num w:numId="11" w16cid:durableId="1848472370">
+    <w:abstractNumId w:val="24"/>
+  </w:num>
+  <w:num w:numId="12" w16cid:durableId="1041709371">
+    <w:abstractNumId w:val="12"/>
+  </w:num>
+  <w:num w:numId="13" w16cid:durableId="1907837757">
+    <w:abstractNumId w:val="7"/>
+  </w:num>
+  <w:num w:numId="14" w16cid:durableId="289559016">
+    <w:abstractNumId w:val="3"/>
+  </w:num>
+  <w:num w:numId="15" w16cid:durableId="309481252">
+    <w:abstractNumId w:val="19"/>
+  </w:num>
+  <w:num w:numId="16" w16cid:durableId="1269197610">
+    <w:abstractNumId w:val="16"/>
+  </w:num>
+  <w:num w:numId="17" w16cid:durableId="120617046">
+    <w:abstractNumId w:val="6"/>
+  </w:num>
+  <w:num w:numId="18" w16cid:durableId="1016612542">
+    <w:abstractNumId w:val="14"/>
+  </w:num>
+  <w:num w:numId="19" w16cid:durableId="1513490708">
+    <w:abstractNumId w:val="22"/>
+  </w:num>
+  <w:num w:numId="20" w16cid:durableId="615987945">
+    <w:abstractNumId w:val="0"/>
+  </w:num>
+  <w:num w:numId="21" w16cid:durableId="2011058971">
+    <w:abstractNumId w:val="10"/>
+  </w:num>
+  <w:num w:numId="22" w16cid:durableId="362485173">
     <w:abstractNumId w:val="2"/>
   </w:num>
-  <w:num w:numId="3" w16cid:durableId="271018401">
-    <w:abstractNumId w:val="11"/>
-  </w:num>
-  <w:num w:numId="4" w16cid:durableId="785465083">
+  <w:num w:numId="23" w16cid:durableId="2082948972">
     <w:abstractNumId w:val="9"/>
   </w:num>
-  <w:num w:numId="5" w16cid:durableId="1315452942">
-    <w:abstractNumId w:val="10"/>
+  <w:num w:numId="24" w16cid:durableId="1342439682">
+    <w:abstractNumId w:val="15"/>
   </w:num>
-  <w:num w:numId="6" w16cid:durableId="1276400014">
-    <w:abstractNumId w:val="6"/>
-  </w:num>
-  <w:num w:numId="7" w16cid:durableId="1463570655">
-    <w:abstractNumId w:val="12"/>
-  </w:num>
-  <w:num w:numId="8" w16cid:durableId="2116174953">
-    <w:abstractNumId w:val="5"/>
-  </w:num>
-  <w:num w:numId="9" w16cid:durableId="1912042429">
-    <w:abstractNumId w:val="3"/>
-  </w:num>
-  <w:num w:numId="10" w16cid:durableId="1179851820">
-    <w:abstractNumId w:val="0"/>
-  </w:num>
-  <w:num w:numId="11" w16cid:durableId="1848472370">
-    <w:abstractNumId w:val="13"/>
-  </w:num>
-  <w:num w:numId="12" w16cid:durableId="1041709371">
-    <w:abstractNumId w:val="7"/>
-  </w:num>
-  <w:num w:numId="13" w16cid:durableId="1907837757">
-    <w:abstractNumId w:val="4"/>
-  </w:num>
-  <w:num w:numId="14" w16cid:durableId="289559016">
-    <w:abstractNumId w:val="1"/>
+  <w:num w:numId="25" w16cid:durableId="1121532645">
+    <w:abstractNumId w:val="18"/>
   </w:num>
 </w:numbering>
 </file>
@@ -17751,7 +21108,6 @@
   <w:style w:type="character" w:default="1" w:styleId="Phngmcinhcuaoanvn">
     <w:name w:val="Default Paragraph Font"/>
     <w:uiPriority w:val="1"/>
-    <w:semiHidden/>
     <w:unhideWhenUsed/>
   </w:style>
   <w:style w:type="table" w:default="1" w:styleId="BangThngthng">
@@ -18271,6 +21627,76 @@
       <w:ind w:left="520"/>
     </w:pPr>
   </w:style>
+  <w:style w:type="paragraph" w:styleId="HTMLinhdangtrc">
+    <w:name w:val="HTML Preformatted"/>
+    <w:basedOn w:val="Binhthng"/>
+    <w:link w:val="HTMLinhdangtrcChar"/>
+    <w:uiPriority w:val="99"/>
+    <w:semiHidden/>
+    <w:unhideWhenUsed/>
+    <w:rsid w:val="000761EA"/>
+    <w:pPr>
+      <w:tabs>
+        <w:tab w:val="left" w:pos="916"/>
+        <w:tab w:val="left" w:pos="1832"/>
+        <w:tab w:val="left" w:pos="2748"/>
+        <w:tab w:val="left" w:pos="3664"/>
+        <w:tab w:val="left" w:pos="4580"/>
+        <w:tab w:val="left" w:pos="5496"/>
+        <w:tab w:val="left" w:pos="6412"/>
+        <w:tab w:val="left" w:pos="7328"/>
+        <w:tab w:val="left" w:pos="8244"/>
+        <w:tab w:val="left" w:pos="9160"/>
+        <w:tab w:val="left" w:pos="10076"/>
+        <w:tab w:val="left" w:pos="10992"/>
+        <w:tab w:val="left" w:pos="11908"/>
+        <w:tab w:val="left" w:pos="12824"/>
+        <w:tab w:val="left" w:pos="13740"/>
+        <w:tab w:val="left" w:pos="14656"/>
+      </w:tabs>
+      <w:spacing w:after="0" w:line="240" w:lineRule="auto"/>
+      <w:ind w:firstLine="0"/>
+      <w:jc w:val="left"/>
+    </w:pPr>
+    <w:rPr>
+      <w:rFonts w:ascii="Courier New" w:eastAsia="Times New Roman" w:hAnsi="Courier New" w:cs="Courier New"/>
+      <w:sz w:val="20"/>
+      <w:szCs w:val="20"/>
+    </w:rPr>
+  </w:style>
+  <w:style w:type="character" w:customStyle="1" w:styleId="HTMLinhdangtrcChar">
+    <w:name w:val="HTML Định dạng trước Char"/>
+    <w:basedOn w:val="Phngmcinhcuaoanvn"/>
+    <w:link w:val="HTMLinhdangtrc"/>
+    <w:uiPriority w:val="99"/>
+    <w:semiHidden/>
+    <w:rsid w:val="000761EA"/>
+    <w:rPr>
+      <w:rFonts w:ascii="Courier New" w:eastAsia="Times New Roman" w:hAnsi="Courier New" w:cs="Courier New"/>
+      <w:kern w:val="0"/>
+      <w:sz w:val="20"/>
+      <w:szCs w:val="20"/>
+      <w14:ligatures w14:val="none"/>
+    </w:rPr>
+  </w:style>
+  <w:style w:type="character" w:styleId="MaHTML">
+    <w:name w:val="HTML Code"/>
+    <w:basedOn w:val="Phngmcinhcuaoanvn"/>
+    <w:uiPriority w:val="99"/>
+    <w:semiHidden/>
+    <w:unhideWhenUsed/>
+    <w:rsid w:val="000761EA"/>
+    <w:rPr>
+      <w:rFonts w:ascii="Courier New" w:eastAsia="Times New Roman" w:hAnsi="Courier New" w:cs="Courier New"/>
+      <w:sz w:val="20"/>
+      <w:szCs w:val="20"/>
+    </w:rPr>
+  </w:style>
+  <w:style w:type="character" w:customStyle="1" w:styleId="n">
+    <w:name w:val="ͼn"/>
+    <w:basedOn w:val="Phngmcinhcuaoanvn"/>
+    <w:rsid w:val="000761EA"/>
+  </w:style>
 </w:styles>
 </file>
 

</xml_diff>

<commit_message>
cập nhật báo cáo 2
</commit_message>
<xml_diff>
--- a/BaoCaoDATN_TranDoanAnh.docx
+++ b/BaoCaoDATN_TranDoanAnh.docx
@@ -15599,7 +15599,7 @@
           <w:bCs/>
           <w:szCs w:val="26"/>
         </w:rPr>
-        <w:t>Lịch sử kiểm tra</w:t>
+        <w:t xml:space="preserve">Trang </w:t>
       </w:r>
       <w:r>
         <w:rPr>
@@ -15607,7 +15607,31 @@
           <w:bCs/>
           <w:szCs w:val="26"/>
         </w:rPr>
-        <w:t xml:space="preserve"> (/history)</w:t>
+        <w:t xml:space="preserve">Lịch </w:t>
+      </w:r>
+      <w:r>
+        <w:rPr>
+          <w:b/>
+          <w:bCs/>
+          <w:szCs w:val="26"/>
+        </w:rPr>
+        <w:t>Sử Kiểm Tra</w:t>
+      </w:r>
+      <w:r>
+        <w:rPr>
+          <w:b/>
+          <w:bCs/>
+          <w:szCs w:val="26"/>
+        </w:rPr>
+        <w:t xml:space="preserve"> </w:t>
+      </w:r>
+      <w:r>
+        <w:rPr>
+          <w:b/>
+          <w:bCs/>
+          <w:szCs w:val="26"/>
+        </w:rPr>
+        <w:t>(/history)</w:t>
       </w:r>
     </w:p>
     <w:p>

</xml_diff>